<commit_message>
Word export: column widths fit each column's longest word; tighter matrix cells
Co-Authored-By: Claude Opus 5.5 <noreply@anthropic.com>
</commit_message>
<xml_diff>
--- a/migration-governance/word/DBA-Guide.docx
+++ b/migration-governance/word/DBA-Guide.docx
@@ -408,9 +408,9 @@
         </w:tblCellMar>
       </w:tblPr>
       <w:tblGrid>
-        <w:gridCol w:w="1578"/>
-        <w:gridCol w:w="4250"/>
-        <w:gridCol w:w="4252"/>
+        <w:gridCol w:w="1801"/>
+        <w:gridCol w:w="4173"/>
+        <w:gridCol w:w="4106"/>
       </w:tblGrid>
       <w:tr>
         <w:trPr>
@@ -418,7 +418,7 @@
         </w:trPr>
         <w:tc>
           <w:tcPr>
-            <w:tcW w:w="1578" w:type="dxa"/>
+            <w:tcW w:w="1801" w:type="dxa"/>
             <w:shd w:val="clear" w:color="auto" w:fill="1B4A78"/>
             <w:vAlign w:val="top"/>
           </w:tcPr>
@@ -430,7 +430,7 @@
         </w:tc>
         <w:tc>
           <w:tcPr>
-            <w:tcW w:w="4250" w:type="dxa"/>
+            <w:tcW w:w="4173" w:type="dxa"/>
             <w:shd w:val="clear" w:color="auto" w:fill="1B4A78"/>
             <w:vAlign w:val="top"/>
           </w:tcPr>
@@ -449,7 +449,7 @@
         </w:tc>
         <w:tc>
           <w:tcPr>
-            <w:tcW w:w="4252" w:type="dxa"/>
+            <w:tcW w:w="4106" w:type="dxa"/>
             <w:shd w:val="clear" w:color="auto" w:fill="1B4A78"/>
             <w:vAlign w:val="top"/>
           </w:tcPr>
@@ -473,7 +473,7 @@
         </w:trPr>
         <w:tc>
           <w:tcPr>
-            <w:tcW w:w="1578" w:type="dxa"/>
+            <w:tcW w:w="1801" w:type="dxa"/>
             <w:vAlign w:val="top"/>
           </w:tcPr>
           <w:p>
@@ -490,7 +490,7 @@
         </w:tc>
         <w:tc>
           <w:tcPr>
-            <w:tcW w:w="4250" w:type="dxa"/>
+            <w:tcW w:w="4173" w:type="dxa"/>
             <w:vAlign w:val="top"/>
           </w:tcPr>
           <w:p>
@@ -511,7 +511,7 @@
         </w:tc>
         <w:tc>
           <w:tcPr>
-            <w:tcW w:w="4252" w:type="dxa"/>
+            <w:tcW w:w="4106" w:type="dxa"/>
             <w:vAlign w:val="top"/>
           </w:tcPr>
           <w:p>
@@ -537,7 +537,7 @@
         </w:trPr>
         <w:tc>
           <w:tcPr>
-            <w:tcW w:w="1578" w:type="dxa"/>
+            <w:tcW w:w="1801" w:type="dxa"/>
             <w:vAlign w:val="top"/>
           </w:tcPr>
           <w:p>
@@ -554,7 +554,7 @@
         </w:tc>
         <w:tc>
           <w:tcPr>
-            <w:tcW w:w="4250" w:type="dxa"/>
+            <w:tcW w:w="4173" w:type="dxa"/>
             <w:vAlign w:val="top"/>
           </w:tcPr>
           <w:p>
@@ -575,7 +575,7 @@
         </w:tc>
         <w:tc>
           <w:tcPr>
-            <w:tcW w:w="4252" w:type="dxa"/>
+            <w:tcW w:w="4106" w:type="dxa"/>
             <w:vAlign w:val="top"/>
           </w:tcPr>
           <w:p>
@@ -601,7 +601,7 @@
         </w:trPr>
         <w:tc>
           <w:tcPr>
-            <w:tcW w:w="1578" w:type="dxa"/>
+            <w:tcW w:w="1801" w:type="dxa"/>
             <w:vAlign w:val="top"/>
           </w:tcPr>
           <w:p>
@@ -618,7 +618,7 @@
         </w:tc>
         <w:tc>
           <w:tcPr>
-            <w:tcW w:w="4250" w:type="dxa"/>
+            <w:tcW w:w="4173" w:type="dxa"/>
             <w:vAlign w:val="top"/>
           </w:tcPr>
           <w:p>
@@ -635,7 +635,7 @@
         </w:tc>
         <w:tc>
           <w:tcPr>
-            <w:tcW w:w="4252" w:type="dxa"/>
+            <w:tcW w:w="4106" w:type="dxa"/>
             <w:vAlign w:val="top"/>
           </w:tcPr>
           <w:p>
@@ -661,7 +661,7 @@
         </w:trPr>
         <w:tc>
           <w:tcPr>
-            <w:tcW w:w="1578" w:type="dxa"/>
+            <w:tcW w:w="1801" w:type="dxa"/>
             <w:vAlign w:val="top"/>
           </w:tcPr>
           <w:p>
@@ -678,7 +678,7 @@
         </w:tc>
         <w:tc>
           <w:tcPr>
-            <w:tcW w:w="4250" w:type="dxa"/>
+            <w:tcW w:w="4173" w:type="dxa"/>
             <w:vAlign w:val="top"/>
           </w:tcPr>
           <w:p>
@@ -695,7 +695,7 @@
         </w:tc>
         <w:tc>
           <w:tcPr>
-            <w:tcW w:w="4252" w:type="dxa"/>
+            <w:tcW w:w="4106" w:type="dxa"/>
             <w:vAlign w:val="top"/>
           </w:tcPr>
           <w:p>
@@ -731,7 +731,7 @@
         </w:trPr>
         <w:tc>
           <w:tcPr>
-            <w:tcW w:w="1578" w:type="dxa"/>
+            <w:tcW w:w="1801" w:type="dxa"/>
             <w:vAlign w:val="top"/>
           </w:tcPr>
           <w:p>
@@ -748,7 +748,7 @@
         </w:tc>
         <w:tc>
           <w:tcPr>
-            <w:tcW w:w="4250" w:type="dxa"/>
+            <w:tcW w:w="4173" w:type="dxa"/>
             <w:vAlign w:val="top"/>
           </w:tcPr>
           <w:p>
@@ -765,7 +765,7 @@
         </w:tc>
         <w:tc>
           <w:tcPr>
-            <w:tcW w:w="4252" w:type="dxa"/>
+            <w:tcW w:w="4106" w:type="dxa"/>
             <w:vAlign w:val="top"/>
           </w:tcPr>
           <w:p>
@@ -787,7 +787,7 @@
         </w:trPr>
         <w:tc>
           <w:tcPr>
-            <w:tcW w:w="1578" w:type="dxa"/>
+            <w:tcW w:w="1801" w:type="dxa"/>
             <w:vAlign w:val="top"/>
           </w:tcPr>
           <w:p>
@@ -804,7 +804,7 @@
         </w:tc>
         <w:tc>
           <w:tcPr>
-            <w:tcW w:w="4250" w:type="dxa"/>
+            <w:tcW w:w="4173" w:type="dxa"/>
             <w:vAlign w:val="top"/>
           </w:tcPr>
           <w:p>
@@ -819,7 +819,7 @@
         </w:tc>
         <w:tc>
           <w:tcPr>
-            <w:tcW w:w="4252" w:type="dxa"/>
+            <w:tcW w:w="4106" w:type="dxa"/>
             <w:vAlign w:val="top"/>
           </w:tcPr>
           <w:p>
@@ -1293,10 +1293,10 @@
         </w:tblCellMar>
       </w:tblPr>
       <w:tblGrid>
-        <w:gridCol w:w="995"/>
-        <w:gridCol w:w="3028"/>
-        <w:gridCol w:w="3028"/>
-        <w:gridCol w:w="3029"/>
+        <w:gridCol w:w="1959"/>
+        <w:gridCol w:w="3074"/>
+        <w:gridCol w:w="2618"/>
+        <w:gridCol w:w="2429"/>
       </w:tblGrid>
       <w:tr>
         <w:trPr>
@@ -1304,7 +1304,7 @@
         </w:trPr>
         <w:tc>
           <w:tcPr>
-            <w:tcW w:w="995" w:type="dxa"/>
+            <w:tcW w:w="1959" w:type="dxa"/>
             <w:shd w:val="clear" w:color="auto" w:fill="1B4A78"/>
             <w:vAlign w:val="top"/>
           </w:tcPr>
@@ -1323,7 +1323,7 @@
         </w:tc>
         <w:tc>
           <w:tcPr>
-            <w:tcW w:w="3028" w:type="dxa"/>
+            <w:tcW w:w="3074" w:type="dxa"/>
             <w:shd w:val="clear" w:color="auto" w:fill="1B4A78"/>
             <w:vAlign w:val="top"/>
           </w:tcPr>
@@ -1356,7 +1356,7 @@
         </w:tc>
         <w:tc>
           <w:tcPr>
-            <w:tcW w:w="3028" w:type="dxa"/>
+            <w:tcW w:w="2618" w:type="dxa"/>
             <w:shd w:val="clear" w:color="auto" w:fill="1B4A78"/>
             <w:vAlign w:val="top"/>
           </w:tcPr>
@@ -1389,7 +1389,7 @@
         </w:tc>
         <w:tc>
           <w:tcPr>
-            <w:tcW w:w="3029" w:type="dxa"/>
+            <w:tcW w:w="2429" w:type="dxa"/>
             <w:shd w:val="clear" w:color="auto" w:fill="1B4A78"/>
             <w:vAlign w:val="top"/>
           </w:tcPr>
@@ -1427,7 +1427,7 @@
         </w:trPr>
         <w:tc>
           <w:tcPr>
-            <w:tcW w:w="995" w:type="dxa"/>
+            <w:tcW w:w="1959" w:type="dxa"/>
             <w:vAlign w:val="top"/>
           </w:tcPr>
           <w:p>
@@ -1444,7 +1444,7 @@
         </w:tc>
         <w:tc>
           <w:tcPr>
-            <w:tcW w:w="3028" w:type="dxa"/>
+            <w:tcW w:w="3074" w:type="dxa"/>
             <w:vAlign w:val="top"/>
           </w:tcPr>
           <w:p>
@@ -1459,7 +1459,7 @@
         </w:tc>
         <w:tc>
           <w:tcPr>
-            <w:tcW w:w="3028" w:type="dxa"/>
+            <w:tcW w:w="2618" w:type="dxa"/>
             <w:vAlign w:val="top"/>
           </w:tcPr>
           <w:p>
@@ -1474,7 +1474,7 @@
         </w:tc>
         <w:tc>
           <w:tcPr>
-            <w:tcW w:w="3029" w:type="dxa"/>
+            <w:tcW w:w="2429" w:type="dxa"/>
             <w:vAlign w:val="top"/>
           </w:tcPr>
           <w:p>
@@ -1494,7 +1494,7 @@
         </w:trPr>
         <w:tc>
           <w:tcPr>
-            <w:tcW w:w="995" w:type="dxa"/>
+            <w:tcW w:w="1959" w:type="dxa"/>
             <w:vAlign w:val="top"/>
           </w:tcPr>
           <w:p>
@@ -1511,7 +1511,7 @@
         </w:tc>
         <w:tc>
           <w:tcPr>
-            <w:tcW w:w="3028" w:type="dxa"/>
+            <w:tcW w:w="3074" w:type="dxa"/>
             <w:vAlign w:val="top"/>
           </w:tcPr>
           <w:p>
@@ -1526,7 +1526,7 @@
         </w:tc>
         <w:tc>
           <w:tcPr>
-            <w:tcW w:w="3028" w:type="dxa"/>
+            <w:tcW w:w="2618" w:type="dxa"/>
             <w:vAlign w:val="top"/>
           </w:tcPr>
           <w:p>
@@ -1541,7 +1541,7 @@
         </w:tc>
         <w:tc>
           <w:tcPr>
-            <w:tcW w:w="3029" w:type="dxa"/>
+            <w:tcW w:w="2429" w:type="dxa"/>
             <w:vAlign w:val="top"/>
           </w:tcPr>
           <w:p>
@@ -1561,7 +1561,7 @@
         </w:trPr>
         <w:tc>
           <w:tcPr>
-            <w:tcW w:w="995" w:type="dxa"/>
+            <w:tcW w:w="1959" w:type="dxa"/>
             <w:vAlign w:val="top"/>
           </w:tcPr>
           <w:p>
@@ -1578,7 +1578,7 @@
         </w:tc>
         <w:tc>
           <w:tcPr>
-            <w:tcW w:w="3028" w:type="dxa"/>
+            <w:tcW w:w="3074" w:type="dxa"/>
             <w:vAlign w:val="top"/>
           </w:tcPr>
           <w:p>
@@ -1609,7 +1609,7 @@
         </w:tc>
         <w:tc>
           <w:tcPr>
-            <w:tcW w:w="3028" w:type="dxa"/>
+            <w:tcW w:w="2618" w:type="dxa"/>
             <w:vAlign w:val="top"/>
           </w:tcPr>
           <w:p>
@@ -1624,7 +1624,7 @@
         </w:tc>
         <w:tc>
           <w:tcPr>
-            <w:tcW w:w="3029" w:type="dxa"/>
+            <w:tcW w:w="2429" w:type="dxa"/>
             <w:vAlign w:val="top"/>
           </w:tcPr>
           <w:p>
@@ -1644,7 +1644,7 @@
         </w:trPr>
         <w:tc>
           <w:tcPr>
-            <w:tcW w:w="995" w:type="dxa"/>
+            <w:tcW w:w="1959" w:type="dxa"/>
             <w:vAlign w:val="top"/>
           </w:tcPr>
           <w:p>
@@ -1661,7 +1661,7 @@
         </w:tc>
         <w:tc>
           <w:tcPr>
-            <w:tcW w:w="3028" w:type="dxa"/>
+            <w:tcW w:w="3074" w:type="dxa"/>
             <w:vAlign w:val="top"/>
           </w:tcPr>
           <w:p>
@@ -1676,7 +1676,7 @@
         </w:tc>
         <w:tc>
           <w:tcPr>
-            <w:tcW w:w="3028" w:type="dxa"/>
+            <w:tcW w:w="2618" w:type="dxa"/>
             <w:vAlign w:val="top"/>
           </w:tcPr>
           <w:p>
@@ -1691,7 +1691,7 @@
         </w:tc>
         <w:tc>
           <w:tcPr>
-            <w:tcW w:w="3029" w:type="dxa"/>
+            <w:tcW w:w="2429" w:type="dxa"/>
             <w:vAlign w:val="top"/>
           </w:tcPr>
           <w:p>
@@ -1740,8 +1740,8 @@
         </w:tblCellMar>
       </w:tblPr>
       <w:tblGrid>
-        <w:gridCol w:w="795"/>
-        <w:gridCol w:w="9285"/>
+        <w:gridCol w:w="885"/>
+        <w:gridCol w:w="9195"/>
       </w:tblGrid>
       <w:tr>
         <w:trPr>
@@ -1749,7 +1749,7 @@
         </w:trPr>
         <w:tc>
           <w:tcPr>
-            <w:tcW w:w="795" w:type="dxa"/>
+            <w:tcW w:w="885" w:type="dxa"/>
             <w:shd w:val="clear" w:color="auto" w:fill="1B4A78"/>
             <w:vAlign w:val="top"/>
           </w:tcPr>
@@ -1768,7 +1768,7 @@
         </w:tc>
         <w:tc>
           <w:tcPr>
-            <w:tcW w:w="9285" w:type="dxa"/>
+            <w:tcW w:w="9195" w:type="dxa"/>
             <w:shd w:val="clear" w:color="auto" w:fill="1B4A78"/>
             <w:vAlign w:val="top"/>
           </w:tcPr>
@@ -1792,7 +1792,7 @@
         </w:trPr>
         <w:tc>
           <w:tcPr>
-            <w:tcW w:w="795" w:type="dxa"/>
+            <w:tcW w:w="885" w:type="dxa"/>
             <w:vAlign w:val="top"/>
           </w:tcPr>
           <w:p>
@@ -1809,7 +1809,7 @@
         </w:tc>
         <w:tc>
           <w:tcPr>
-            <w:tcW w:w="9285" w:type="dxa"/>
+            <w:tcW w:w="9195" w:type="dxa"/>
             <w:vAlign w:val="top"/>
           </w:tcPr>
           <w:p>
@@ -1829,7 +1829,7 @@
         </w:trPr>
         <w:tc>
           <w:tcPr>
-            <w:tcW w:w="795" w:type="dxa"/>
+            <w:tcW w:w="885" w:type="dxa"/>
             <w:vAlign w:val="top"/>
           </w:tcPr>
           <w:p>
@@ -1846,7 +1846,7 @@
         </w:tc>
         <w:tc>
           <w:tcPr>
-            <w:tcW w:w="9285" w:type="dxa"/>
+            <w:tcW w:w="9195" w:type="dxa"/>
             <w:vAlign w:val="top"/>
           </w:tcPr>
           <w:p>
@@ -1866,7 +1866,7 @@
         </w:trPr>
         <w:tc>
           <w:tcPr>
-            <w:tcW w:w="795" w:type="dxa"/>
+            <w:tcW w:w="885" w:type="dxa"/>
             <w:vAlign w:val="top"/>
           </w:tcPr>
           <w:p>
@@ -1883,7 +1883,7 @@
         </w:tc>
         <w:tc>
           <w:tcPr>
-            <w:tcW w:w="9285" w:type="dxa"/>
+            <w:tcW w:w="9195" w:type="dxa"/>
             <w:vAlign w:val="top"/>
           </w:tcPr>
           <w:p>
@@ -1903,7 +1903,7 @@
         </w:trPr>
         <w:tc>
           <w:tcPr>
-            <w:tcW w:w="795" w:type="dxa"/>
+            <w:tcW w:w="885" w:type="dxa"/>
             <w:vAlign w:val="top"/>
           </w:tcPr>
           <w:p>
@@ -1920,7 +1920,7 @@
         </w:tc>
         <w:tc>
           <w:tcPr>
-            <w:tcW w:w="9285" w:type="dxa"/>
+            <w:tcW w:w="9195" w:type="dxa"/>
             <w:vAlign w:val="top"/>
           </w:tcPr>
           <w:p>
@@ -2091,8 +2091,8 @@
         </w:tblCellMar>
       </w:tblPr>
       <w:tblGrid>
-        <w:gridCol w:w="5040"/>
-        <w:gridCol w:w="5040"/>
+        <w:gridCol w:w="5093"/>
+        <w:gridCol w:w="4987"/>
       </w:tblGrid>
       <w:tr>
         <w:trPr>
@@ -2100,7 +2100,7 @@
         </w:trPr>
         <w:tc>
           <w:tcPr>
-            <w:tcW w:w="5040" w:type="dxa"/>
+            <w:tcW w:w="5093" w:type="dxa"/>
             <w:shd w:val="clear" w:color="auto" w:fill="1B4A78"/>
             <w:vAlign w:val="top"/>
           </w:tcPr>
@@ -2119,7 +2119,7 @@
         </w:tc>
         <w:tc>
           <w:tcPr>
-            <w:tcW w:w="5040" w:type="dxa"/>
+            <w:tcW w:w="4987" w:type="dxa"/>
             <w:shd w:val="clear" w:color="auto" w:fill="1B4A78"/>
             <w:vAlign w:val="top"/>
           </w:tcPr>
@@ -2143,7 +2143,7 @@
         </w:trPr>
         <w:tc>
           <w:tcPr>
-            <w:tcW w:w="5040" w:type="dxa"/>
+            <w:tcW w:w="5093" w:type="dxa"/>
             <w:vAlign w:val="top"/>
           </w:tcPr>
           <w:p>
@@ -2168,7 +2168,7 @@
         </w:tc>
         <w:tc>
           <w:tcPr>
-            <w:tcW w:w="5040" w:type="dxa"/>
+            <w:tcW w:w="4987" w:type="dxa"/>
             <w:vAlign w:val="top"/>
           </w:tcPr>
           <w:p>
@@ -2194,7 +2194,7 @@
         </w:trPr>
         <w:tc>
           <w:tcPr>
-            <w:tcW w:w="5040" w:type="dxa"/>
+            <w:tcW w:w="5093" w:type="dxa"/>
             <w:vAlign w:val="top"/>
           </w:tcPr>
           <w:p>
@@ -2235,7 +2235,7 @@
         </w:tc>
         <w:tc>
           <w:tcPr>
-            <w:tcW w:w="5040" w:type="dxa"/>
+            <w:tcW w:w="4987" w:type="dxa"/>
             <w:vAlign w:val="top"/>
           </w:tcPr>
           <w:p>
@@ -2269,7 +2269,7 @@
         </w:trPr>
         <w:tc>
           <w:tcPr>
-            <w:tcW w:w="5040" w:type="dxa"/>
+            <w:tcW w:w="5093" w:type="dxa"/>
             <w:vAlign w:val="top"/>
           </w:tcPr>
           <w:p>
@@ -2284,7 +2284,7 @@
         </w:tc>
         <w:tc>
           <w:tcPr>
-            <w:tcW w:w="5040" w:type="dxa"/>
+            <w:tcW w:w="4987" w:type="dxa"/>
             <w:vAlign w:val="top"/>
           </w:tcPr>
           <w:p>
@@ -2310,7 +2310,7 @@
         </w:trPr>
         <w:tc>
           <w:tcPr>
-            <w:tcW w:w="5040" w:type="dxa"/>
+            <w:tcW w:w="5093" w:type="dxa"/>
             <w:vAlign w:val="top"/>
           </w:tcPr>
           <w:p>
@@ -2325,7 +2325,7 @@
         </w:tc>
         <w:tc>
           <w:tcPr>
-            <w:tcW w:w="5040" w:type="dxa"/>
+            <w:tcW w:w="4987" w:type="dxa"/>
             <w:vAlign w:val="top"/>
           </w:tcPr>
           <w:p>
@@ -2355,7 +2355,7 @@
         </w:trPr>
         <w:tc>
           <w:tcPr>
-            <w:tcW w:w="5040" w:type="dxa"/>
+            <w:tcW w:w="5093" w:type="dxa"/>
             <w:vAlign w:val="top"/>
           </w:tcPr>
           <w:p>
@@ -2376,7 +2376,7 @@
         </w:tc>
         <w:tc>
           <w:tcPr>
-            <w:tcW w:w="5040" w:type="dxa"/>
+            <w:tcW w:w="4987" w:type="dxa"/>
             <w:vAlign w:val="top"/>
           </w:tcPr>
           <w:p>
@@ -2402,7 +2402,7 @@
         </w:trPr>
         <w:tc>
           <w:tcPr>
-            <w:tcW w:w="5040" w:type="dxa"/>
+            <w:tcW w:w="5093" w:type="dxa"/>
             <w:vAlign w:val="top"/>
           </w:tcPr>
           <w:p>
@@ -2417,7 +2417,7 @@
         </w:tc>
         <w:tc>
           <w:tcPr>
-            <w:tcW w:w="5040" w:type="dxa"/>
+            <w:tcW w:w="4987" w:type="dxa"/>
             <w:vAlign w:val="top"/>
           </w:tcPr>
           <w:p>
@@ -2443,7 +2443,7 @@
         </w:trPr>
         <w:tc>
           <w:tcPr>
-            <w:tcW w:w="5040" w:type="dxa"/>
+            <w:tcW w:w="5093" w:type="dxa"/>
             <w:vAlign w:val="top"/>
           </w:tcPr>
           <w:p>
@@ -2458,7 +2458,7 @@
         </w:tc>
         <w:tc>
           <w:tcPr>
-            <w:tcW w:w="5040" w:type="dxa"/>
+            <w:tcW w:w="4987" w:type="dxa"/>
             <w:vAlign w:val="top"/>
           </w:tcPr>
           <w:p>
@@ -2524,23 +2524,23 @@
         </w:tblBorders>
         <w:tblLayout w:type="fixed"/>
         <w:tblCellMar>
-          <w:top w:w="60" w:type="dxa"/>
-          <w:left w:w="100" w:type="dxa"/>
-          <w:bottom w:w="60" w:type="dxa"/>
-          <w:right w:w="100" w:type="dxa"/>
+          <w:top w:w="50" w:type="dxa"/>
+          <w:left w:w="30" w:type="dxa"/>
+          <w:bottom w:w="50" w:type="dxa"/>
+          <w:right w:w="30" w:type="dxa"/>
         </w:tblCellMar>
       </w:tblPr>
       <w:tblGrid>
-        <w:gridCol w:w="1290"/>
-        <w:gridCol w:w="976"/>
-        <w:gridCol w:w="976"/>
-        <w:gridCol w:w="976"/>
-        <w:gridCol w:w="976"/>
-        <w:gridCol w:w="976"/>
-        <w:gridCol w:w="976"/>
-        <w:gridCol w:w="976"/>
-        <w:gridCol w:w="976"/>
-        <w:gridCol w:w="982"/>
+        <w:gridCol w:w="1170"/>
+        <w:gridCol w:w="990"/>
+        <w:gridCol w:w="990"/>
+        <w:gridCol w:w="990"/>
+        <w:gridCol w:w="990"/>
+        <w:gridCol w:w="990"/>
+        <w:gridCol w:w="990"/>
+        <w:gridCol w:w="990"/>
+        <w:gridCol w:w="990"/>
+        <w:gridCol w:w="990"/>
       </w:tblGrid>
       <w:tr>
         <w:trPr>
@@ -2548,7 +2548,7 @@
         </w:trPr>
         <w:tc>
           <w:tcPr>
-            <w:tcW w:w="1290" w:type="dxa"/>
+            <w:tcW w:w="1170" w:type="dxa"/>
             <w:shd w:val="clear" w:color="auto" w:fill="12365A"/>
             <w:vAlign w:val="top"/>
           </w:tcPr>
@@ -2569,7 +2569,7 @@
         </w:tc>
         <w:tc>
           <w:tcPr>
-            <w:tcW w:w="976" w:type="dxa"/>
+            <w:tcW w:w="990" w:type="dxa"/>
             <w:shd w:val="clear" w:color="auto" w:fill="12365A"/>
             <w:vAlign w:val="top"/>
           </w:tcPr>
@@ -2591,7 +2591,7 @@
         </w:tc>
         <w:tc>
           <w:tcPr>
-            <w:tcW w:w="976" w:type="dxa"/>
+            <w:tcW w:w="990" w:type="dxa"/>
             <w:shd w:val="clear" w:color="auto" w:fill="12365A"/>
             <w:vAlign w:val="top"/>
           </w:tcPr>
@@ -2613,7 +2613,7 @@
         </w:tc>
         <w:tc>
           <w:tcPr>
-            <w:tcW w:w="976" w:type="dxa"/>
+            <w:tcW w:w="990" w:type="dxa"/>
             <w:shd w:val="clear" w:color="auto" w:fill="12365A"/>
             <w:vAlign w:val="top"/>
           </w:tcPr>
@@ -2635,7 +2635,7 @@
         </w:tc>
         <w:tc>
           <w:tcPr>
-            <w:tcW w:w="976" w:type="dxa"/>
+            <w:tcW w:w="990" w:type="dxa"/>
             <w:shd w:val="clear" w:color="auto" w:fill="12365A"/>
             <w:vAlign w:val="top"/>
           </w:tcPr>
@@ -2657,7 +2657,7 @@
         </w:tc>
         <w:tc>
           <w:tcPr>
-            <w:tcW w:w="976" w:type="dxa"/>
+            <w:tcW w:w="990" w:type="dxa"/>
             <w:shd w:val="clear" w:color="auto" w:fill="12365A"/>
             <w:vAlign w:val="top"/>
           </w:tcPr>
@@ -2679,7 +2679,7 @@
         </w:tc>
         <w:tc>
           <w:tcPr>
-            <w:tcW w:w="976" w:type="dxa"/>
+            <w:tcW w:w="990" w:type="dxa"/>
             <w:shd w:val="clear" w:color="auto" w:fill="12365A"/>
             <w:vAlign w:val="top"/>
           </w:tcPr>
@@ -2701,7 +2701,7 @@
         </w:tc>
         <w:tc>
           <w:tcPr>
-            <w:tcW w:w="976" w:type="dxa"/>
+            <w:tcW w:w="990" w:type="dxa"/>
             <w:shd w:val="clear" w:color="auto" w:fill="12365A"/>
             <w:vAlign w:val="top"/>
           </w:tcPr>
@@ -2723,7 +2723,7 @@
         </w:tc>
         <w:tc>
           <w:tcPr>
-            <w:tcW w:w="976" w:type="dxa"/>
+            <w:tcW w:w="990" w:type="dxa"/>
             <w:shd w:val="clear" w:color="auto" w:fill="12365A"/>
             <w:vAlign w:val="top"/>
           </w:tcPr>
@@ -2745,7 +2745,7 @@
         </w:tc>
         <w:tc>
           <w:tcPr>
-            <w:tcW w:w="982" w:type="dxa"/>
+            <w:tcW w:w="990" w:type="dxa"/>
             <w:shd w:val="clear" w:color="auto" w:fill="12365A"/>
             <w:vAlign w:val="top"/>
           </w:tcPr>
@@ -2772,7 +2772,7 @@
         </w:trPr>
         <w:tc>
           <w:tcPr>
-            <w:tcW w:w="1290" w:type="dxa"/>
+            <w:tcW w:w="1170" w:type="dxa"/>
             <w:shd w:val="clear" w:color="auto" w:fill="DBE8F4"/>
             <w:vAlign w:val="top"/>
           </w:tcPr>
@@ -2793,7 +2793,7 @@
         </w:tc>
         <w:tc>
           <w:tcPr>
-            <w:tcW w:w="976" w:type="dxa"/>
+            <w:tcW w:w="990" w:type="dxa"/>
             <w:shd w:val="clear" w:color="auto" w:fill="1B4A78"/>
             <w:vAlign w:val="center"/>
           </w:tcPr>
@@ -2815,7 +2815,7 @@
         </w:tc>
         <w:tc>
           <w:tcPr>
-            <w:tcW w:w="976" w:type="dxa"/>
+            <w:tcW w:w="990" w:type="dxa"/>
             <w:shd w:val="clear" w:color="auto" w:fill="EEF1F4"/>
             <w:vAlign w:val="center"/>
           </w:tcPr>
@@ -2836,7 +2836,7 @@
         </w:tc>
         <w:tc>
           <w:tcPr>
-            <w:tcW w:w="976" w:type="dxa"/>
+            <w:tcW w:w="990" w:type="dxa"/>
             <w:shd w:val="clear" w:color="auto" w:fill="EEF1F4"/>
             <w:vAlign w:val="center"/>
           </w:tcPr>
@@ -2857,7 +2857,7 @@
         </w:tc>
         <w:tc>
           <w:tcPr>
-            <w:tcW w:w="976" w:type="dxa"/>
+            <w:tcW w:w="990" w:type="dxa"/>
             <w:shd w:val="clear" w:color="auto" w:fill="EEF1F4"/>
             <w:vAlign w:val="center"/>
           </w:tcPr>
@@ -2878,7 +2878,7 @@
         </w:tc>
         <w:tc>
           <w:tcPr>
-            <w:tcW w:w="976" w:type="dxa"/>
+            <w:tcW w:w="990" w:type="dxa"/>
             <w:shd w:val="clear" w:color="auto" w:fill="EEF1F4"/>
             <w:vAlign w:val="center"/>
           </w:tcPr>
@@ -2899,7 +2899,7 @@
         </w:tc>
         <w:tc>
           <w:tcPr>
-            <w:tcW w:w="976" w:type="dxa"/>
+            <w:tcW w:w="990" w:type="dxa"/>
             <w:shd w:val="clear" w:color="auto" w:fill="EEF1F4"/>
             <w:vAlign w:val="center"/>
           </w:tcPr>
@@ -2920,7 +2920,7 @@
         </w:tc>
         <w:tc>
           <w:tcPr>
-            <w:tcW w:w="976" w:type="dxa"/>
+            <w:tcW w:w="990" w:type="dxa"/>
             <w:shd w:val="clear" w:color="auto" w:fill="EEF1F4"/>
             <w:vAlign w:val="center"/>
           </w:tcPr>
@@ -2941,7 +2941,7 @@
         </w:tc>
         <w:tc>
           <w:tcPr>
-            <w:tcW w:w="976" w:type="dxa"/>
+            <w:tcW w:w="990" w:type="dxa"/>
             <w:shd w:val="clear" w:color="auto" w:fill="EEF1F4"/>
             <w:vAlign w:val="center"/>
           </w:tcPr>
@@ -2962,7 +2962,7 @@
         </w:tc>
         <w:tc>
           <w:tcPr>
-            <w:tcW w:w="982" w:type="dxa"/>
+            <w:tcW w:w="990" w:type="dxa"/>
             <w:shd w:val="clear" w:color="auto" w:fill="EEF1F4"/>
             <w:vAlign w:val="center"/>
           </w:tcPr>
@@ -2988,7 +2988,7 @@
         </w:trPr>
         <w:tc>
           <w:tcPr>
-            <w:tcW w:w="1290" w:type="dxa"/>
+            <w:tcW w:w="1170" w:type="dxa"/>
             <w:shd w:val="clear" w:color="auto" w:fill="DBE8F4"/>
             <w:vAlign w:val="top"/>
           </w:tcPr>
@@ -3009,7 +3009,7 @@
         </w:tc>
         <w:tc>
           <w:tcPr>
-            <w:tcW w:w="976" w:type="dxa"/>
+            <w:tcW w:w="990" w:type="dxa"/>
             <w:shd w:val="clear" w:color="auto" w:fill="1B4A78"/>
             <w:vAlign w:val="center"/>
           </w:tcPr>
@@ -3031,7 +3031,7 @@
         </w:tc>
         <w:tc>
           <w:tcPr>
-            <w:tcW w:w="976" w:type="dxa"/>
+            <w:tcW w:w="990" w:type="dxa"/>
             <w:shd w:val="clear" w:color="auto" w:fill="1B4A78"/>
             <w:vAlign w:val="center"/>
           </w:tcPr>
@@ -3053,7 +3053,7 @@
         </w:tc>
         <w:tc>
           <w:tcPr>
-            <w:tcW w:w="976" w:type="dxa"/>
+            <w:tcW w:w="990" w:type="dxa"/>
             <w:shd w:val="clear" w:color="auto" w:fill="1B4A78"/>
             <w:vAlign w:val="center"/>
           </w:tcPr>
@@ -3075,7 +3075,7 @@
         </w:tc>
         <w:tc>
           <w:tcPr>
-            <w:tcW w:w="976" w:type="dxa"/>
+            <w:tcW w:w="990" w:type="dxa"/>
             <w:shd w:val="clear" w:color="auto" w:fill="EEF1F4"/>
             <w:vAlign w:val="center"/>
           </w:tcPr>
@@ -3096,7 +3096,7 @@
         </w:tc>
         <w:tc>
           <w:tcPr>
-            <w:tcW w:w="976" w:type="dxa"/>
+            <w:tcW w:w="990" w:type="dxa"/>
             <w:shd w:val="clear" w:color="auto" w:fill="2F7D5B"/>
             <w:vAlign w:val="center"/>
           </w:tcPr>
@@ -3118,7 +3118,7 @@
         </w:tc>
         <w:tc>
           <w:tcPr>
-            <w:tcW w:w="976" w:type="dxa"/>
+            <w:tcW w:w="990" w:type="dxa"/>
             <w:shd w:val="clear" w:color="auto" w:fill="EEF1F4"/>
             <w:vAlign w:val="center"/>
           </w:tcPr>
@@ -3139,7 +3139,7 @@
         </w:tc>
         <w:tc>
           <w:tcPr>
-            <w:tcW w:w="976" w:type="dxa"/>
+            <w:tcW w:w="990" w:type="dxa"/>
             <w:shd w:val="clear" w:color="auto" w:fill="EEF1F4"/>
             <w:vAlign w:val="center"/>
           </w:tcPr>
@@ -3160,7 +3160,7 @@
         </w:tc>
         <w:tc>
           <w:tcPr>
-            <w:tcW w:w="976" w:type="dxa"/>
+            <w:tcW w:w="990" w:type="dxa"/>
             <w:shd w:val="clear" w:color="auto" w:fill="EEF1F4"/>
             <w:vAlign w:val="center"/>
           </w:tcPr>
@@ -3181,7 +3181,7 @@
         </w:tc>
         <w:tc>
           <w:tcPr>
-            <w:tcW w:w="982" w:type="dxa"/>
+            <w:tcW w:w="990" w:type="dxa"/>
             <w:shd w:val="clear" w:color="auto" w:fill="2F7D5B"/>
             <w:vAlign w:val="center"/>
           </w:tcPr>
@@ -3208,7 +3208,7 @@
         </w:trPr>
         <w:tc>
           <w:tcPr>
-            <w:tcW w:w="1290" w:type="dxa"/>
+            <w:tcW w:w="1170" w:type="dxa"/>
             <w:shd w:val="clear" w:color="auto" w:fill="DBE8F4"/>
             <w:vAlign w:val="top"/>
           </w:tcPr>
@@ -3229,7 +3229,7 @@
         </w:tc>
         <w:tc>
           <w:tcPr>
-            <w:tcW w:w="976" w:type="dxa"/>
+            <w:tcW w:w="990" w:type="dxa"/>
             <w:shd w:val="clear" w:color="auto" w:fill="1B4A78"/>
             <w:vAlign w:val="center"/>
           </w:tcPr>
@@ -3251,7 +3251,7 @@
         </w:tc>
         <w:tc>
           <w:tcPr>
-            <w:tcW w:w="976" w:type="dxa"/>
+            <w:tcW w:w="990" w:type="dxa"/>
             <w:shd w:val="clear" w:color="auto" w:fill="1B4A78"/>
             <w:vAlign w:val="center"/>
           </w:tcPr>
@@ -3273,7 +3273,7 @@
         </w:tc>
         <w:tc>
           <w:tcPr>
-            <w:tcW w:w="976" w:type="dxa"/>
+            <w:tcW w:w="990" w:type="dxa"/>
             <w:shd w:val="clear" w:color="auto" w:fill="1B4A78"/>
             <w:vAlign w:val="center"/>
           </w:tcPr>
@@ -3295,7 +3295,7 @@
         </w:tc>
         <w:tc>
           <w:tcPr>
-            <w:tcW w:w="976" w:type="dxa"/>
+            <w:tcW w:w="990" w:type="dxa"/>
             <w:shd w:val="clear" w:color="auto" w:fill="1B4A78"/>
             <w:vAlign w:val="center"/>
           </w:tcPr>
@@ -3317,7 +3317,7 @@
         </w:tc>
         <w:tc>
           <w:tcPr>
-            <w:tcW w:w="976" w:type="dxa"/>
+            <w:tcW w:w="990" w:type="dxa"/>
             <w:shd w:val="clear" w:color="auto" w:fill="1B4A78"/>
             <w:vAlign w:val="center"/>
           </w:tcPr>
@@ -3339,7 +3339,7 @@
         </w:tc>
         <w:tc>
           <w:tcPr>
-            <w:tcW w:w="976" w:type="dxa"/>
+            <w:tcW w:w="990" w:type="dxa"/>
             <w:shd w:val="clear" w:color="auto" w:fill="EEF1F4"/>
             <w:vAlign w:val="center"/>
           </w:tcPr>
@@ -3360,7 +3360,7 @@
         </w:tc>
         <w:tc>
           <w:tcPr>
-            <w:tcW w:w="976" w:type="dxa"/>
+            <w:tcW w:w="990" w:type="dxa"/>
             <w:shd w:val="clear" w:color="auto" w:fill="EEF1F4"/>
             <w:vAlign w:val="center"/>
           </w:tcPr>
@@ -3381,7 +3381,7 @@
         </w:tc>
         <w:tc>
           <w:tcPr>
-            <w:tcW w:w="976" w:type="dxa"/>
+            <w:tcW w:w="990" w:type="dxa"/>
             <w:shd w:val="clear" w:color="auto" w:fill="EEF1F4"/>
             <w:vAlign w:val="center"/>
           </w:tcPr>
@@ -3402,7 +3402,7 @@
         </w:tc>
         <w:tc>
           <w:tcPr>
-            <w:tcW w:w="982" w:type="dxa"/>
+            <w:tcW w:w="990" w:type="dxa"/>
             <w:shd w:val="clear" w:color="auto" w:fill="EEF1F4"/>
             <w:vAlign w:val="center"/>
           </w:tcPr>
@@ -3428,7 +3428,7 @@
         </w:trPr>
         <w:tc>
           <w:tcPr>
-            <w:tcW w:w="1290" w:type="dxa"/>
+            <w:tcW w:w="1170" w:type="dxa"/>
             <w:shd w:val="clear" w:color="auto" w:fill="DBE8F4"/>
             <w:vAlign w:val="top"/>
           </w:tcPr>
@@ -3449,7 +3449,7 @@
         </w:tc>
         <w:tc>
           <w:tcPr>
-            <w:tcW w:w="976" w:type="dxa"/>
+            <w:tcW w:w="990" w:type="dxa"/>
             <w:shd w:val="clear" w:color="auto" w:fill="1B4A78"/>
             <w:vAlign w:val="center"/>
           </w:tcPr>
@@ -3471,7 +3471,7 @@
         </w:tc>
         <w:tc>
           <w:tcPr>
-            <w:tcW w:w="976" w:type="dxa"/>
+            <w:tcW w:w="990" w:type="dxa"/>
             <w:shd w:val="clear" w:color="auto" w:fill="1B4A78"/>
             <w:vAlign w:val="center"/>
           </w:tcPr>
@@ -3493,7 +3493,7 @@
         </w:tc>
         <w:tc>
           <w:tcPr>
-            <w:tcW w:w="976" w:type="dxa"/>
+            <w:tcW w:w="990" w:type="dxa"/>
             <w:shd w:val="clear" w:color="auto" w:fill="1B4A78"/>
             <w:vAlign w:val="center"/>
           </w:tcPr>
@@ -3515,7 +3515,7 @@
         </w:tc>
         <w:tc>
           <w:tcPr>
-            <w:tcW w:w="976" w:type="dxa"/>
+            <w:tcW w:w="990" w:type="dxa"/>
             <w:shd w:val="clear" w:color="auto" w:fill="1B4A78"/>
             <w:vAlign w:val="center"/>
           </w:tcPr>
@@ -3537,7 +3537,7 @@
         </w:tc>
         <w:tc>
           <w:tcPr>
-            <w:tcW w:w="976" w:type="dxa"/>
+            <w:tcW w:w="990" w:type="dxa"/>
             <w:shd w:val="clear" w:color="auto" w:fill="1B4A78"/>
             <w:vAlign w:val="center"/>
           </w:tcPr>
@@ -3559,7 +3559,7 @@
         </w:tc>
         <w:tc>
           <w:tcPr>
-            <w:tcW w:w="976" w:type="dxa"/>
+            <w:tcW w:w="990" w:type="dxa"/>
             <w:shd w:val="clear" w:color="auto" w:fill="EEF1F4"/>
             <w:vAlign w:val="center"/>
           </w:tcPr>
@@ -3580,7 +3580,7 @@
         </w:tc>
         <w:tc>
           <w:tcPr>
-            <w:tcW w:w="976" w:type="dxa"/>
+            <w:tcW w:w="990" w:type="dxa"/>
             <w:shd w:val="clear" w:color="auto" w:fill="EEF1F4"/>
             <w:vAlign w:val="center"/>
           </w:tcPr>
@@ -3601,7 +3601,7 @@
         </w:tc>
         <w:tc>
           <w:tcPr>
-            <w:tcW w:w="976" w:type="dxa"/>
+            <w:tcW w:w="990" w:type="dxa"/>
             <w:shd w:val="clear" w:color="auto" w:fill="EEF1F4"/>
             <w:vAlign w:val="center"/>
           </w:tcPr>
@@ -3622,7 +3622,7 @@
         </w:tc>
         <w:tc>
           <w:tcPr>
-            <w:tcW w:w="982" w:type="dxa"/>
+            <w:tcW w:w="990" w:type="dxa"/>
             <w:shd w:val="clear" w:color="auto" w:fill="EEF1F4"/>
             <w:vAlign w:val="center"/>
           </w:tcPr>
@@ -3648,7 +3648,7 @@
         </w:trPr>
         <w:tc>
           <w:tcPr>
-            <w:tcW w:w="1290" w:type="dxa"/>
+            <w:tcW w:w="1170" w:type="dxa"/>
             <w:shd w:val="clear" w:color="auto" w:fill="DBE8F4"/>
             <w:vAlign w:val="top"/>
           </w:tcPr>
@@ -3669,7 +3669,7 @@
         </w:tc>
         <w:tc>
           <w:tcPr>
-            <w:tcW w:w="976" w:type="dxa"/>
+            <w:tcW w:w="990" w:type="dxa"/>
             <w:shd w:val="clear" w:color="auto" w:fill="FFFFFF"/>
             <w:vAlign w:val="center"/>
           </w:tcPr>
@@ -3690,7 +3690,7 @@
         </w:tc>
         <w:tc>
           <w:tcPr>
-            <w:tcW w:w="976" w:type="dxa"/>
+            <w:tcW w:w="990" w:type="dxa"/>
             <w:shd w:val="clear" w:color="auto" w:fill="1B4A78"/>
             <w:vAlign w:val="center"/>
           </w:tcPr>
@@ -3712,7 +3712,7 @@
         </w:tc>
         <w:tc>
           <w:tcPr>
-            <w:tcW w:w="976" w:type="dxa"/>
+            <w:tcW w:w="990" w:type="dxa"/>
             <w:shd w:val="clear" w:color="auto" w:fill="1B4A78"/>
             <w:vAlign w:val="center"/>
           </w:tcPr>
@@ -3734,7 +3734,7 @@
         </w:tc>
         <w:tc>
           <w:tcPr>
-            <w:tcW w:w="976" w:type="dxa"/>
+            <w:tcW w:w="990" w:type="dxa"/>
             <w:shd w:val="clear" w:color="auto" w:fill="1B4A78"/>
             <w:vAlign w:val="center"/>
           </w:tcPr>
@@ -3756,7 +3756,7 @@
         </w:tc>
         <w:tc>
           <w:tcPr>
-            <w:tcW w:w="976" w:type="dxa"/>
+            <w:tcW w:w="990" w:type="dxa"/>
             <w:shd w:val="clear" w:color="auto" w:fill="1B4A78"/>
             <w:vAlign w:val="center"/>
           </w:tcPr>
@@ -3778,7 +3778,7 @@
         </w:tc>
         <w:tc>
           <w:tcPr>
-            <w:tcW w:w="976" w:type="dxa"/>
+            <w:tcW w:w="990" w:type="dxa"/>
             <w:shd w:val="clear" w:color="auto" w:fill="1B4A78"/>
             <w:vAlign w:val="center"/>
           </w:tcPr>
@@ -3800,7 +3800,7 @@
         </w:tc>
         <w:tc>
           <w:tcPr>
-            <w:tcW w:w="976" w:type="dxa"/>
+            <w:tcW w:w="990" w:type="dxa"/>
             <w:shd w:val="clear" w:color="auto" w:fill="1B4A78"/>
             <w:vAlign w:val="center"/>
           </w:tcPr>
@@ -3822,7 +3822,7 @@
         </w:tc>
         <w:tc>
           <w:tcPr>
-            <w:tcW w:w="976" w:type="dxa"/>
+            <w:tcW w:w="990" w:type="dxa"/>
             <w:shd w:val="clear" w:color="auto" w:fill="EEF1F4"/>
             <w:vAlign w:val="center"/>
           </w:tcPr>
@@ -3843,7 +3843,7 @@
         </w:tc>
         <w:tc>
           <w:tcPr>
-            <w:tcW w:w="982" w:type="dxa"/>
+            <w:tcW w:w="990" w:type="dxa"/>
             <w:shd w:val="clear" w:color="auto" w:fill="EEF1F4"/>
             <w:vAlign w:val="center"/>
           </w:tcPr>
@@ -3869,7 +3869,7 @@
         </w:trPr>
         <w:tc>
           <w:tcPr>
-            <w:tcW w:w="1290" w:type="dxa"/>
+            <w:tcW w:w="1170" w:type="dxa"/>
             <w:shd w:val="clear" w:color="auto" w:fill="DBE8F4"/>
             <w:vAlign w:val="top"/>
           </w:tcPr>
@@ -3890,7 +3890,7 @@
         </w:tc>
         <w:tc>
           <w:tcPr>
-            <w:tcW w:w="976" w:type="dxa"/>
+            <w:tcW w:w="990" w:type="dxa"/>
             <w:shd w:val="clear" w:color="auto" w:fill="FFFFFF"/>
             <w:vAlign w:val="center"/>
           </w:tcPr>
@@ -3911,7 +3911,7 @@
         </w:tc>
         <w:tc>
           <w:tcPr>
-            <w:tcW w:w="976" w:type="dxa"/>
+            <w:tcW w:w="990" w:type="dxa"/>
             <w:shd w:val="clear" w:color="auto" w:fill="1B4A78"/>
             <w:vAlign w:val="center"/>
           </w:tcPr>
@@ -3933,7 +3933,7 @@
         </w:tc>
         <w:tc>
           <w:tcPr>
-            <w:tcW w:w="976" w:type="dxa"/>
+            <w:tcW w:w="990" w:type="dxa"/>
             <w:shd w:val="clear" w:color="auto" w:fill="1B4A78"/>
             <w:vAlign w:val="center"/>
           </w:tcPr>
@@ -3955,7 +3955,7 @@
         </w:tc>
         <w:tc>
           <w:tcPr>
-            <w:tcW w:w="976" w:type="dxa"/>
+            <w:tcW w:w="990" w:type="dxa"/>
             <w:shd w:val="clear" w:color="auto" w:fill="1B4A78"/>
             <w:vAlign w:val="center"/>
           </w:tcPr>
@@ -3977,7 +3977,7 @@
         </w:tc>
         <w:tc>
           <w:tcPr>
-            <w:tcW w:w="976" w:type="dxa"/>
+            <w:tcW w:w="990" w:type="dxa"/>
             <w:shd w:val="clear" w:color="auto" w:fill="1B4A78"/>
             <w:vAlign w:val="center"/>
           </w:tcPr>
@@ -3999,7 +3999,7 @@
         </w:tc>
         <w:tc>
           <w:tcPr>
-            <w:tcW w:w="976" w:type="dxa"/>
+            <w:tcW w:w="990" w:type="dxa"/>
             <w:shd w:val="clear" w:color="auto" w:fill="1B4A78"/>
             <w:vAlign w:val="center"/>
           </w:tcPr>
@@ -4021,7 +4021,7 @@
         </w:tc>
         <w:tc>
           <w:tcPr>
-            <w:tcW w:w="976" w:type="dxa"/>
+            <w:tcW w:w="990" w:type="dxa"/>
             <w:shd w:val="clear" w:color="auto" w:fill="1B4A78"/>
             <w:vAlign w:val="center"/>
           </w:tcPr>
@@ -4043,7 +4043,7 @@
         </w:tc>
         <w:tc>
           <w:tcPr>
-            <w:tcW w:w="976" w:type="dxa"/>
+            <w:tcW w:w="990" w:type="dxa"/>
             <w:shd w:val="clear" w:color="auto" w:fill="EEF1F4"/>
             <w:vAlign w:val="center"/>
           </w:tcPr>
@@ -4064,7 +4064,7 @@
         </w:tc>
         <w:tc>
           <w:tcPr>
-            <w:tcW w:w="982" w:type="dxa"/>
+            <w:tcW w:w="990" w:type="dxa"/>
             <w:shd w:val="clear" w:color="auto" w:fill="EEF1F4"/>
             <w:vAlign w:val="center"/>
           </w:tcPr>
@@ -4090,7 +4090,7 @@
         </w:trPr>
         <w:tc>
           <w:tcPr>
-            <w:tcW w:w="1290" w:type="dxa"/>
+            <w:tcW w:w="1170" w:type="dxa"/>
             <w:shd w:val="clear" w:color="auto" w:fill="DBE8F4"/>
             <w:vAlign w:val="top"/>
           </w:tcPr>
@@ -4111,7 +4111,7 @@
         </w:tc>
         <w:tc>
           <w:tcPr>
-            <w:tcW w:w="976" w:type="dxa"/>
+            <w:tcW w:w="990" w:type="dxa"/>
             <w:shd w:val="clear" w:color="auto" w:fill="FFFFFF"/>
             <w:vAlign w:val="center"/>
           </w:tcPr>
@@ -4132,7 +4132,7 @@
         </w:tc>
         <w:tc>
           <w:tcPr>
-            <w:tcW w:w="976" w:type="dxa"/>
+            <w:tcW w:w="990" w:type="dxa"/>
             <w:shd w:val="clear" w:color="auto" w:fill="FFFFFF"/>
             <w:vAlign w:val="center"/>
           </w:tcPr>
@@ -4153,7 +4153,7 @@
         </w:tc>
         <w:tc>
           <w:tcPr>
-            <w:tcW w:w="976" w:type="dxa"/>
+            <w:tcW w:w="990" w:type="dxa"/>
             <w:shd w:val="clear" w:color="auto" w:fill="FFFFFF"/>
             <w:vAlign w:val="center"/>
           </w:tcPr>
@@ -4174,7 +4174,7 @@
         </w:tc>
         <w:tc>
           <w:tcPr>
-            <w:tcW w:w="976" w:type="dxa"/>
+            <w:tcW w:w="990" w:type="dxa"/>
             <w:shd w:val="clear" w:color="auto" w:fill="1B4A78"/>
             <w:vAlign w:val="center"/>
           </w:tcPr>
@@ -4196,7 +4196,7 @@
         </w:tc>
         <w:tc>
           <w:tcPr>
-            <w:tcW w:w="976" w:type="dxa"/>
+            <w:tcW w:w="990" w:type="dxa"/>
             <w:shd w:val="clear" w:color="auto" w:fill="1B4A78"/>
             <w:vAlign w:val="center"/>
           </w:tcPr>
@@ -4218,7 +4218,7 @@
         </w:tc>
         <w:tc>
           <w:tcPr>
-            <w:tcW w:w="976" w:type="dxa"/>
+            <w:tcW w:w="990" w:type="dxa"/>
             <w:shd w:val="clear" w:color="auto" w:fill="1B4A78"/>
             <w:vAlign w:val="center"/>
           </w:tcPr>
@@ -4240,7 +4240,7 @@
         </w:tc>
         <w:tc>
           <w:tcPr>
-            <w:tcW w:w="976" w:type="dxa"/>
+            <w:tcW w:w="990" w:type="dxa"/>
             <w:shd w:val="clear" w:color="auto" w:fill="1B4A78"/>
             <w:vAlign w:val="center"/>
           </w:tcPr>
@@ -4262,7 +4262,7 @@
         </w:tc>
         <w:tc>
           <w:tcPr>
-            <w:tcW w:w="976" w:type="dxa"/>
+            <w:tcW w:w="990" w:type="dxa"/>
             <w:shd w:val="clear" w:color="auto" w:fill="EEF1F4"/>
             <w:vAlign w:val="center"/>
           </w:tcPr>
@@ -4283,7 +4283,7 @@
         </w:tc>
         <w:tc>
           <w:tcPr>
-            <w:tcW w:w="982" w:type="dxa"/>
+            <w:tcW w:w="990" w:type="dxa"/>
             <w:shd w:val="clear" w:color="auto" w:fill="EEF1F4"/>
             <w:vAlign w:val="center"/>
           </w:tcPr>
@@ -4309,7 +4309,7 @@
         </w:trPr>
         <w:tc>
           <w:tcPr>
-            <w:tcW w:w="1290" w:type="dxa"/>
+            <w:tcW w:w="1170" w:type="dxa"/>
             <w:shd w:val="clear" w:color="auto" w:fill="DBE8F4"/>
             <w:vAlign w:val="top"/>
           </w:tcPr>
@@ -4330,7 +4330,7 @@
         </w:tc>
         <w:tc>
           <w:tcPr>
-            <w:tcW w:w="976" w:type="dxa"/>
+            <w:tcW w:w="990" w:type="dxa"/>
             <w:shd w:val="clear" w:color="auto" w:fill="FFFFFF"/>
             <w:vAlign w:val="center"/>
           </w:tcPr>
@@ -4351,7 +4351,7 @@
         </w:tc>
         <w:tc>
           <w:tcPr>
-            <w:tcW w:w="976" w:type="dxa"/>
+            <w:tcW w:w="990" w:type="dxa"/>
             <w:shd w:val="clear" w:color="auto" w:fill="FFFFFF"/>
             <w:vAlign w:val="center"/>
           </w:tcPr>
@@ -4372,7 +4372,7 @@
         </w:tc>
         <w:tc>
           <w:tcPr>
-            <w:tcW w:w="976" w:type="dxa"/>
+            <w:tcW w:w="990" w:type="dxa"/>
             <w:shd w:val="clear" w:color="auto" w:fill="FFFFFF"/>
             <w:vAlign w:val="center"/>
           </w:tcPr>
@@ -4393,7 +4393,7 @@
         </w:tc>
         <w:tc>
           <w:tcPr>
-            <w:tcW w:w="976" w:type="dxa"/>
+            <w:tcW w:w="990" w:type="dxa"/>
             <w:shd w:val="clear" w:color="auto" w:fill="1B4A78"/>
             <w:vAlign w:val="center"/>
           </w:tcPr>
@@ -4415,7 +4415,7 @@
         </w:tc>
         <w:tc>
           <w:tcPr>
-            <w:tcW w:w="976" w:type="dxa"/>
+            <w:tcW w:w="990" w:type="dxa"/>
             <w:shd w:val="clear" w:color="auto" w:fill="1B4A78"/>
             <w:vAlign w:val="center"/>
           </w:tcPr>
@@ -4437,7 +4437,7 @@
         </w:tc>
         <w:tc>
           <w:tcPr>
-            <w:tcW w:w="976" w:type="dxa"/>
+            <w:tcW w:w="990" w:type="dxa"/>
             <w:shd w:val="clear" w:color="auto" w:fill="1B4A78"/>
             <w:vAlign w:val="center"/>
           </w:tcPr>
@@ -4459,7 +4459,7 @@
         </w:tc>
         <w:tc>
           <w:tcPr>
-            <w:tcW w:w="976" w:type="dxa"/>
+            <w:tcW w:w="990" w:type="dxa"/>
             <w:shd w:val="clear" w:color="auto" w:fill="1B4A78"/>
             <w:vAlign w:val="center"/>
           </w:tcPr>
@@ -4481,7 +4481,7 @@
         </w:tc>
         <w:tc>
           <w:tcPr>
-            <w:tcW w:w="976" w:type="dxa"/>
+            <w:tcW w:w="990" w:type="dxa"/>
             <w:shd w:val="clear" w:color="auto" w:fill="1B4A78"/>
             <w:vAlign w:val="center"/>
           </w:tcPr>
@@ -4503,7 +4503,7 @@
         </w:tc>
         <w:tc>
           <w:tcPr>
-            <w:tcW w:w="982" w:type="dxa"/>
+            <w:tcW w:w="990" w:type="dxa"/>
             <w:shd w:val="clear" w:color="auto" w:fill="EEF1F4"/>
             <w:vAlign w:val="center"/>
           </w:tcPr>
@@ -4529,7 +4529,7 @@
         </w:trPr>
         <w:tc>
           <w:tcPr>
-            <w:tcW w:w="1290" w:type="dxa"/>
+            <w:tcW w:w="1170" w:type="dxa"/>
             <w:shd w:val="clear" w:color="auto" w:fill="DBE8F4"/>
             <w:vAlign w:val="top"/>
           </w:tcPr>
@@ -4550,7 +4550,7 @@
         </w:tc>
         <w:tc>
           <w:tcPr>
-            <w:tcW w:w="976" w:type="dxa"/>
+            <w:tcW w:w="990" w:type="dxa"/>
             <w:shd w:val="clear" w:color="auto" w:fill="FFFFFF"/>
             <w:vAlign w:val="center"/>
           </w:tcPr>
@@ -4571,7 +4571,7 @@
         </w:tc>
         <w:tc>
           <w:tcPr>
-            <w:tcW w:w="976" w:type="dxa"/>
+            <w:tcW w:w="990" w:type="dxa"/>
             <w:shd w:val="clear" w:color="auto" w:fill="FFFFFF"/>
             <w:vAlign w:val="center"/>
           </w:tcPr>
@@ -4592,7 +4592,7 @@
         </w:tc>
         <w:tc>
           <w:tcPr>
-            <w:tcW w:w="976" w:type="dxa"/>
+            <w:tcW w:w="990" w:type="dxa"/>
             <w:shd w:val="clear" w:color="auto" w:fill="FFFFFF"/>
             <w:vAlign w:val="center"/>
           </w:tcPr>
@@ -4613,7 +4613,7 @@
         </w:tc>
         <w:tc>
           <w:tcPr>
-            <w:tcW w:w="976" w:type="dxa"/>
+            <w:tcW w:w="990" w:type="dxa"/>
             <w:shd w:val="clear" w:color="auto" w:fill="FFFFFF"/>
             <w:vAlign w:val="center"/>
           </w:tcPr>
@@ -4634,7 +4634,7 @@
         </w:tc>
         <w:tc>
           <w:tcPr>
-            <w:tcW w:w="976" w:type="dxa"/>
+            <w:tcW w:w="990" w:type="dxa"/>
             <w:shd w:val="clear" w:color="auto" w:fill="FFFFFF"/>
             <w:vAlign w:val="center"/>
           </w:tcPr>
@@ -4655,7 +4655,7 @@
         </w:tc>
         <w:tc>
           <w:tcPr>
-            <w:tcW w:w="976" w:type="dxa"/>
+            <w:tcW w:w="990" w:type="dxa"/>
             <w:shd w:val="clear" w:color="auto" w:fill="1B4A78"/>
             <w:vAlign w:val="center"/>
           </w:tcPr>
@@ -4677,7 +4677,7 @@
         </w:tc>
         <w:tc>
           <w:tcPr>
-            <w:tcW w:w="976" w:type="dxa"/>
+            <w:tcW w:w="990" w:type="dxa"/>
             <w:shd w:val="clear" w:color="auto" w:fill="1B4A78"/>
             <w:vAlign w:val="center"/>
           </w:tcPr>
@@ -4699,7 +4699,7 @@
         </w:tc>
         <w:tc>
           <w:tcPr>
-            <w:tcW w:w="976" w:type="dxa"/>
+            <w:tcW w:w="990" w:type="dxa"/>
             <w:shd w:val="clear" w:color="auto" w:fill="1B4A78"/>
             <w:vAlign w:val="center"/>
           </w:tcPr>
@@ -4721,7 +4721,7 @@
         </w:tc>
         <w:tc>
           <w:tcPr>
-            <w:tcW w:w="982" w:type="dxa"/>
+            <w:tcW w:w="990" w:type="dxa"/>
             <w:shd w:val="clear" w:color="auto" w:fill="1B4A78"/>
             <w:vAlign w:val="center"/>
           </w:tcPr>
@@ -4748,7 +4748,7 @@
         </w:trPr>
         <w:tc>
           <w:tcPr>
-            <w:tcW w:w="1290" w:type="dxa"/>
+            <w:tcW w:w="1170" w:type="dxa"/>
             <w:shd w:val="clear" w:color="auto" w:fill="DBE8F4"/>
             <w:vAlign w:val="top"/>
           </w:tcPr>
@@ -4769,7 +4769,7 @@
         </w:tc>
         <w:tc>
           <w:tcPr>
-            <w:tcW w:w="976" w:type="dxa"/>
+            <w:tcW w:w="990" w:type="dxa"/>
             <w:shd w:val="clear" w:color="auto" w:fill="FFFFFF"/>
             <w:vAlign w:val="center"/>
           </w:tcPr>
@@ -4790,7 +4790,7 @@
         </w:tc>
         <w:tc>
           <w:tcPr>
-            <w:tcW w:w="976" w:type="dxa"/>
+            <w:tcW w:w="990" w:type="dxa"/>
             <w:shd w:val="clear" w:color="auto" w:fill="FFFFFF"/>
             <w:vAlign w:val="center"/>
           </w:tcPr>
@@ -4811,7 +4811,7 @@
         </w:tc>
         <w:tc>
           <w:tcPr>
-            <w:tcW w:w="976" w:type="dxa"/>
+            <w:tcW w:w="990" w:type="dxa"/>
             <w:shd w:val="clear" w:color="auto" w:fill="FFFFFF"/>
             <w:vAlign w:val="center"/>
           </w:tcPr>
@@ -4832,7 +4832,7 @@
         </w:tc>
         <w:tc>
           <w:tcPr>
-            <w:tcW w:w="976" w:type="dxa"/>
+            <w:tcW w:w="990" w:type="dxa"/>
             <w:shd w:val="clear" w:color="auto" w:fill="FFFFFF"/>
             <w:vAlign w:val="center"/>
           </w:tcPr>
@@ -4853,7 +4853,7 @@
         </w:tc>
         <w:tc>
           <w:tcPr>
-            <w:tcW w:w="976" w:type="dxa"/>
+            <w:tcW w:w="990" w:type="dxa"/>
             <w:shd w:val="clear" w:color="auto" w:fill="FFFFFF"/>
             <w:vAlign w:val="center"/>
           </w:tcPr>
@@ -4874,7 +4874,7 @@
         </w:tc>
         <w:tc>
           <w:tcPr>
-            <w:tcW w:w="976" w:type="dxa"/>
+            <w:tcW w:w="990" w:type="dxa"/>
             <w:shd w:val="clear" w:color="auto" w:fill="1B4A78"/>
             <w:vAlign w:val="center"/>
           </w:tcPr>
@@ -4896,7 +4896,7 @@
         </w:tc>
         <w:tc>
           <w:tcPr>
-            <w:tcW w:w="976" w:type="dxa"/>
+            <w:tcW w:w="990" w:type="dxa"/>
             <w:shd w:val="clear" w:color="auto" w:fill="1B4A78"/>
             <w:vAlign w:val="center"/>
           </w:tcPr>
@@ -4918,7 +4918,7 @@
         </w:tc>
         <w:tc>
           <w:tcPr>
-            <w:tcW w:w="976" w:type="dxa"/>
+            <w:tcW w:w="990" w:type="dxa"/>
             <w:shd w:val="clear" w:color="auto" w:fill="1B4A78"/>
             <w:vAlign w:val="center"/>
           </w:tcPr>
@@ -4940,7 +4940,7 @@
         </w:tc>
         <w:tc>
           <w:tcPr>
-            <w:tcW w:w="982" w:type="dxa"/>
+            <w:tcW w:w="990" w:type="dxa"/>
             <w:shd w:val="clear" w:color="auto" w:fill="1B4A78"/>
             <w:vAlign w:val="center"/>
           </w:tcPr>
@@ -4967,7 +4967,7 @@
         </w:trPr>
         <w:tc>
           <w:tcPr>
-            <w:tcW w:w="1290" w:type="dxa"/>
+            <w:tcW w:w="1170" w:type="dxa"/>
             <w:shd w:val="clear" w:color="auto" w:fill="DBE8F4"/>
             <w:vAlign w:val="top"/>
           </w:tcPr>
@@ -4988,7 +4988,7 @@
         </w:tc>
         <w:tc>
           <w:tcPr>
-            <w:tcW w:w="976" w:type="dxa"/>
+            <w:tcW w:w="990" w:type="dxa"/>
             <w:shd w:val="clear" w:color="auto" w:fill="FFFFFF"/>
             <w:vAlign w:val="center"/>
           </w:tcPr>
@@ -5009,7 +5009,7 @@
         </w:tc>
         <w:tc>
           <w:tcPr>
-            <w:tcW w:w="976" w:type="dxa"/>
+            <w:tcW w:w="990" w:type="dxa"/>
             <w:shd w:val="clear" w:color="auto" w:fill="FFFFFF"/>
             <w:vAlign w:val="center"/>
           </w:tcPr>
@@ -5030,7 +5030,7 @@
         </w:tc>
         <w:tc>
           <w:tcPr>
-            <w:tcW w:w="976" w:type="dxa"/>
+            <w:tcW w:w="990" w:type="dxa"/>
             <w:shd w:val="clear" w:color="auto" w:fill="FFFFFF"/>
             <w:vAlign w:val="center"/>
           </w:tcPr>
@@ -5051,7 +5051,7 @@
         </w:tc>
         <w:tc>
           <w:tcPr>
-            <w:tcW w:w="976" w:type="dxa"/>
+            <w:tcW w:w="990" w:type="dxa"/>
             <w:shd w:val="clear" w:color="auto" w:fill="FFFFFF"/>
             <w:vAlign w:val="center"/>
           </w:tcPr>
@@ -5072,7 +5072,7 @@
         </w:tc>
         <w:tc>
           <w:tcPr>
-            <w:tcW w:w="976" w:type="dxa"/>
+            <w:tcW w:w="990" w:type="dxa"/>
             <w:shd w:val="clear" w:color="auto" w:fill="FFFFFF"/>
             <w:vAlign w:val="center"/>
           </w:tcPr>
@@ -5093,7 +5093,7 @@
         </w:tc>
         <w:tc>
           <w:tcPr>
-            <w:tcW w:w="976" w:type="dxa"/>
+            <w:tcW w:w="990" w:type="dxa"/>
             <w:shd w:val="clear" w:color="auto" w:fill="FFFFFF"/>
             <w:vAlign w:val="center"/>
           </w:tcPr>
@@ -5114,7 +5114,7 @@
         </w:tc>
         <w:tc>
           <w:tcPr>
-            <w:tcW w:w="976" w:type="dxa"/>
+            <w:tcW w:w="990" w:type="dxa"/>
             <w:shd w:val="clear" w:color="auto" w:fill="1B4A78"/>
             <w:vAlign w:val="center"/>
           </w:tcPr>
@@ -5136,7 +5136,7 @@
         </w:tc>
         <w:tc>
           <w:tcPr>
-            <w:tcW w:w="976" w:type="dxa"/>
+            <w:tcW w:w="990" w:type="dxa"/>
             <w:shd w:val="clear" w:color="auto" w:fill="1B4A78"/>
             <w:vAlign w:val="center"/>
           </w:tcPr>
@@ -5158,7 +5158,7 @@
         </w:tc>
         <w:tc>
           <w:tcPr>
-            <w:tcW w:w="982" w:type="dxa"/>
+            <w:tcW w:w="990" w:type="dxa"/>
             <w:shd w:val="clear" w:color="auto" w:fill="1B4A78"/>
             <w:vAlign w:val="center"/>
           </w:tcPr>
@@ -5630,9 +5630,9 @@
         </w:tblCellMar>
       </w:tblPr>
       <w:tblGrid>
-        <w:gridCol w:w="2394"/>
-        <w:gridCol w:w="3276"/>
-        <w:gridCol w:w="4410"/>
+        <w:gridCol w:w="2452"/>
+        <w:gridCol w:w="3277"/>
+        <w:gridCol w:w="4351"/>
       </w:tblGrid>
       <w:tr>
         <w:trPr>
@@ -5640,7 +5640,7 @@
         </w:trPr>
         <w:tc>
           <w:tcPr>
-            <w:tcW w:w="2394" w:type="dxa"/>
+            <w:tcW w:w="2452" w:type="dxa"/>
             <w:shd w:val="clear" w:color="auto" w:fill="1B4A78"/>
             <w:vAlign w:val="top"/>
           </w:tcPr>
@@ -5659,7 +5659,7 @@
         </w:tc>
         <w:tc>
           <w:tcPr>
-            <w:tcW w:w="3276" w:type="dxa"/>
+            <w:tcW w:w="3277" w:type="dxa"/>
             <w:shd w:val="clear" w:color="auto" w:fill="1B4A78"/>
             <w:vAlign w:val="top"/>
           </w:tcPr>
@@ -5678,7 +5678,7 @@
         </w:tc>
         <w:tc>
           <w:tcPr>
-            <w:tcW w:w="4410" w:type="dxa"/>
+            <w:tcW w:w="4351" w:type="dxa"/>
             <w:shd w:val="clear" w:color="auto" w:fill="1B4A78"/>
             <w:vAlign w:val="top"/>
           </w:tcPr>
@@ -5702,7 +5702,7 @@
         </w:trPr>
         <w:tc>
           <w:tcPr>
-            <w:tcW w:w="2394" w:type="dxa"/>
+            <w:tcW w:w="2452" w:type="dxa"/>
             <w:vAlign w:val="top"/>
           </w:tcPr>
           <w:p>
@@ -5719,7 +5719,7 @@
         </w:tc>
         <w:tc>
           <w:tcPr>
-            <w:tcW w:w="3276" w:type="dxa"/>
+            <w:tcW w:w="3277" w:type="dxa"/>
             <w:vAlign w:val="top"/>
           </w:tcPr>
           <w:p>
@@ -5734,7 +5734,7 @@
         </w:tc>
         <w:tc>
           <w:tcPr>
-            <w:tcW w:w="4410" w:type="dxa"/>
+            <w:tcW w:w="4351" w:type="dxa"/>
             <w:vAlign w:val="top"/>
           </w:tcPr>
           <w:p>
@@ -5756,7 +5756,7 @@
         </w:trPr>
         <w:tc>
           <w:tcPr>
-            <w:tcW w:w="2394" w:type="dxa"/>
+            <w:tcW w:w="2452" w:type="dxa"/>
             <w:vAlign w:val="top"/>
           </w:tcPr>
           <w:p>
@@ -5773,7 +5773,7 @@
         </w:tc>
         <w:tc>
           <w:tcPr>
-            <w:tcW w:w="3276" w:type="dxa"/>
+            <w:tcW w:w="3277" w:type="dxa"/>
             <w:vAlign w:val="top"/>
           </w:tcPr>
           <w:p>
@@ -5788,7 +5788,7 @@
         </w:tc>
         <w:tc>
           <w:tcPr>
-            <w:tcW w:w="4410" w:type="dxa"/>
+            <w:tcW w:w="4351" w:type="dxa"/>
             <w:vAlign w:val="top"/>
           </w:tcPr>
           <w:p>
@@ -5810,7 +5810,7 @@
         </w:trPr>
         <w:tc>
           <w:tcPr>
-            <w:tcW w:w="2394" w:type="dxa"/>
+            <w:tcW w:w="2452" w:type="dxa"/>
             <w:vAlign w:val="top"/>
           </w:tcPr>
           <w:p>
@@ -5825,7 +5825,7 @@
         </w:tc>
         <w:tc>
           <w:tcPr>
-            <w:tcW w:w="3276" w:type="dxa"/>
+            <w:tcW w:w="3277" w:type="dxa"/>
             <w:vAlign w:val="top"/>
           </w:tcPr>
           <w:p>
@@ -5840,7 +5840,7 @@
         </w:tc>
         <w:tc>
           <w:tcPr>
-            <w:tcW w:w="4410" w:type="dxa"/>
+            <w:tcW w:w="4351" w:type="dxa"/>
             <w:vAlign w:val="top"/>
           </w:tcPr>
           <w:p>
@@ -6598,10 +6598,10 @@
         </w:tblCellMar>
       </w:tblPr>
       <w:tblGrid>
-        <w:gridCol w:w="1288"/>
-        <w:gridCol w:w="3221"/>
-        <w:gridCol w:w="2347"/>
-        <w:gridCol w:w="3224"/>
+        <w:gridCol w:w="1477"/>
+        <w:gridCol w:w="2882"/>
+        <w:gridCol w:w="2756"/>
+        <w:gridCol w:w="2965"/>
       </w:tblGrid>
       <w:tr>
         <w:trPr>
@@ -6609,7 +6609,7 @@
         </w:trPr>
         <w:tc>
           <w:tcPr>
-            <w:tcW w:w="1288" w:type="dxa"/>
+            <w:tcW w:w="1477" w:type="dxa"/>
             <w:shd w:val="clear" w:color="auto" w:fill="1B4A78"/>
             <w:vAlign w:val="top"/>
           </w:tcPr>
@@ -6628,7 +6628,7 @@
         </w:tc>
         <w:tc>
           <w:tcPr>
-            <w:tcW w:w="3221" w:type="dxa"/>
+            <w:tcW w:w="2882" w:type="dxa"/>
             <w:shd w:val="clear" w:color="auto" w:fill="1B4A78"/>
             <w:vAlign w:val="top"/>
           </w:tcPr>
@@ -6654,7 +6654,7 @@
         </w:tc>
         <w:tc>
           <w:tcPr>
-            <w:tcW w:w="2347" w:type="dxa"/>
+            <w:tcW w:w="2756" w:type="dxa"/>
             <w:shd w:val="clear" w:color="auto" w:fill="1B4A78"/>
             <w:vAlign w:val="top"/>
           </w:tcPr>
@@ -6673,7 +6673,7 @@
         </w:tc>
         <w:tc>
           <w:tcPr>
-            <w:tcW w:w="3224" w:type="dxa"/>
+            <w:tcW w:w="2965" w:type="dxa"/>
             <w:shd w:val="clear" w:color="auto" w:fill="1B4A78"/>
             <w:vAlign w:val="top"/>
           </w:tcPr>
@@ -6697,7 +6697,7 @@
         </w:trPr>
         <w:tc>
           <w:tcPr>
-            <w:tcW w:w="1288" w:type="dxa"/>
+            <w:tcW w:w="1477" w:type="dxa"/>
             <w:vAlign w:val="top"/>
           </w:tcPr>
           <w:p>
@@ -6718,7 +6718,7 @@
         </w:tc>
         <w:tc>
           <w:tcPr>
-            <w:tcW w:w="3221" w:type="dxa"/>
+            <w:tcW w:w="2882" w:type="dxa"/>
             <w:vAlign w:val="top"/>
           </w:tcPr>
           <w:p>
@@ -6749,7 +6749,7 @@
         </w:tc>
         <w:tc>
           <w:tcPr>
-            <w:tcW w:w="2347" w:type="dxa"/>
+            <w:tcW w:w="2756" w:type="dxa"/>
             <w:vAlign w:val="top"/>
           </w:tcPr>
           <w:p>
@@ -6764,7 +6764,7 @@
         </w:tc>
         <w:tc>
           <w:tcPr>
-            <w:tcW w:w="3224" w:type="dxa"/>
+            <w:tcW w:w="2965" w:type="dxa"/>
             <w:vAlign w:val="top"/>
           </w:tcPr>
           <w:p>
@@ -6790,7 +6790,7 @@
         </w:trPr>
         <w:tc>
           <w:tcPr>
-            <w:tcW w:w="1288" w:type="dxa"/>
+            <w:tcW w:w="1477" w:type="dxa"/>
             <w:vAlign w:val="top"/>
           </w:tcPr>
           <w:p>
@@ -6811,7 +6811,7 @@
         </w:tc>
         <w:tc>
           <w:tcPr>
-            <w:tcW w:w="3221" w:type="dxa"/>
+            <w:tcW w:w="2882" w:type="dxa"/>
             <w:vAlign w:val="top"/>
           </w:tcPr>
           <w:p>
@@ -6832,7 +6832,7 @@
         </w:tc>
         <w:tc>
           <w:tcPr>
-            <w:tcW w:w="2347" w:type="dxa"/>
+            <w:tcW w:w="2756" w:type="dxa"/>
             <w:vAlign w:val="top"/>
           </w:tcPr>
           <w:p>
@@ -6847,7 +6847,7 @@
         </w:tc>
         <w:tc>
           <w:tcPr>
-            <w:tcW w:w="3224" w:type="dxa"/>
+            <w:tcW w:w="2965" w:type="dxa"/>
             <w:vAlign w:val="top"/>
           </w:tcPr>
           <w:p>
@@ -6877,7 +6877,7 @@
         </w:trPr>
         <w:tc>
           <w:tcPr>
-            <w:tcW w:w="1288" w:type="dxa"/>
+            <w:tcW w:w="1477" w:type="dxa"/>
             <w:vAlign w:val="top"/>
           </w:tcPr>
           <w:p>
@@ -6894,7 +6894,7 @@
         </w:tc>
         <w:tc>
           <w:tcPr>
-            <w:tcW w:w="3221" w:type="dxa"/>
+            <w:tcW w:w="2882" w:type="dxa"/>
             <w:vAlign w:val="top"/>
           </w:tcPr>
           <w:p>
@@ -6911,7 +6911,7 @@
         </w:tc>
         <w:tc>
           <w:tcPr>
-            <w:tcW w:w="2347" w:type="dxa"/>
+            <w:tcW w:w="2756" w:type="dxa"/>
             <w:vAlign w:val="top"/>
           </w:tcPr>
           <w:p>
@@ -6932,7 +6932,7 @@
         </w:tc>
         <w:tc>
           <w:tcPr>
-            <w:tcW w:w="3224" w:type="dxa"/>
+            <w:tcW w:w="2965" w:type="dxa"/>
             <w:vAlign w:val="top"/>
           </w:tcPr>
           <w:p>
@@ -6952,7 +6952,7 @@
         </w:trPr>
         <w:tc>
           <w:tcPr>
-            <w:tcW w:w="1288" w:type="dxa"/>
+            <w:tcW w:w="1477" w:type="dxa"/>
             <w:vAlign w:val="top"/>
           </w:tcPr>
           <w:p>
@@ -6969,7 +6969,7 @@
         </w:tc>
         <w:tc>
           <w:tcPr>
-            <w:tcW w:w="3221" w:type="dxa"/>
+            <w:tcW w:w="2882" w:type="dxa"/>
             <w:vAlign w:val="top"/>
           </w:tcPr>
           <w:p>
@@ -6994,7 +6994,7 @@
         </w:tc>
         <w:tc>
           <w:tcPr>
-            <w:tcW w:w="2347" w:type="dxa"/>
+            <w:tcW w:w="2756" w:type="dxa"/>
             <w:vAlign w:val="top"/>
           </w:tcPr>
           <w:p>
@@ -7009,7 +7009,7 @@
         </w:tc>
         <w:tc>
           <w:tcPr>
-            <w:tcW w:w="3224" w:type="dxa"/>
+            <w:tcW w:w="2965" w:type="dxa"/>
             <w:vAlign w:val="top"/>
           </w:tcPr>
           <w:p>
@@ -7029,7 +7029,7 @@
         </w:trPr>
         <w:tc>
           <w:tcPr>
-            <w:tcW w:w="1288" w:type="dxa"/>
+            <w:tcW w:w="1477" w:type="dxa"/>
             <w:vAlign w:val="top"/>
           </w:tcPr>
           <w:p>
@@ -7046,7 +7046,7 @@
         </w:tc>
         <w:tc>
           <w:tcPr>
-            <w:tcW w:w="3221" w:type="dxa"/>
+            <w:tcW w:w="2882" w:type="dxa"/>
             <w:vAlign w:val="top"/>
           </w:tcPr>
           <w:p>
@@ -7071,7 +7071,7 @@
         </w:tc>
         <w:tc>
           <w:tcPr>
-            <w:tcW w:w="2347" w:type="dxa"/>
+            <w:tcW w:w="2756" w:type="dxa"/>
             <w:vAlign w:val="top"/>
           </w:tcPr>
           <w:p>
@@ -7086,7 +7086,7 @@
         </w:tc>
         <w:tc>
           <w:tcPr>
-            <w:tcW w:w="3224" w:type="dxa"/>
+            <w:tcW w:w="2965" w:type="dxa"/>
             <w:vAlign w:val="top"/>
           </w:tcPr>
           <w:p>
@@ -7106,7 +7106,7 @@
         </w:trPr>
         <w:tc>
           <w:tcPr>
-            <w:tcW w:w="1288" w:type="dxa"/>
+            <w:tcW w:w="1477" w:type="dxa"/>
             <w:vAlign w:val="top"/>
           </w:tcPr>
           <w:p>
@@ -7123,7 +7123,7 @@
         </w:tc>
         <w:tc>
           <w:tcPr>
-            <w:tcW w:w="3221" w:type="dxa"/>
+            <w:tcW w:w="2882" w:type="dxa"/>
             <w:vAlign w:val="top"/>
           </w:tcPr>
           <w:p>
@@ -7138,7 +7138,7 @@
         </w:tc>
         <w:tc>
           <w:tcPr>
-            <w:tcW w:w="2347" w:type="dxa"/>
+            <w:tcW w:w="2756" w:type="dxa"/>
             <w:vAlign w:val="top"/>
           </w:tcPr>
           <w:p>
@@ -7153,7 +7153,7 @@
         </w:tc>
         <w:tc>
           <w:tcPr>
-            <w:tcW w:w="3224" w:type="dxa"/>
+            <w:tcW w:w="2965" w:type="dxa"/>
             <w:vAlign w:val="top"/>
           </w:tcPr>
           <w:p>
@@ -7361,8 +7361,8 @@
         </w:tblCellMar>
       </w:tblPr>
       <w:tblGrid>
-        <w:gridCol w:w="5040"/>
-        <w:gridCol w:w="5040"/>
+        <w:gridCol w:w="4811"/>
+        <w:gridCol w:w="5269"/>
       </w:tblGrid>
       <w:tr>
         <w:trPr>
@@ -7370,7 +7370,7 @@
         </w:trPr>
         <w:tc>
           <w:tcPr>
-            <w:tcW w:w="5040" w:type="dxa"/>
+            <w:tcW w:w="4811" w:type="dxa"/>
             <w:shd w:val="clear" w:color="auto" w:fill="1B4A78"/>
             <w:vAlign w:val="top"/>
           </w:tcPr>
@@ -7389,7 +7389,7 @@
         </w:tc>
         <w:tc>
           <w:tcPr>
-            <w:tcW w:w="5040" w:type="dxa"/>
+            <w:tcW w:w="5269" w:type="dxa"/>
             <w:shd w:val="clear" w:color="auto" w:fill="1B4A78"/>
             <w:vAlign w:val="top"/>
           </w:tcPr>
@@ -7413,7 +7413,7 @@
         </w:trPr>
         <w:tc>
           <w:tcPr>
-            <w:tcW w:w="5040" w:type="dxa"/>
+            <w:tcW w:w="4811" w:type="dxa"/>
             <w:vAlign w:val="top"/>
           </w:tcPr>
           <w:p>
@@ -7434,7 +7434,7 @@
         </w:tc>
         <w:tc>
           <w:tcPr>
-            <w:tcW w:w="5040" w:type="dxa"/>
+            <w:tcW w:w="5269" w:type="dxa"/>
             <w:vAlign w:val="top"/>
           </w:tcPr>
           <w:p>
@@ -7460,7 +7460,7 @@
         </w:trPr>
         <w:tc>
           <w:tcPr>
-            <w:tcW w:w="5040" w:type="dxa"/>
+            <w:tcW w:w="4811" w:type="dxa"/>
             <w:vAlign w:val="top"/>
           </w:tcPr>
           <w:p>
@@ -7475,7 +7475,7 @@
         </w:tc>
         <w:tc>
           <w:tcPr>
-            <w:tcW w:w="5040" w:type="dxa"/>
+            <w:tcW w:w="5269" w:type="dxa"/>
             <w:vAlign w:val="top"/>
           </w:tcPr>
           <w:p>
@@ -7501,7 +7501,7 @@
         </w:trPr>
         <w:tc>
           <w:tcPr>
-            <w:tcW w:w="5040" w:type="dxa"/>
+            <w:tcW w:w="4811" w:type="dxa"/>
             <w:vAlign w:val="top"/>
           </w:tcPr>
           <w:p>
@@ -7522,7 +7522,7 @@
         </w:tc>
         <w:tc>
           <w:tcPr>
-            <w:tcW w:w="5040" w:type="dxa"/>
+            <w:tcW w:w="5269" w:type="dxa"/>
             <w:vAlign w:val="top"/>
           </w:tcPr>
           <w:p>
@@ -7548,7 +7548,7 @@
         </w:trPr>
         <w:tc>
           <w:tcPr>
-            <w:tcW w:w="5040" w:type="dxa"/>
+            <w:tcW w:w="4811" w:type="dxa"/>
             <w:vAlign w:val="top"/>
           </w:tcPr>
           <w:p>
@@ -7563,7 +7563,7 @@
         </w:tc>
         <w:tc>
           <w:tcPr>
-            <w:tcW w:w="5040" w:type="dxa"/>
+            <w:tcW w:w="5269" w:type="dxa"/>
             <w:vAlign w:val="top"/>
           </w:tcPr>
           <w:p>
@@ -7589,7 +7589,7 @@
         </w:trPr>
         <w:tc>
           <w:tcPr>
-            <w:tcW w:w="5040" w:type="dxa"/>
+            <w:tcW w:w="4811" w:type="dxa"/>
             <w:vAlign w:val="top"/>
           </w:tcPr>
           <w:p>
@@ -7604,7 +7604,7 @@
         </w:tc>
         <w:tc>
           <w:tcPr>
-            <w:tcW w:w="5040" w:type="dxa"/>
+            <w:tcW w:w="5269" w:type="dxa"/>
             <w:vAlign w:val="top"/>
           </w:tcPr>
           <w:p>
@@ -7674,7 +7674,7 @@
         </w:trPr>
         <w:tc>
           <w:tcPr>
-            <w:tcW w:w="5040" w:type="dxa"/>
+            <w:tcW w:w="4811" w:type="dxa"/>
             <w:vAlign w:val="top"/>
           </w:tcPr>
           <w:p>
@@ -7689,7 +7689,7 @@
         </w:tc>
         <w:tc>
           <w:tcPr>
-            <w:tcW w:w="5040" w:type="dxa"/>
+            <w:tcW w:w="5269" w:type="dxa"/>
             <w:vAlign w:val="top"/>
           </w:tcPr>
           <w:p>
@@ -7709,7 +7709,7 @@
         </w:trPr>
         <w:tc>
           <w:tcPr>
-            <w:tcW w:w="5040" w:type="dxa"/>
+            <w:tcW w:w="4811" w:type="dxa"/>
             <w:vAlign w:val="top"/>
           </w:tcPr>
           <w:p>
@@ -7724,7 +7724,7 @@
         </w:tc>
         <w:tc>
           <w:tcPr>
-            <w:tcW w:w="5040" w:type="dxa"/>
+            <w:tcW w:w="5269" w:type="dxa"/>
             <w:vAlign w:val="top"/>
           </w:tcPr>
           <w:p>
@@ -7831,8 +7831,8 @@
         </w:tblCellMar>
       </w:tblPr>
       <w:tblGrid>
-        <w:gridCol w:w="4150"/>
-        <w:gridCol w:w="5930"/>
+        <w:gridCol w:w="4007"/>
+        <w:gridCol w:w="6073"/>
       </w:tblGrid>
       <w:tr>
         <w:trPr>
@@ -7840,7 +7840,7 @@
         </w:trPr>
         <w:tc>
           <w:tcPr>
-            <w:tcW w:w="4150" w:type="dxa"/>
+            <w:tcW w:w="4007" w:type="dxa"/>
             <w:shd w:val="clear" w:color="auto" w:fill="1B4A78"/>
             <w:vAlign w:val="top"/>
           </w:tcPr>
@@ -7859,7 +7859,7 @@
         </w:tc>
         <w:tc>
           <w:tcPr>
-            <w:tcW w:w="5930" w:type="dxa"/>
+            <w:tcW w:w="6073" w:type="dxa"/>
             <w:shd w:val="clear" w:color="auto" w:fill="1B4A78"/>
             <w:vAlign w:val="top"/>
           </w:tcPr>
@@ -7883,7 +7883,7 @@
         </w:trPr>
         <w:tc>
           <w:tcPr>
-            <w:tcW w:w="4150" w:type="dxa"/>
+            <w:tcW w:w="4007" w:type="dxa"/>
             <w:vAlign w:val="top"/>
           </w:tcPr>
           <w:p>
@@ -7898,7 +7898,7 @@
         </w:tc>
         <w:tc>
           <w:tcPr>
-            <w:tcW w:w="5930" w:type="dxa"/>
+            <w:tcW w:w="6073" w:type="dxa"/>
             <w:vAlign w:val="top"/>
           </w:tcPr>
           <w:p>
@@ -7936,7 +7936,7 @@
         </w:trPr>
         <w:tc>
           <w:tcPr>
-            <w:tcW w:w="4150" w:type="dxa"/>
+            <w:tcW w:w="4007" w:type="dxa"/>
             <w:vAlign w:val="top"/>
           </w:tcPr>
           <w:p>
@@ -7951,7 +7951,7 @@
         </w:tc>
         <w:tc>
           <w:tcPr>
-            <w:tcW w:w="5930" w:type="dxa"/>
+            <w:tcW w:w="6073" w:type="dxa"/>
             <w:vAlign w:val="top"/>
           </w:tcPr>
           <w:p>
@@ -7971,7 +7971,7 @@
         </w:trPr>
         <w:tc>
           <w:tcPr>
-            <w:tcW w:w="4150" w:type="dxa"/>
+            <w:tcW w:w="4007" w:type="dxa"/>
             <w:vAlign w:val="top"/>
           </w:tcPr>
           <w:p>
@@ -7994,7 +7994,7 @@
         </w:tc>
         <w:tc>
           <w:tcPr>
-            <w:tcW w:w="5930" w:type="dxa"/>
+            <w:tcW w:w="6073" w:type="dxa"/>
             <w:vAlign w:val="top"/>
           </w:tcPr>
           <w:p>
@@ -8036,7 +8036,7 @@
         </w:trPr>
         <w:tc>
           <w:tcPr>
-            <w:tcW w:w="4150" w:type="dxa"/>
+            <w:tcW w:w="4007" w:type="dxa"/>
             <w:vAlign w:val="top"/>
           </w:tcPr>
           <w:p>
@@ -8051,7 +8051,7 @@
         </w:tc>
         <w:tc>
           <w:tcPr>
-            <w:tcW w:w="5930" w:type="dxa"/>
+            <w:tcW w:w="6073" w:type="dxa"/>
             <w:vAlign w:val="top"/>
           </w:tcPr>
           <w:p>
@@ -8071,7 +8071,7 @@
         </w:trPr>
         <w:tc>
           <w:tcPr>
-            <w:tcW w:w="4150" w:type="dxa"/>
+            <w:tcW w:w="4007" w:type="dxa"/>
             <w:vAlign w:val="top"/>
           </w:tcPr>
           <w:p>
@@ -8086,7 +8086,7 @@
         </w:tc>
         <w:tc>
           <w:tcPr>
-            <w:tcW w:w="5930" w:type="dxa"/>
+            <w:tcW w:w="6073" w:type="dxa"/>
             <w:vAlign w:val="top"/>
           </w:tcPr>
           <w:p>
@@ -8106,7 +8106,7 @@
         </w:trPr>
         <w:tc>
           <w:tcPr>
-            <w:tcW w:w="4150" w:type="dxa"/>
+            <w:tcW w:w="4007" w:type="dxa"/>
             <w:vAlign w:val="top"/>
           </w:tcPr>
           <w:p>
@@ -8123,7 +8123,7 @@
         </w:tc>
         <w:tc>
           <w:tcPr>
-            <w:tcW w:w="5930" w:type="dxa"/>
+            <w:tcW w:w="6073" w:type="dxa"/>
             <w:vAlign w:val="top"/>
           </w:tcPr>
           <w:p>
@@ -9305,9 +9305,9 @@
         </w:tblCellMar>
       </w:tblPr>
       <w:tblGrid>
-        <w:gridCol w:w="1969"/>
-        <w:gridCol w:w="4055"/>
-        <w:gridCol w:w="4056"/>
+        <w:gridCol w:w="2106"/>
+        <w:gridCol w:w="3986"/>
+        <w:gridCol w:w="3988"/>
       </w:tblGrid>
       <w:tr>
         <w:trPr>
@@ -9315,7 +9315,7 @@
         </w:trPr>
         <w:tc>
           <w:tcPr>
-            <w:tcW w:w="1969" w:type="dxa"/>
+            <w:tcW w:w="2106" w:type="dxa"/>
             <w:shd w:val="clear" w:color="auto" w:fill="1B4A78"/>
             <w:vAlign w:val="top"/>
           </w:tcPr>
@@ -9334,7 +9334,7 @@
         </w:tc>
         <w:tc>
           <w:tcPr>
-            <w:tcW w:w="4055" w:type="dxa"/>
+            <w:tcW w:w="3986" w:type="dxa"/>
             <w:shd w:val="clear" w:color="auto" w:fill="1B4A78"/>
             <w:vAlign w:val="top"/>
           </w:tcPr>
@@ -9353,7 +9353,7 @@
         </w:tc>
         <w:tc>
           <w:tcPr>
-            <w:tcW w:w="4056" w:type="dxa"/>
+            <w:tcW w:w="3988" w:type="dxa"/>
             <w:shd w:val="clear" w:color="auto" w:fill="1B4A78"/>
             <w:vAlign w:val="top"/>
           </w:tcPr>
@@ -9377,7 +9377,7 @@
         </w:trPr>
         <w:tc>
           <w:tcPr>
-            <w:tcW w:w="1969" w:type="dxa"/>
+            <w:tcW w:w="2106" w:type="dxa"/>
             <w:vAlign w:val="top"/>
           </w:tcPr>
           <w:p>
@@ -9394,7 +9394,7 @@
         </w:tc>
         <w:tc>
           <w:tcPr>
-            <w:tcW w:w="4055" w:type="dxa"/>
+            <w:tcW w:w="3986" w:type="dxa"/>
             <w:vAlign w:val="top"/>
           </w:tcPr>
           <w:p>
@@ -9426,7 +9426,7 @@
         </w:tc>
         <w:tc>
           <w:tcPr>
-            <w:tcW w:w="4056" w:type="dxa"/>
+            <w:tcW w:w="3988" w:type="dxa"/>
             <w:vAlign w:val="top"/>
           </w:tcPr>
           <w:p>
@@ -9452,7 +9452,7 @@
         </w:trPr>
         <w:tc>
           <w:tcPr>
-            <w:tcW w:w="1969" w:type="dxa"/>
+            <w:tcW w:w="2106" w:type="dxa"/>
             <w:vAlign w:val="top"/>
           </w:tcPr>
           <w:p>
@@ -9469,7 +9469,7 @@
         </w:tc>
         <w:tc>
           <w:tcPr>
-            <w:tcW w:w="4055" w:type="dxa"/>
+            <w:tcW w:w="3986" w:type="dxa"/>
             <w:vAlign w:val="top"/>
           </w:tcPr>
           <w:p>
@@ -9524,7 +9524,7 @@
         </w:tc>
         <w:tc>
           <w:tcPr>
-            <w:tcW w:w="4056" w:type="dxa"/>
+            <w:tcW w:w="3988" w:type="dxa"/>
             <w:vAlign w:val="top"/>
           </w:tcPr>
           <w:p>
@@ -9544,7 +9544,7 @@
         </w:trPr>
         <w:tc>
           <w:tcPr>
-            <w:tcW w:w="1969" w:type="dxa"/>
+            <w:tcW w:w="2106" w:type="dxa"/>
             <w:vAlign w:val="top"/>
           </w:tcPr>
           <w:p>
@@ -9561,7 +9561,7 @@
         </w:tc>
         <w:tc>
           <w:tcPr>
-            <w:tcW w:w="4055" w:type="dxa"/>
+            <w:tcW w:w="3986" w:type="dxa"/>
             <w:vAlign w:val="top"/>
           </w:tcPr>
           <w:p>
@@ -9586,7 +9586,7 @@
         </w:tc>
         <w:tc>
           <w:tcPr>
-            <w:tcW w:w="4056" w:type="dxa"/>
+            <w:tcW w:w="3988" w:type="dxa"/>
             <w:vAlign w:val="top"/>
           </w:tcPr>
           <w:p>
@@ -9656,10 +9656,10 @@
         </w:tblCellMar>
       </w:tblPr>
       <w:tblGrid>
-        <w:gridCol w:w="369"/>
-        <w:gridCol w:w="3236"/>
-        <w:gridCol w:w="3236"/>
-        <w:gridCol w:w="3239"/>
+        <w:gridCol w:w="1080"/>
+        <w:gridCol w:w="2805"/>
+        <w:gridCol w:w="3138"/>
+        <w:gridCol w:w="3057"/>
       </w:tblGrid>
       <w:tr>
         <w:trPr>
@@ -9667,7 +9667,7 @@
         </w:trPr>
         <w:tc>
           <w:tcPr>
-            <w:tcW w:w="369" w:type="dxa"/>
+            <w:tcW w:w="1080" w:type="dxa"/>
             <w:shd w:val="clear" w:color="auto" w:fill="1B4A78"/>
             <w:vAlign w:val="top"/>
           </w:tcPr>
@@ -9686,7 +9686,7 @@
         </w:tc>
         <w:tc>
           <w:tcPr>
-            <w:tcW w:w="3236" w:type="dxa"/>
+            <w:tcW w:w="2805" w:type="dxa"/>
             <w:shd w:val="clear" w:color="auto" w:fill="1B4A78"/>
             <w:vAlign w:val="top"/>
           </w:tcPr>
@@ -9705,7 +9705,7 @@
         </w:tc>
         <w:tc>
           <w:tcPr>
-            <w:tcW w:w="3236" w:type="dxa"/>
+            <w:tcW w:w="3138" w:type="dxa"/>
             <w:shd w:val="clear" w:color="auto" w:fill="1B4A78"/>
             <w:vAlign w:val="top"/>
           </w:tcPr>
@@ -9724,7 +9724,7 @@
         </w:tc>
         <w:tc>
           <w:tcPr>
-            <w:tcW w:w="3239" w:type="dxa"/>
+            <w:tcW w:w="3057" w:type="dxa"/>
             <w:shd w:val="clear" w:color="auto" w:fill="1B4A78"/>
             <w:vAlign w:val="top"/>
           </w:tcPr>
@@ -9748,7 +9748,7 @@
         </w:trPr>
         <w:tc>
           <w:tcPr>
-            <w:tcW w:w="369" w:type="dxa"/>
+            <w:tcW w:w="1080" w:type="dxa"/>
             <w:vAlign w:val="top"/>
           </w:tcPr>
           <w:p>
@@ -9765,7 +9765,7 @@
         </w:tc>
         <w:tc>
           <w:tcPr>
-            <w:tcW w:w="3236" w:type="dxa"/>
+            <w:tcW w:w="2805" w:type="dxa"/>
             <w:vAlign w:val="top"/>
           </w:tcPr>
           <w:p>
@@ -9790,7 +9790,7 @@
         </w:tc>
         <w:tc>
           <w:tcPr>
-            <w:tcW w:w="3236" w:type="dxa"/>
+            <w:tcW w:w="3138" w:type="dxa"/>
             <w:vAlign w:val="top"/>
           </w:tcPr>
           <w:p>
@@ -9805,7 +9805,7 @@
         </w:tc>
         <w:tc>
           <w:tcPr>
-            <w:tcW w:w="3239" w:type="dxa"/>
+            <w:tcW w:w="3057" w:type="dxa"/>
             <w:vAlign w:val="top"/>
           </w:tcPr>
           <w:p>
@@ -9825,7 +9825,7 @@
         </w:trPr>
         <w:tc>
           <w:tcPr>
-            <w:tcW w:w="369" w:type="dxa"/>
+            <w:tcW w:w="1080" w:type="dxa"/>
             <w:vAlign w:val="top"/>
           </w:tcPr>
           <w:p>
@@ -9842,7 +9842,7 @@
         </w:tc>
         <w:tc>
           <w:tcPr>
-            <w:tcW w:w="3236" w:type="dxa"/>
+            <w:tcW w:w="2805" w:type="dxa"/>
             <w:vAlign w:val="top"/>
           </w:tcPr>
           <w:p>
@@ -9857,7 +9857,7 @@
         </w:tc>
         <w:tc>
           <w:tcPr>
-            <w:tcW w:w="3236" w:type="dxa"/>
+            <w:tcW w:w="3138" w:type="dxa"/>
             <w:vAlign w:val="top"/>
           </w:tcPr>
           <w:p>
@@ -9882,7 +9882,7 @@
         </w:tc>
         <w:tc>
           <w:tcPr>
-            <w:tcW w:w="3239" w:type="dxa"/>
+            <w:tcW w:w="3057" w:type="dxa"/>
             <w:vAlign w:val="top"/>
           </w:tcPr>
           <w:p>
@@ -9902,7 +9902,7 @@
         </w:trPr>
         <w:tc>
           <w:tcPr>
-            <w:tcW w:w="369" w:type="dxa"/>
+            <w:tcW w:w="1080" w:type="dxa"/>
             <w:vAlign w:val="top"/>
           </w:tcPr>
           <w:p>
@@ -9919,7 +9919,7 @@
         </w:tc>
         <w:tc>
           <w:tcPr>
-            <w:tcW w:w="3236" w:type="dxa"/>
+            <w:tcW w:w="2805" w:type="dxa"/>
             <w:vAlign w:val="top"/>
           </w:tcPr>
           <w:p>
@@ -9934,7 +9934,7 @@
         </w:tc>
         <w:tc>
           <w:tcPr>
-            <w:tcW w:w="3236" w:type="dxa"/>
+            <w:tcW w:w="3138" w:type="dxa"/>
             <w:vAlign w:val="top"/>
           </w:tcPr>
           <w:p>
@@ -9955,7 +9955,7 @@
         </w:tc>
         <w:tc>
           <w:tcPr>
-            <w:tcW w:w="3239" w:type="dxa"/>
+            <w:tcW w:w="3057" w:type="dxa"/>
             <w:vAlign w:val="top"/>
           </w:tcPr>
           <w:p>
@@ -9975,7 +9975,7 @@
         </w:trPr>
         <w:tc>
           <w:tcPr>
-            <w:tcW w:w="369" w:type="dxa"/>
+            <w:tcW w:w="1080" w:type="dxa"/>
             <w:vAlign w:val="top"/>
           </w:tcPr>
           <w:p>
@@ -9992,7 +9992,7 @@
         </w:tc>
         <w:tc>
           <w:tcPr>
-            <w:tcW w:w="3236" w:type="dxa"/>
+            <w:tcW w:w="2805" w:type="dxa"/>
             <w:vAlign w:val="top"/>
           </w:tcPr>
           <w:p>
@@ -10029,7 +10029,7 @@
         </w:tc>
         <w:tc>
           <w:tcPr>
-            <w:tcW w:w="3236" w:type="dxa"/>
+            <w:tcW w:w="3138" w:type="dxa"/>
             <w:vAlign w:val="top"/>
           </w:tcPr>
           <w:p>
@@ -10068,7 +10068,7 @@
         </w:tc>
         <w:tc>
           <w:tcPr>
-            <w:tcW w:w="3239" w:type="dxa"/>
+            <w:tcW w:w="3057" w:type="dxa"/>
             <w:vAlign w:val="top"/>
           </w:tcPr>
           <w:p>
@@ -10096,7 +10096,7 @@
         </w:trPr>
         <w:tc>
           <w:tcPr>
-            <w:tcW w:w="369" w:type="dxa"/>
+            <w:tcW w:w="1080" w:type="dxa"/>
             <w:vAlign w:val="top"/>
           </w:tcPr>
           <w:p>
@@ -10113,7 +10113,7 @@
         </w:tc>
         <w:tc>
           <w:tcPr>
-            <w:tcW w:w="3236" w:type="dxa"/>
+            <w:tcW w:w="2805" w:type="dxa"/>
             <w:vAlign w:val="top"/>
           </w:tcPr>
           <w:p>
@@ -10150,7 +10150,7 @@
         </w:tc>
         <w:tc>
           <w:tcPr>
-            <w:tcW w:w="3236" w:type="dxa"/>
+            <w:tcW w:w="3138" w:type="dxa"/>
             <w:vAlign w:val="top"/>
           </w:tcPr>
           <w:p>
@@ -10175,7 +10175,7 @@
         </w:tc>
         <w:tc>
           <w:tcPr>
-            <w:tcW w:w="3239" w:type="dxa"/>
+            <w:tcW w:w="3057" w:type="dxa"/>
             <w:vAlign w:val="top"/>
           </w:tcPr>
           <w:p>
@@ -10195,7 +10195,7 @@
         </w:trPr>
         <w:tc>
           <w:tcPr>
-            <w:tcW w:w="369" w:type="dxa"/>
+            <w:tcW w:w="1080" w:type="dxa"/>
             <w:vAlign w:val="top"/>
           </w:tcPr>
           <w:p>
@@ -10212,7 +10212,7 @@
         </w:tc>
         <w:tc>
           <w:tcPr>
-            <w:tcW w:w="3236" w:type="dxa"/>
+            <w:tcW w:w="2805" w:type="dxa"/>
             <w:vAlign w:val="top"/>
           </w:tcPr>
           <w:p>
@@ -10227,7 +10227,7 @@
         </w:tc>
         <w:tc>
           <w:tcPr>
-            <w:tcW w:w="3236" w:type="dxa"/>
+            <w:tcW w:w="3138" w:type="dxa"/>
             <w:vAlign w:val="top"/>
           </w:tcPr>
           <w:p>
@@ -10248,7 +10248,7 @@
         </w:tc>
         <w:tc>
           <w:tcPr>
-            <w:tcW w:w="3239" w:type="dxa"/>
+            <w:tcW w:w="3057" w:type="dxa"/>
             <w:vAlign w:val="top"/>
           </w:tcPr>
           <w:p>
@@ -10429,8 +10429,8 @@
         </w:tblCellMar>
       </w:tblPr>
       <w:tblGrid>
-        <w:gridCol w:w="3890"/>
-        <w:gridCol w:w="6190"/>
+        <w:gridCol w:w="4033"/>
+        <w:gridCol w:w="6047"/>
       </w:tblGrid>
       <w:tr>
         <w:trPr>
@@ -10438,7 +10438,7 @@
         </w:trPr>
         <w:tc>
           <w:tcPr>
-            <w:tcW w:w="3890" w:type="dxa"/>
+            <w:tcW w:w="4033" w:type="dxa"/>
             <w:shd w:val="clear" w:color="auto" w:fill="1B4A78"/>
             <w:vAlign w:val="top"/>
           </w:tcPr>
@@ -10457,7 +10457,7 @@
         </w:tc>
         <w:tc>
           <w:tcPr>
-            <w:tcW w:w="6190" w:type="dxa"/>
+            <w:tcW w:w="6047" w:type="dxa"/>
             <w:shd w:val="clear" w:color="auto" w:fill="1B4A78"/>
             <w:vAlign w:val="top"/>
           </w:tcPr>
@@ -10481,7 +10481,7 @@
         </w:trPr>
         <w:tc>
           <w:tcPr>
-            <w:tcW w:w="3890" w:type="dxa"/>
+            <w:tcW w:w="4033" w:type="dxa"/>
             <w:vAlign w:val="top"/>
           </w:tcPr>
           <w:p>
@@ -10496,7 +10496,7 @@
         </w:tc>
         <w:tc>
           <w:tcPr>
-            <w:tcW w:w="6190" w:type="dxa"/>
+            <w:tcW w:w="6047" w:type="dxa"/>
             <w:vAlign w:val="top"/>
           </w:tcPr>
           <w:p>
@@ -10522,7 +10522,7 @@
         </w:trPr>
         <w:tc>
           <w:tcPr>
-            <w:tcW w:w="3890" w:type="dxa"/>
+            <w:tcW w:w="4033" w:type="dxa"/>
             <w:vAlign w:val="top"/>
           </w:tcPr>
           <w:p>
@@ -10545,7 +10545,7 @@
         </w:tc>
         <w:tc>
           <w:tcPr>
-            <w:tcW w:w="6190" w:type="dxa"/>
+            <w:tcW w:w="6047" w:type="dxa"/>
             <w:vAlign w:val="top"/>
           </w:tcPr>
           <w:p>
@@ -10581,7 +10581,7 @@
         </w:trPr>
         <w:tc>
           <w:tcPr>
-            <w:tcW w:w="3890" w:type="dxa"/>
+            <w:tcW w:w="4033" w:type="dxa"/>
             <w:vAlign w:val="top"/>
           </w:tcPr>
           <w:p>
@@ -10596,7 +10596,7 @@
         </w:tc>
         <w:tc>
           <w:tcPr>
-            <w:tcW w:w="6190" w:type="dxa"/>
+            <w:tcW w:w="6047" w:type="dxa"/>
             <w:vAlign w:val="top"/>
           </w:tcPr>
           <w:p>
@@ -10616,7 +10616,7 @@
         </w:trPr>
         <w:tc>
           <w:tcPr>
-            <w:tcW w:w="3890" w:type="dxa"/>
+            <w:tcW w:w="4033" w:type="dxa"/>
             <w:vAlign w:val="top"/>
           </w:tcPr>
           <w:p>
@@ -10631,7 +10631,7 @@
         </w:tc>
         <w:tc>
           <w:tcPr>
-            <w:tcW w:w="6190" w:type="dxa"/>
+            <w:tcW w:w="6047" w:type="dxa"/>
             <w:vAlign w:val="top"/>
           </w:tcPr>
           <w:p>
@@ -10651,7 +10651,7 @@
         </w:trPr>
         <w:tc>
           <w:tcPr>
-            <w:tcW w:w="3890" w:type="dxa"/>
+            <w:tcW w:w="4033" w:type="dxa"/>
             <w:vAlign w:val="top"/>
           </w:tcPr>
           <w:p>
@@ -10666,7 +10666,7 @@
         </w:tc>
         <w:tc>
           <w:tcPr>
-            <w:tcW w:w="6190" w:type="dxa"/>
+            <w:tcW w:w="6047" w:type="dxa"/>
             <w:vAlign w:val="top"/>
           </w:tcPr>
           <w:p>
@@ -10692,7 +10692,7 @@
         </w:trPr>
         <w:tc>
           <w:tcPr>
-            <w:tcW w:w="3890" w:type="dxa"/>
+            <w:tcW w:w="4033" w:type="dxa"/>
             <w:vAlign w:val="top"/>
           </w:tcPr>
           <w:p>
@@ -10707,7 +10707,7 @@
         </w:tc>
         <w:tc>
           <w:tcPr>
-            <w:tcW w:w="6190" w:type="dxa"/>
+            <w:tcW w:w="6047" w:type="dxa"/>
             <w:vAlign w:val="top"/>
           </w:tcPr>
           <w:p>
@@ -10727,7 +10727,7 @@
         </w:trPr>
         <w:tc>
           <w:tcPr>
-            <w:tcW w:w="3890" w:type="dxa"/>
+            <w:tcW w:w="4033" w:type="dxa"/>
             <w:vAlign w:val="top"/>
           </w:tcPr>
           <w:p>
@@ -10742,7 +10742,7 @@
         </w:tc>
         <w:tc>
           <w:tcPr>
-            <w:tcW w:w="6190" w:type="dxa"/>
+            <w:tcW w:w="6047" w:type="dxa"/>
             <w:vAlign w:val="top"/>
           </w:tcPr>
           <w:p>
@@ -11067,9 +11067,9 @@
         </w:tblCellMar>
       </w:tblPr>
       <w:tblGrid>
-        <w:gridCol w:w="1260"/>
-        <w:gridCol w:w="4410"/>
-        <w:gridCol w:w="4410"/>
+        <w:gridCol w:w="1550"/>
+        <w:gridCol w:w="4166"/>
+        <w:gridCol w:w="4364"/>
       </w:tblGrid>
       <w:tr>
         <w:trPr>
@@ -11077,7 +11077,7 @@
         </w:trPr>
         <w:tc>
           <w:tcPr>
-            <w:tcW w:w="1260" w:type="dxa"/>
+            <w:tcW w:w="1550" w:type="dxa"/>
             <w:shd w:val="clear" w:color="auto" w:fill="1B4A78"/>
             <w:vAlign w:val="top"/>
           </w:tcPr>
@@ -11096,7 +11096,7 @@
         </w:tc>
         <w:tc>
           <w:tcPr>
-            <w:tcW w:w="4410" w:type="dxa"/>
+            <w:tcW w:w="4166" w:type="dxa"/>
             <w:shd w:val="clear" w:color="auto" w:fill="1B4A78"/>
             <w:vAlign w:val="top"/>
           </w:tcPr>
@@ -11115,7 +11115,7 @@
         </w:tc>
         <w:tc>
           <w:tcPr>
-            <w:tcW w:w="4410" w:type="dxa"/>
+            <w:tcW w:w="4364" w:type="dxa"/>
             <w:shd w:val="clear" w:color="auto" w:fill="1B4A78"/>
             <w:vAlign w:val="top"/>
           </w:tcPr>
@@ -11139,7 +11139,7 @@
         </w:trPr>
         <w:tc>
           <w:tcPr>
-            <w:tcW w:w="1260" w:type="dxa"/>
+            <w:tcW w:w="1550" w:type="dxa"/>
             <w:vAlign w:val="top"/>
           </w:tcPr>
           <w:p>
@@ -11156,7 +11156,7 @@
         </w:tc>
         <w:tc>
           <w:tcPr>
-            <w:tcW w:w="4410" w:type="dxa"/>
+            <w:tcW w:w="4166" w:type="dxa"/>
             <w:vAlign w:val="top"/>
           </w:tcPr>
           <w:p>
@@ -11171,7 +11171,7 @@
         </w:tc>
         <w:tc>
           <w:tcPr>
-            <w:tcW w:w="4410" w:type="dxa"/>
+            <w:tcW w:w="4364" w:type="dxa"/>
             <w:vAlign w:val="top"/>
           </w:tcPr>
           <w:p>
@@ -11201,7 +11201,7 @@
         </w:trPr>
         <w:tc>
           <w:tcPr>
-            <w:tcW w:w="1260" w:type="dxa"/>
+            <w:tcW w:w="1550" w:type="dxa"/>
             <w:vAlign w:val="top"/>
           </w:tcPr>
           <w:p>
@@ -11218,7 +11218,7 @@
         </w:tc>
         <w:tc>
           <w:tcPr>
-            <w:tcW w:w="4410" w:type="dxa"/>
+            <w:tcW w:w="4166" w:type="dxa"/>
             <w:vAlign w:val="top"/>
           </w:tcPr>
           <w:p>
@@ -11269,7 +11269,7 @@
         </w:tc>
         <w:tc>
           <w:tcPr>
-            <w:tcW w:w="4410" w:type="dxa"/>
+            <w:tcW w:w="4364" w:type="dxa"/>
             <w:vAlign w:val="top"/>
           </w:tcPr>
           <w:p>
@@ -11289,7 +11289,7 @@
         </w:trPr>
         <w:tc>
           <w:tcPr>
-            <w:tcW w:w="1260" w:type="dxa"/>
+            <w:tcW w:w="1550" w:type="dxa"/>
             <w:vAlign w:val="top"/>
           </w:tcPr>
           <w:p>
@@ -11306,7 +11306,7 @@
         </w:tc>
         <w:tc>
           <w:tcPr>
-            <w:tcW w:w="4410" w:type="dxa"/>
+            <w:tcW w:w="4166" w:type="dxa"/>
             <w:vAlign w:val="top"/>
           </w:tcPr>
           <w:p>
@@ -11353,7 +11353,7 @@
         </w:tc>
         <w:tc>
           <w:tcPr>
-            <w:tcW w:w="4410" w:type="dxa"/>
+            <w:tcW w:w="4364" w:type="dxa"/>
             <w:vAlign w:val="top"/>
           </w:tcPr>
           <w:p>
@@ -11373,7 +11373,7 @@
         </w:trPr>
         <w:tc>
           <w:tcPr>
-            <w:tcW w:w="1260" w:type="dxa"/>
+            <w:tcW w:w="1550" w:type="dxa"/>
             <w:vAlign w:val="top"/>
           </w:tcPr>
           <w:p>
@@ -11390,7 +11390,7 @@
         </w:tc>
         <w:tc>
           <w:tcPr>
-            <w:tcW w:w="4410" w:type="dxa"/>
+            <w:tcW w:w="4166" w:type="dxa"/>
             <w:vAlign w:val="top"/>
           </w:tcPr>
           <w:p>
@@ -11449,7 +11449,7 @@
         </w:tc>
         <w:tc>
           <w:tcPr>
-            <w:tcW w:w="4410" w:type="dxa"/>
+            <w:tcW w:w="4364" w:type="dxa"/>
             <w:vAlign w:val="top"/>
           </w:tcPr>
           <w:p>
@@ -11535,9 +11535,9 @@
         </w:tblCellMar>
       </w:tblPr>
       <w:tblGrid>
-        <w:gridCol w:w="1294"/>
-        <w:gridCol w:w="4018"/>
-        <w:gridCol w:w="4768"/>
+        <w:gridCol w:w="1546"/>
+        <w:gridCol w:w="3623"/>
+        <w:gridCol w:w="4911"/>
       </w:tblGrid>
       <w:tr>
         <w:trPr>
@@ -11545,7 +11545,7 @@
         </w:trPr>
         <w:tc>
           <w:tcPr>
-            <w:tcW w:w="1294" w:type="dxa"/>
+            <w:tcW w:w="1546" w:type="dxa"/>
             <w:shd w:val="clear" w:color="auto" w:fill="1B4A78"/>
             <w:vAlign w:val="top"/>
           </w:tcPr>
@@ -11564,7 +11564,7 @@
         </w:tc>
         <w:tc>
           <w:tcPr>
-            <w:tcW w:w="4018" w:type="dxa"/>
+            <w:tcW w:w="3623" w:type="dxa"/>
             <w:shd w:val="clear" w:color="auto" w:fill="1B4A78"/>
             <w:vAlign w:val="top"/>
           </w:tcPr>
@@ -11590,7 +11590,7 @@
         </w:tc>
         <w:tc>
           <w:tcPr>
-            <w:tcW w:w="4768" w:type="dxa"/>
+            <w:tcW w:w="4911" w:type="dxa"/>
             <w:shd w:val="clear" w:color="auto" w:fill="1B4A78"/>
             <w:vAlign w:val="top"/>
           </w:tcPr>
@@ -11614,7 +11614,7 @@
         </w:trPr>
         <w:tc>
           <w:tcPr>
-            <w:tcW w:w="1294" w:type="dxa"/>
+            <w:tcW w:w="1546" w:type="dxa"/>
             <w:vAlign w:val="top"/>
           </w:tcPr>
           <w:p>
@@ -11631,7 +11631,7 @@
         </w:tc>
         <w:tc>
           <w:tcPr>
-            <w:tcW w:w="4018" w:type="dxa"/>
+            <w:tcW w:w="3623" w:type="dxa"/>
             <w:vAlign w:val="top"/>
           </w:tcPr>
           <w:p>
@@ -11648,7 +11648,7 @@
         </w:tc>
         <w:tc>
           <w:tcPr>
-            <w:tcW w:w="4768" w:type="dxa"/>
+            <w:tcW w:w="4911" w:type="dxa"/>
             <w:vAlign w:val="top"/>
           </w:tcPr>
           <w:p>
@@ -11668,7 +11668,7 @@
         </w:trPr>
         <w:tc>
           <w:tcPr>
-            <w:tcW w:w="1294" w:type="dxa"/>
+            <w:tcW w:w="1546" w:type="dxa"/>
             <w:vAlign w:val="top"/>
           </w:tcPr>
           <w:p>
@@ -11685,7 +11685,7 @@
         </w:tc>
         <w:tc>
           <w:tcPr>
-            <w:tcW w:w="4018" w:type="dxa"/>
+            <w:tcW w:w="3623" w:type="dxa"/>
             <w:vAlign w:val="top"/>
           </w:tcPr>
           <w:p>
@@ -11702,7 +11702,7 @@
         </w:tc>
         <w:tc>
           <w:tcPr>
-            <w:tcW w:w="4768" w:type="dxa"/>
+            <w:tcW w:w="4911" w:type="dxa"/>
             <w:vAlign w:val="top"/>
           </w:tcPr>
           <w:p>
@@ -11752,7 +11752,7 @@
         </w:trPr>
         <w:tc>
           <w:tcPr>
-            <w:tcW w:w="1294" w:type="dxa"/>
+            <w:tcW w:w="1546" w:type="dxa"/>
             <w:vAlign w:val="top"/>
           </w:tcPr>
           <w:p>
@@ -11769,7 +11769,7 @@
         </w:tc>
         <w:tc>
           <w:tcPr>
-            <w:tcW w:w="4018" w:type="dxa"/>
+            <w:tcW w:w="3623" w:type="dxa"/>
             <w:vAlign w:val="top"/>
           </w:tcPr>
           <w:p>
@@ -11790,7 +11790,7 @@
         </w:tc>
         <w:tc>
           <w:tcPr>
-            <w:tcW w:w="4768" w:type="dxa"/>
+            <w:tcW w:w="4911" w:type="dxa"/>
             <w:vAlign w:val="top"/>
           </w:tcPr>
           <w:p>
@@ -11810,7 +11810,7 @@
         </w:trPr>
         <w:tc>
           <w:tcPr>
-            <w:tcW w:w="1294" w:type="dxa"/>
+            <w:tcW w:w="1546" w:type="dxa"/>
             <w:vAlign w:val="top"/>
           </w:tcPr>
           <w:p>
@@ -11827,7 +11827,7 @@
         </w:tc>
         <w:tc>
           <w:tcPr>
-            <w:tcW w:w="4018" w:type="dxa"/>
+            <w:tcW w:w="3623" w:type="dxa"/>
             <w:vAlign w:val="top"/>
           </w:tcPr>
           <w:p>
@@ -11848,7 +11848,7 @@
         </w:tc>
         <w:tc>
           <w:tcPr>
-            <w:tcW w:w="4768" w:type="dxa"/>
+            <w:tcW w:w="4911" w:type="dxa"/>
             <w:vAlign w:val="top"/>
           </w:tcPr>
           <w:p>
@@ -11868,7 +11868,7 @@
         </w:trPr>
         <w:tc>
           <w:tcPr>
-            <w:tcW w:w="1294" w:type="dxa"/>
+            <w:tcW w:w="1546" w:type="dxa"/>
             <w:vAlign w:val="top"/>
           </w:tcPr>
           <w:p>
@@ -11885,7 +11885,7 @@
         </w:tc>
         <w:tc>
           <w:tcPr>
-            <w:tcW w:w="4018" w:type="dxa"/>
+            <w:tcW w:w="3623" w:type="dxa"/>
             <w:vAlign w:val="top"/>
           </w:tcPr>
           <w:p>
@@ -11902,7 +11902,7 @@
         </w:tc>
         <w:tc>
           <w:tcPr>
-            <w:tcW w:w="4768" w:type="dxa"/>
+            <w:tcW w:w="4911" w:type="dxa"/>
             <w:vAlign w:val="top"/>
           </w:tcPr>
           <w:p>
@@ -12053,10 +12053,10 @@
         </w:tblCellMar>
       </w:tblPr>
       <w:tblGrid>
-        <w:gridCol w:w="2163"/>
-        <w:gridCol w:w="1032"/>
-        <w:gridCol w:w="3441"/>
-        <w:gridCol w:w="3444"/>
+        <w:gridCol w:w="2244"/>
+        <w:gridCol w:w="1414"/>
+        <w:gridCol w:w="3329"/>
+        <w:gridCol w:w="3093"/>
       </w:tblGrid>
       <w:tr>
         <w:trPr>
@@ -12064,7 +12064,7 @@
         </w:trPr>
         <w:tc>
           <w:tcPr>
-            <w:tcW w:w="2163" w:type="dxa"/>
+            <w:tcW w:w="2244" w:type="dxa"/>
             <w:shd w:val="clear" w:color="auto" w:fill="1B4A78"/>
             <w:vAlign w:val="top"/>
           </w:tcPr>
@@ -12083,7 +12083,7 @@
         </w:tc>
         <w:tc>
           <w:tcPr>
-            <w:tcW w:w="1032" w:type="dxa"/>
+            <w:tcW w:w="1414" w:type="dxa"/>
             <w:shd w:val="clear" w:color="auto" w:fill="1B4A78"/>
             <w:vAlign w:val="top"/>
           </w:tcPr>
@@ -12102,7 +12102,7 @@
         </w:tc>
         <w:tc>
           <w:tcPr>
-            <w:tcW w:w="3441" w:type="dxa"/>
+            <w:tcW w:w="3329" w:type="dxa"/>
             <w:shd w:val="clear" w:color="auto" w:fill="1B4A78"/>
             <w:vAlign w:val="top"/>
           </w:tcPr>
@@ -12121,7 +12121,7 @@
         </w:tc>
         <w:tc>
           <w:tcPr>
-            <w:tcW w:w="3444" w:type="dxa"/>
+            <w:tcW w:w="3093" w:type="dxa"/>
             <w:shd w:val="clear" w:color="auto" w:fill="1B4A78"/>
             <w:vAlign w:val="top"/>
           </w:tcPr>
@@ -12145,7 +12145,7 @@
         </w:trPr>
         <w:tc>
           <w:tcPr>
-            <w:tcW w:w="2163" w:type="dxa"/>
+            <w:tcW w:w="2244" w:type="dxa"/>
             <w:vAlign w:val="top"/>
           </w:tcPr>
           <w:p>
@@ -12162,7 +12162,7 @@
         </w:tc>
         <w:tc>
           <w:tcPr>
-            <w:tcW w:w="1032" w:type="dxa"/>
+            <w:tcW w:w="1414" w:type="dxa"/>
             <w:vAlign w:val="top"/>
           </w:tcPr>
           <w:p>
@@ -12177,7 +12177,7 @@
         </w:tc>
         <w:tc>
           <w:tcPr>
-            <w:tcW w:w="3441" w:type="dxa"/>
+            <w:tcW w:w="3329" w:type="dxa"/>
             <w:vAlign w:val="top"/>
           </w:tcPr>
           <w:p>
@@ -12192,7 +12192,7 @@
         </w:tc>
         <w:tc>
           <w:tcPr>
-            <w:tcW w:w="3444" w:type="dxa"/>
+            <w:tcW w:w="3093" w:type="dxa"/>
             <w:vAlign w:val="top"/>
           </w:tcPr>
           <w:p>
@@ -12218,7 +12218,7 @@
         </w:trPr>
         <w:tc>
           <w:tcPr>
-            <w:tcW w:w="2163" w:type="dxa"/>
+            <w:tcW w:w="2244" w:type="dxa"/>
             <w:vAlign w:val="top"/>
           </w:tcPr>
           <w:p>
@@ -12235,7 +12235,7 @@
         </w:tc>
         <w:tc>
           <w:tcPr>
-            <w:tcW w:w="1032" w:type="dxa"/>
+            <w:tcW w:w="1414" w:type="dxa"/>
             <w:vAlign w:val="top"/>
           </w:tcPr>
           <w:p>
@@ -12250,7 +12250,7 @@
         </w:tc>
         <w:tc>
           <w:tcPr>
-            <w:tcW w:w="3441" w:type="dxa"/>
+            <w:tcW w:w="3329" w:type="dxa"/>
             <w:vAlign w:val="top"/>
           </w:tcPr>
           <w:p>
@@ -12265,7 +12265,7 @@
         </w:tc>
         <w:tc>
           <w:tcPr>
-            <w:tcW w:w="3444" w:type="dxa"/>
+            <w:tcW w:w="3093" w:type="dxa"/>
             <w:vAlign w:val="top"/>
           </w:tcPr>
           <w:p>
@@ -12297,7 +12297,7 @@
         </w:trPr>
         <w:tc>
           <w:tcPr>
-            <w:tcW w:w="2163" w:type="dxa"/>
+            <w:tcW w:w="2244" w:type="dxa"/>
             <w:vAlign w:val="top"/>
           </w:tcPr>
           <w:p>
@@ -12318,7 +12318,7 @@
         </w:tc>
         <w:tc>
           <w:tcPr>
-            <w:tcW w:w="1032" w:type="dxa"/>
+            <w:tcW w:w="1414" w:type="dxa"/>
             <w:vAlign w:val="top"/>
           </w:tcPr>
           <w:p>
@@ -12333,7 +12333,7 @@
         </w:tc>
         <w:tc>
           <w:tcPr>
-            <w:tcW w:w="3441" w:type="dxa"/>
+            <w:tcW w:w="3329" w:type="dxa"/>
             <w:vAlign w:val="top"/>
           </w:tcPr>
           <w:p>
@@ -12348,7 +12348,7 @@
         </w:tc>
         <w:tc>
           <w:tcPr>
-            <w:tcW w:w="3444" w:type="dxa"/>
+            <w:tcW w:w="3093" w:type="dxa"/>
             <w:vAlign w:val="top"/>
           </w:tcPr>
           <w:p>
@@ -12388,7 +12388,7 @@
         </w:trPr>
         <w:tc>
           <w:tcPr>
-            <w:tcW w:w="2163" w:type="dxa"/>
+            <w:tcW w:w="2244" w:type="dxa"/>
             <w:vAlign w:val="top"/>
           </w:tcPr>
           <w:p>
@@ -12405,7 +12405,7 @@
         </w:tc>
         <w:tc>
           <w:tcPr>
-            <w:tcW w:w="1032" w:type="dxa"/>
+            <w:tcW w:w="1414" w:type="dxa"/>
             <w:vAlign w:val="top"/>
           </w:tcPr>
           <w:p>
@@ -12420,7 +12420,7 @@
         </w:tc>
         <w:tc>
           <w:tcPr>
-            <w:tcW w:w="3441" w:type="dxa"/>
+            <w:tcW w:w="3329" w:type="dxa"/>
             <w:vAlign w:val="top"/>
           </w:tcPr>
           <w:p>
@@ -12447,7 +12447,7 @@
         </w:tc>
         <w:tc>
           <w:tcPr>
-            <w:tcW w:w="3444" w:type="dxa"/>
+            <w:tcW w:w="3093" w:type="dxa"/>
             <w:vAlign w:val="top"/>
           </w:tcPr>
           <w:p>
@@ -12477,7 +12477,7 @@
         </w:trPr>
         <w:tc>
           <w:tcPr>
-            <w:tcW w:w="2163" w:type="dxa"/>
+            <w:tcW w:w="2244" w:type="dxa"/>
             <w:vAlign w:val="top"/>
           </w:tcPr>
           <w:p>
@@ -12494,7 +12494,7 @@
         </w:tc>
         <w:tc>
           <w:tcPr>
-            <w:tcW w:w="1032" w:type="dxa"/>
+            <w:tcW w:w="1414" w:type="dxa"/>
             <w:vAlign w:val="top"/>
           </w:tcPr>
           <w:p>
@@ -12509,7 +12509,7 @@
         </w:tc>
         <w:tc>
           <w:tcPr>
-            <w:tcW w:w="3441" w:type="dxa"/>
+            <w:tcW w:w="3329" w:type="dxa"/>
             <w:vAlign w:val="top"/>
           </w:tcPr>
           <w:p>
@@ -12524,7 +12524,7 @@
         </w:tc>
         <w:tc>
           <w:tcPr>
-            <w:tcW w:w="3444" w:type="dxa"/>
+            <w:tcW w:w="3093" w:type="dxa"/>
             <w:vAlign w:val="top"/>
           </w:tcPr>
           <w:p>
@@ -12550,7 +12550,7 @@
         </w:trPr>
         <w:tc>
           <w:tcPr>
-            <w:tcW w:w="2163" w:type="dxa"/>
+            <w:tcW w:w="2244" w:type="dxa"/>
             <w:vAlign w:val="top"/>
           </w:tcPr>
           <w:p>
@@ -12571,7 +12571,7 @@
         </w:tc>
         <w:tc>
           <w:tcPr>
-            <w:tcW w:w="1032" w:type="dxa"/>
+            <w:tcW w:w="1414" w:type="dxa"/>
             <w:vAlign w:val="top"/>
           </w:tcPr>
           <w:p>
@@ -12586,7 +12586,7 @@
         </w:tc>
         <w:tc>
           <w:tcPr>
-            <w:tcW w:w="3441" w:type="dxa"/>
+            <w:tcW w:w="3329" w:type="dxa"/>
             <w:vAlign w:val="top"/>
           </w:tcPr>
           <w:p>
@@ -12601,7 +12601,7 @@
         </w:tc>
         <w:tc>
           <w:tcPr>
-            <w:tcW w:w="3444" w:type="dxa"/>
+            <w:tcW w:w="3093" w:type="dxa"/>
             <w:vAlign w:val="top"/>
           </w:tcPr>
           <w:p>
@@ -12629,7 +12629,7 @@
         </w:trPr>
         <w:tc>
           <w:tcPr>
-            <w:tcW w:w="2163" w:type="dxa"/>
+            <w:tcW w:w="2244" w:type="dxa"/>
             <w:vAlign w:val="top"/>
           </w:tcPr>
           <w:p>
@@ -12650,7 +12650,7 @@
         </w:tc>
         <w:tc>
           <w:tcPr>
-            <w:tcW w:w="1032" w:type="dxa"/>
+            <w:tcW w:w="1414" w:type="dxa"/>
             <w:vAlign w:val="top"/>
           </w:tcPr>
           <w:p>
@@ -12665,7 +12665,7 @@
         </w:tc>
         <w:tc>
           <w:tcPr>
-            <w:tcW w:w="3441" w:type="dxa"/>
+            <w:tcW w:w="3329" w:type="dxa"/>
             <w:vAlign w:val="top"/>
           </w:tcPr>
           <w:p>
@@ -12680,7 +12680,7 @@
         </w:tc>
         <w:tc>
           <w:tcPr>
-            <w:tcW w:w="3444" w:type="dxa"/>
+            <w:tcW w:w="3093" w:type="dxa"/>
             <w:vAlign w:val="top"/>
           </w:tcPr>
           <w:p>
@@ -12716,7 +12716,7 @@
         </w:trPr>
         <w:tc>
           <w:tcPr>
-            <w:tcW w:w="2163" w:type="dxa"/>
+            <w:tcW w:w="2244" w:type="dxa"/>
             <w:vAlign w:val="top"/>
           </w:tcPr>
           <w:p>
@@ -12737,7 +12737,7 @@
         </w:tc>
         <w:tc>
           <w:tcPr>
-            <w:tcW w:w="1032" w:type="dxa"/>
+            <w:tcW w:w="1414" w:type="dxa"/>
             <w:vAlign w:val="top"/>
           </w:tcPr>
           <w:p>
@@ -12752,7 +12752,7 @@
         </w:tc>
         <w:tc>
           <w:tcPr>
-            <w:tcW w:w="3441" w:type="dxa"/>
+            <w:tcW w:w="3329" w:type="dxa"/>
             <w:vAlign w:val="top"/>
           </w:tcPr>
           <w:p>
@@ -12767,7 +12767,7 @@
         </w:tc>
         <w:tc>
           <w:tcPr>
-            <w:tcW w:w="3444" w:type="dxa"/>
+            <w:tcW w:w="3093" w:type="dxa"/>
             <w:vAlign w:val="top"/>
           </w:tcPr>
           <w:p>

</xml_diff>

<commit_message>
Word export: chain diagrams use the full width with room for arrow labels; slightly wider label columns
Co-Authored-By: Claude Opus 5.5 <noreply@anthropic.com>
</commit_message>
<xml_diff>
--- a/migration-governance/word/DBA-Guide.docx
+++ b/migration-governance/word/DBA-Guide.docx
@@ -408,9 +408,9 @@
         </w:tblCellMar>
       </w:tblPr>
       <w:tblGrid>
-        <w:gridCol w:w="1801"/>
-        <w:gridCol w:w="4173"/>
-        <w:gridCol w:w="4106"/>
+        <w:gridCol w:w="1848"/>
+        <w:gridCol w:w="4156"/>
+        <w:gridCol w:w="4076"/>
       </w:tblGrid>
       <w:tr>
         <w:trPr>
@@ -418,7 +418,7 @@
         </w:trPr>
         <w:tc>
           <w:tcPr>
-            <w:tcW w:w="1801" w:type="dxa"/>
+            <w:tcW w:w="1848" w:type="dxa"/>
             <w:shd w:val="clear" w:color="auto" w:fill="1B4A78"/>
             <w:vAlign w:val="top"/>
           </w:tcPr>
@@ -430,7 +430,7 @@
         </w:tc>
         <w:tc>
           <w:tcPr>
-            <w:tcW w:w="4173" w:type="dxa"/>
+            <w:tcW w:w="4156" w:type="dxa"/>
             <w:shd w:val="clear" w:color="auto" w:fill="1B4A78"/>
             <w:vAlign w:val="top"/>
           </w:tcPr>
@@ -449,7 +449,7 @@
         </w:tc>
         <w:tc>
           <w:tcPr>
-            <w:tcW w:w="4106" w:type="dxa"/>
+            <w:tcW w:w="4076" w:type="dxa"/>
             <w:shd w:val="clear" w:color="auto" w:fill="1B4A78"/>
             <w:vAlign w:val="top"/>
           </w:tcPr>
@@ -473,7 +473,7 @@
         </w:trPr>
         <w:tc>
           <w:tcPr>
-            <w:tcW w:w="1801" w:type="dxa"/>
+            <w:tcW w:w="1848" w:type="dxa"/>
             <w:vAlign w:val="top"/>
           </w:tcPr>
           <w:p>
@@ -490,7 +490,7 @@
         </w:tc>
         <w:tc>
           <w:tcPr>
-            <w:tcW w:w="4173" w:type="dxa"/>
+            <w:tcW w:w="4156" w:type="dxa"/>
             <w:vAlign w:val="top"/>
           </w:tcPr>
           <w:p>
@@ -511,7 +511,7 @@
         </w:tc>
         <w:tc>
           <w:tcPr>
-            <w:tcW w:w="4106" w:type="dxa"/>
+            <w:tcW w:w="4076" w:type="dxa"/>
             <w:vAlign w:val="top"/>
           </w:tcPr>
           <w:p>
@@ -537,7 +537,7 @@
         </w:trPr>
         <w:tc>
           <w:tcPr>
-            <w:tcW w:w="1801" w:type="dxa"/>
+            <w:tcW w:w="1848" w:type="dxa"/>
             <w:vAlign w:val="top"/>
           </w:tcPr>
           <w:p>
@@ -554,7 +554,7 @@
         </w:tc>
         <w:tc>
           <w:tcPr>
-            <w:tcW w:w="4173" w:type="dxa"/>
+            <w:tcW w:w="4156" w:type="dxa"/>
             <w:vAlign w:val="top"/>
           </w:tcPr>
           <w:p>
@@ -575,7 +575,7 @@
         </w:tc>
         <w:tc>
           <w:tcPr>
-            <w:tcW w:w="4106" w:type="dxa"/>
+            <w:tcW w:w="4076" w:type="dxa"/>
             <w:vAlign w:val="top"/>
           </w:tcPr>
           <w:p>
@@ -601,7 +601,7 @@
         </w:trPr>
         <w:tc>
           <w:tcPr>
-            <w:tcW w:w="1801" w:type="dxa"/>
+            <w:tcW w:w="1848" w:type="dxa"/>
             <w:vAlign w:val="top"/>
           </w:tcPr>
           <w:p>
@@ -618,7 +618,7 @@
         </w:tc>
         <w:tc>
           <w:tcPr>
-            <w:tcW w:w="4173" w:type="dxa"/>
+            <w:tcW w:w="4156" w:type="dxa"/>
             <w:vAlign w:val="top"/>
           </w:tcPr>
           <w:p>
@@ -635,7 +635,7 @@
         </w:tc>
         <w:tc>
           <w:tcPr>
-            <w:tcW w:w="4106" w:type="dxa"/>
+            <w:tcW w:w="4076" w:type="dxa"/>
             <w:vAlign w:val="top"/>
           </w:tcPr>
           <w:p>
@@ -661,7 +661,7 @@
         </w:trPr>
         <w:tc>
           <w:tcPr>
-            <w:tcW w:w="1801" w:type="dxa"/>
+            <w:tcW w:w="1848" w:type="dxa"/>
             <w:vAlign w:val="top"/>
           </w:tcPr>
           <w:p>
@@ -678,7 +678,7 @@
         </w:tc>
         <w:tc>
           <w:tcPr>
-            <w:tcW w:w="4173" w:type="dxa"/>
+            <w:tcW w:w="4156" w:type="dxa"/>
             <w:vAlign w:val="top"/>
           </w:tcPr>
           <w:p>
@@ -695,7 +695,7 @@
         </w:tc>
         <w:tc>
           <w:tcPr>
-            <w:tcW w:w="4106" w:type="dxa"/>
+            <w:tcW w:w="4076" w:type="dxa"/>
             <w:vAlign w:val="top"/>
           </w:tcPr>
           <w:p>
@@ -731,7 +731,7 @@
         </w:trPr>
         <w:tc>
           <w:tcPr>
-            <w:tcW w:w="1801" w:type="dxa"/>
+            <w:tcW w:w="1848" w:type="dxa"/>
             <w:vAlign w:val="top"/>
           </w:tcPr>
           <w:p>
@@ -748,7 +748,7 @@
         </w:tc>
         <w:tc>
           <w:tcPr>
-            <w:tcW w:w="4173" w:type="dxa"/>
+            <w:tcW w:w="4156" w:type="dxa"/>
             <w:vAlign w:val="top"/>
           </w:tcPr>
           <w:p>
@@ -765,7 +765,7 @@
         </w:tc>
         <w:tc>
           <w:tcPr>
-            <w:tcW w:w="4106" w:type="dxa"/>
+            <w:tcW w:w="4076" w:type="dxa"/>
             <w:vAlign w:val="top"/>
           </w:tcPr>
           <w:p>
@@ -787,7 +787,7 @@
         </w:trPr>
         <w:tc>
           <w:tcPr>
-            <w:tcW w:w="1801" w:type="dxa"/>
+            <w:tcW w:w="1848" w:type="dxa"/>
             <w:vAlign w:val="top"/>
           </w:tcPr>
           <w:p>
@@ -804,7 +804,7 @@
         </w:tc>
         <w:tc>
           <w:tcPr>
-            <w:tcW w:w="4173" w:type="dxa"/>
+            <w:tcW w:w="4156" w:type="dxa"/>
             <w:vAlign w:val="top"/>
           </w:tcPr>
           <w:p>
@@ -819,7 +819,7 @@
         </w:tc>
         <w:tc>
           <w:tcPr>
-            <w:tcW w:w="4106" w:type="dxa"/>
+            <w:tcW w:w="4076" w:type="dxa"/>
             <w:vAlign w:val="top"/>
           </w:tcPr>
           <w:p>
@@ -1293,10 +1293,10 @@
         </w:tblCellMar>
       </w:tblPr>
       <w:tblGrid>
-        <w:gridCol w:w="1959"/>
-        <w:gridCol w:w="3074"/>
-        <w:gridCol w:w="2618"/>
-        <w:gridCol w:w="2429"/>
+        <w:gridCol w:w="2087"/>
+        <w:gridCol w:w="3062"/>
+        <w:gridCol w:w="2572"/>
+        <w:gridCol w:w="2359"/>
       </w:tblGrid>
       <w:tr>
         <w:trPr>
@@ -1304,7 +1304,7 @@
         </w:trPr>
         <w:tc>
           <w:tcPr>
-            <w:tcW w:w="1959" w:type="dxa"/>
+            <w:tcW w:w="2087" w:type="dxa"/>
             <w:shd w:val="clear" w:color="auto" w:fill="1B4A78"/>
             <w:vAlign w:val="top"/>
           </w:tcPr>
@@ -1323,7 +1323,7 @@
         </w:tc>
         <w:tc>
           <w:tcPr>
-            <w:tcW w:w="3074" w:type="dxa"/>
+            <w:tcW w:w="3062" w:type="dxa"/>
             <w:shd w:val="clear" w:color="auto" w:fill="1B4A78"/>
             <w:vAlign w:val="top"/>
           </w:tcPr>
@@ -1356,7 +1356,7 @@
         </w:tc>
         <w:tc>
           <w:tcPr>
-            <w:tcW w:w="2618" w:type="dxa"/>
+            <w:tcW w:w="2572" w:type="dxa"/>
             <w:shd w:val="clear" w:color="auto" w:fill="1B4A78"/>
             <w:vAlign w:val="top"/>
           </w:tcPr>
@@ -1389,7 +1389,7 @@
         </w:tc>
         <w:tc>
           <w:tcPr>
-            <w:tcW w:w="2429" w:type="dxa"/>
+            <w:tcW w:w="2359" w:type="dxa"/>
             <w:shd w:val="clear" w:color="auto" w:fill="1B4A78"/>
             <w:vAlign w:val="top"/>
           </w:tcPr>
@@ -1427,7 +1427,7 @@
         </w:trPr>
         <w:tc>
           <w:tcPr>
-            <w:tcW w:w="1959" w:type="dxa"/>
+            <w:tcW w:w="2087" w:type="dxa"/>
             <w:vAlign w:val="top"/>
           </w:tcPr>
           <w:p>
@@ -1444,7 +1444,7 @@
         </w:tc>
         <w:tc>
           <w:tcPr>
-            <w:tcW w:w="3074" w:type="dxa"/>
+            <w:tcW w:w="3062" w:type="dxa"/>
             <w:vAlign w:val="top"/>
           </w:tcPr>
           <w:p>
@@ -1459,7 +1459,7 @@
         </w:tc>
         <w:tc>
           <w:tcPr>
-            <w:tcW w:w="2618" w:type="dxa"/>
+            <w:tcW w:w="2572" w:type="dxa"/>
             <w:vAlign w:val="top"/>
           </w:tcPr>
           <w:p>
@@ -1474,7 +1474,7 @@
         </w:tc>
         <w:tc>
           <w:tcPr>
-            <w:tcW w:w="2429" w:type="dxa"/>
+            <w:tcW w:w="2359" w:type="dxa"/>
             <w:vAlign w:val="top"/>
           </w:tcPr>
           <w:p>
@@ -1494,7 +1494,7 @@
         </w:trPr>
         <w:tc>
           <w:tcPr>
-            <w:tcW w:w="1959" w:type="dxa"/>
+            <w:tcW w:w="2087" w:type="dxa"/>
             <w:vAlign w:val="top"/>
           </w:tcPr>
           <w:p>
@@ -1511,7 +1511,7 @@
         </w:tc>
         <w:tc>
           <w:tcPr>
-            <w:tcW w:w="3074" w:type="dxa"/>
+            <w:tcW w:w="3062" w:type="dxa"/>
             <w:vAlign w:val="top"/>
           </w:tcPr>
           <w:p>
@@ -1526,7 +1526,7 @@
         </w:tc>
         <w:tc>
           <w:tcPr>
-            <w:tcW w:w="2618" w:type="dxa"/>
+            <w:tcW w:w="2572" w:type="dxa"/>
             <w:vAlign w:val="top"/>
           </w:tcPr>
           <w:p>
@@ -1541,7 +1541,7 @@
         </w:tc>
         <w:tc>
           <w:tcPr>
-            <w:tcW w:w="2429" w:type="dxa"/>
+            <w:tcW w:w="2359" w:type="dxa"/>
             <w:vAlign w:val="top"/>
           </w:tcPr>
           <w:p>
@@ -1561,7 +1561,7 @@
         </w:trPr>
         <w:tc>
           <w:tcPr>
-            <w:tcW w:w="1959" w:type="dxa"/>
+            <w:tcW w:w="2087" w:type="dxa"/>
             <w:vAlign w:val="top"/>
           </w:tcPr>
           <w:p>
@@ -1578,7 +1578,7 @@
         </w:tc>
         <w:tc>
           <w:tcPr>
-            <w:tcW w:w="3074" w:type="dxa"/>
+            <w:tcW w:w="3062" w:type="dxa"/>
             <w:vAlign w:val="top"/>
           </w:tcPr>
           <w:p>
@@ -1609,7 +1609,7 @@
         </w:tc>
         <w:tc>
           <w:tcPr>
-            <w:tcW w:w="2618" w:type="dxa"/>
+            <w:tcW w:w="2572" w:type="dxa"/>
             <w:vAlign w:val="top"/>
           </w:tcPr>
           <w:p>
@@ -1624,7 +1624,7 @@
         </w:tc>
         <w:tc>
           <w:tcPr>
-            <w:tcW w:w="2429" w:type="dxa"/>
+            <w:tcW w:w="2359" w:type="dxa"/>
             <w:vAlign w:val="top"/>
           </w:tcPr>
           <w:p>
@@ -1644,7 +1644,7 @@
         </w:trPr>
         <w:tc>
           <w:tcPr>
-            <w:tcW w:w="1959" w:type="dxa"/>
+            <w:tcW w:w="2087" w:type="dxa"/>
             <w:vAlign w:val="top"/>
           </w:tcPr>
           <w:p>
@@ -1661,7 +1661,7 @@
         </w:tc>
         <w:tc>
           <w:tcPr>
-            <w:tcW w:w="3074" w:type="dxa"/>
+            <w:tcW w:w="3062" w:type="dxa"/>
             <w:vAlign w:val="top"/>
           </w:tcPr>
           <w:p>
@@ -1676,7 +1676,7 @@
         </w:tc>
         <w:tc>
           <w:tcPr>
-            <w:tcW w:w="2618" w:type="dxa"/>
+            <w:tcW w:w="2572" w:type="dxa"/>
             <w:vAlign w:val="top"/>
           </w:tcPr>
           <w:p>
@@ -1691,7 +1691,7 @@
         </w:tc>
         <w:tc>
           <w:tcPr>
-            <w:tcW w:w="2429" w:type="dxa"/>
+            <w:tcW w:w="2359" w:type="dxa"/>
             <w:vAlign w:val="top"/>
           </w:tcPr>
           <w:p>
@@ -1740,8 +1740,8 @@
         </w:tblCellMar>
       </w:tblPr>
       <w:tblGrid>
-        <w:gridCol w:w="885"/>
-        <w:gridCol w:w="9195"/>
+        <w:gridCol w:w="922"/>
+        <w:gridCol w:w="9158"/>
       </w:tblGrid>
       <w:tr>
         <w:trPr>
@@ -1749,7 +1749,7 @@
         </w:trPr>
         <w:tc>
           <w:tcPr>
-            <w:tcW w:w="885" w:type="dxa"/>
+            <w:tcW w:w="922" w:type="dxa"/>
             <w:shd w:val="clear" w:color="auto" w:fill="1B4A78"/>
             <w:vAlign w:val="top"/>
           </w:tcPr>
@@ -1768,7 +1768,7 @@
         </w:tc>
         <w:tc>
           <w:tcPr>
-            <w:tcW w:w="9195" w:type="dxa"/>
+            <w:tcW w:w="9158" w:type="dxa"/>
             <w:shd w:val="clear" w:color="auto" w:fill="1B4A78"/>
             <w:vAlign w:val="top"/>
           </w:tcPr>
@@ -1792,7 +1792,7 @@
         </w:trPr>
         <w:tc>
           <w:tcPr>
-            <w:tcW w:w="885" w:type="dxa"/>
+            <w:tcW w:w="922" w:type="dxa"/>
             <w:vAlign w:val="top"/>
           </w:tcPr>
           <w:p>
@@ -1809,7 +1809,7 @@
         </w:tc>
         <w:tc>
           <w:tcPr>
-            <w:tcW w:w="9195" w:type="dxa"/>
+            <w:tcW w:w="9158" w:type="dxa"/>
             <w:vAlign w:val="top"/>
           </w:tcPr>
           <w:p>
@@ -1829,7 +1829,7 @@
         </w:trPr>
         <w:tc>
           <w:tcPr>
-            <w:tcW w:w="885" w:type="dxa"/>
+            <w:tcW w:w="922" w:type="dxa"/>
             <w:vAlign w:val="top"/>
           </w:tcPr>
           <w:p>
@@ -1846,7 +1846,7 @@
         </w:tc>
         <w:tc>
           <w:tcPr>
-            <w:tcW w:w="9195" w:type="dxa"/>
+            <w:tcW w:w="9158" w:type="dxa"/>
             <w:vAlign w:val="top"/>
           </w:tcPr>
           <w:p>
@@ -1866,7 +1866,7 @@
         </w:trPr>
         <w:tc>
           <w:tcPr>
-            <w:tcW w:w="885" w:type="dxa"/>
+            <w:tcW w:w="922" w:type="dxa"/>
             <w:vAlign w:val="top"/>
           </w:tcPr>
           <w:p>
@@ -1883,7 +1883,7 @@
         </w:tc>
         <w:tc>
           <w:tcPr>
-            <w:tcW w:w="9195" w:type="dxa"/>
+            <w:tcW w:w="9158" w:type="dxa"/>
             <w:vAlign w:val="top"/>
           </w:tcPr>
           <w:p>
@@ -1903,7 +1903,7 @@
         </w:trPr>
         <w:tc>
           <w:tcPr>
-            <w:tcW w:w="885" w:type="dxa"/>
+            <w:tcW w:w="922" w:type="dxa"/>
             <w:vAlign w:val="top"/>
           </w:tcPr>
           <w:p>
@@ -1920,7 +1920,7 @@
         </w:tc>
         <w:tc>
           <w:tcPr>
-            <w:tcW w:w="9195" w:type="dxa"/>
+            <w:tcW w:w="9158" w:type="dxa"/>
             <w:vAlign w:val="top"/>
           </w:tcPr>
           <w:p>
@@ -2091,8 +2091,8 @@
         </w:tblCellMar>
       </w:tblPr>
       <w:tblGrid>
-        <w:gridCol w:w="5093"/>
-        <w:gridCol w:w="4987"/>
+        <w:gridCol w:w="5105"/>
+        <w:gridCol w:w="4975"/>
       </w:tblGrid>
       <w:tr>
         <w:trPr>
@@ -2100,7 +2100,7 @@
         </w:trPr>
         <w:tc>
           <w:tcPr>
-            <w:tcW w:w="5093" w:type="dxa"/>
+            <w:tcW w:w="5105" w:type="dxa"/>
             <w:shd w:val="clear" w:color="auto" w:fill="1B4A78"/>
             <w:vAlign w:val="top"/>
           </w:tcPr>
@@ -2119,7 +2119,7 @@
         </w:tc>
         <w:tc>
           <w:tcPr>
-            <w:tcW w:w="4987" w:type="dxa"/>
+            <w:tcW w:w="4975" w:type="dxa"/>
             <w:shd w:val="clear" w:color="auto" w:fill="1B4A78"/>
             <w:vAlign w:val="top"/>
           </w:tcPr>
@@ -2143,7 +2143,7 @@
         </w:trPr>
         <w:tc>
           <w:tcPr>
-            <w:tcW w:w="5093" w:type="dxa"/>
+            <w:tcW w:w="5105" w:type="dxa"/>
             <w:vAlign w:val="top"/>
           </w:tcPr>
           <w:p>
@@ -2168,7 +2168,7 @@
         </w:tc>
         <w:tc>
           <w:tcPr>
-            <w:tcW w:w="4987" w:type="dxa"/>
+            <w:tcW w:w="4975" w:type="dxa"/>
             <w:vAlign w:val="top"/>
           </w:tcPr>
           <w:p>
@@ -2194,7 +2194,7 @@
         </w:trPr>
         <w:tc>
           <w:tcPr>
-            <w:tcW w:w="5093" w:type="dxa"/>
+            <w:tcW w:w="5105" w:type="dxa"/>
             <w:vAlign w:val="top"/>
           </w:tcPr>
           <w:p>
@@ -2235,7 +2235,7 @@
         </w:tc>
         <w:tc>
           <w:tcPr>
-            <w:tcW w:w="4987" w:type="dxa"/>
+            <w:tcW w:w="4975" w:type="dxa"/>
             <w:vAlign w:val="top"/>
           </w:tcPr>
           <w:p>
@@ -2269,7 +2269,7 @@
         </w:trPr>
         <w:tc>
           <w:tcPr>
-            <w:tcW w:w="5093" w:type="dxa"/>
+            <w:tcW w:w="5105" w:type="dxa"/>
             <w:vAlign w:val="top"/>
           </w:tcPr>
           <w:p>
@@ -2284,7 +2284,7 @@
         </w:tc>
         <w:tc>
           <w:tcPr>
-            <w:tcW w:w="4987" w:type="dxa"/>
+            <w:tcW w:w="4975" w:type="dxa"/>
             <w:vAlign w:val="top"/>
           </w:tcPr>
           <w:p>
@@ -2310,7 +2310,7 @@
         </w:trPr>
         <w:tc>
           <w:tcPr>
-            <w:tcW w:w="5093" w:type="dxa"/>
+            <w:tcW w:w="5105" w:type="dxa"/>
             <w:vAlign w:val="top"/>
           </w:tcPr>
           <w:p>
@@ -2325,7 +2325,7 @@
         </w:tc>
         <w:tc>
           <w:tcPr>
-            <w:tcW w:w="4987" w:type="dxa"/>
+            <w:tcW w:w="4975" w:type="dxa"/>
             <w:vAlign w:val="top"/>
           </w:tcPr>
           <w:p>
@@ -2355,7 +2355,7 @@
         </w:trPr>
         <w:tc>
           <w:tcPr>
-            <w:tcW w:w="5093" w:type="dxa"/>
+            <w:tcW w:w="5105" w:type="dxa"/>
             <w:vAlign w:val="top"/>
           </w:tcPr>
           <w:p>
@@ -2376,7 +2376,7 @@
         </w:tc>
         <w:tc>
           <w:tcPr>
-            <w:tcW w:w="4987" w:type="dxa"/>
+            <w:tcW w:w="4975" w:type="dxa"/>
             <w:vAlign w:val="top"/>
           </w:tcPr>
           <w:p>
@@ -2402,7 +2402,7 @@
         </w:trPr>
         <w:tc>
           <w:tcPr>
-            <w:tcW w:w="5093" w:type="dxa"/>
+            <w:tcW w:w="5105" w:type="dxa"/>
             <w:vAlign w:val="top"/>
           </w:tcPr>
           <w:p>
@@ -2417,7 +2417,7 @@
         </w:tc>
         <w:tc>
           <w:tcPr>
-            <w:tcW w:w="4987" w:type="dxa"/>
+            <w:tcW w:w="4975" w:type="dxa"/>
             <w:vAlign w:val="top"/>
           </w:tcPr>
           <w:p>
@@ -2443,7 +2443,7 @@
         </w:trPr>
         <w:tc>
           <w:tcPr>
-            <w:tcW w:w="5093" w:type="dxa"/>
+            <w:tcW w:w="5105" w:type="dxa"/>
             <w:vAlign w:val="top"/>
           </w:tcPr>
           <w:p>
@@ -2458,7 +2458,7 @@
         </w:tc>
         <w:tc>
           <w:tcPr>
-            <w:tcW w:w="4987" w:type="dxa"/>
+            <w:tcW w:w="4975" w:type="dxa"/>
             <w:vAlign w:val="top"/>
           </w:tcPr>
           <w:p>
@@ -5630,9 +5630,9 @@
         </w:tblCellMar>
       </w:tblPr>
       <w:tblGrid>
-        <w:gridCol w:w="2452"/>
-        <w:gridCol w:w="3277"/>
-        <w:gridCol w:w="4351"/>
+        <w:gridCol w:w="2461"/>
+        <w:gridCol w:w="3281"/>
+        <w:gridCol w:w="4338"/>
       </w:tblGrid>
       <w:tr>
         <w:trPr>
@@ -5640,7 +5640,7 @@
         </w:trPr>
         <w:tc>
           <w:tcPr>
-            <w:tcW w:w="2452" w:type="dxa"/>
+            <w:tcW w:w="2461" w:type="dxa"/>
             <w:shd w:val="clear" w:color="auto" w:fill="1B4A78"/>
             <w:vAlign w:val="top"/>
           </w:tcPr>
@@ -5659,7 +5659,7 @@
         </w:tc>
         <w:tc>
           <w:tcPr>
-            <w:tcW w:w="3277" w:type="dxa"/>
+            <w:tcW w:w="3281" w:type="dxa"/>
             <w:shd w:val="clear" w:color="auto" w:fill="1B4A78"/>
             <w:vAlign w:val="top"/>
           </w:tcPr>
@@ -5678,7 +5678,7 @@
         </w:tc>
         <w:tc>
           <w:tcPr>
-            <w:tcW w:w="4351" w:type="dxa"/>
+            <w:tcW w:w="4338" w:type="dxa"/>
             <w:shd w:val="clear" w:color="auto" w:fill="1B4A78"/>
             <w:vAlign w:val="top"/>
           </w:tcPr>
@@ -5702,7 +5702,7 @@
         </w:trPr>
         <w:tc>
           <w:tcPr>
-            <w:tcW w:w="2452" w:type="dxa"/>
+            <w:tcW w:w="2461" w:type="dxa"/>
             <w:vAlign w:val="top"/>
           </w:tcPr>
           <w:p>
@@ -5719,7 +5719,7 @@
         </w:tc>
         <w:tc>
           <w:tcPr>
-            <w:tcW w:w="3277" w:type="dxa"/>
+            <w:tcW w:w="3281" w:type="dxa"/>
             <w:vAlign w:val="top"/>
           </w:tcPr>
           <w:p>
@@ -5734,7 +5734,7 @@
         </w:tc>
         <w:tc>
           <w:tcPr>
-            <w:tcW w:w="4351" w:type="dxa"/>
+            <w:tcW w:w="4338" w:type="dxa"/>
             <w:vAlign w:val="top"/>
           </w:tcPr>
           <w:p>
@@ -5756,7 +5756,7 @@
         </w:trPr>
         <w:tc>
           <w:tcPr>
-            <w:tcW w:w="2452" w:type="dxa"/>
+            <w:tcW w:w="2461" w:type="dxa"/>
             <w:vAlign w:val="top"/>
           </w:tcPr>
           <w:p>
@@ -5773,7 +5773,7 @@
         </w:tc>
         <w:tc>
           <w:tcPr>
-            <w:tcW w:w="3277" w:type="dxa"/>
+            <w:tcW w:w="3281" w:type="dxa"/>
             <w:vAlign w:val="top"/>
           </w:tcPr>
           <w:p>
@@ -5788,7 +5788,7 @@
         </w:tc>
         <w:tc>
           <w:tcPr>
-            <w:tcW w:w="4351" w:type="dxa"/>
+            <w:tcW w:w="4338" w:type="dxa"/>
             <w:vAlign w:val="top"/>
           </w:tcPr>
           <w:p>
@@ -5810,7 +5810,7 @@
         </w:trPr>
         <w:tc>
           <w:tcPr>
-            <w:tcW w:w="2452" w:type="dxa"/>
+            <w:tcW w:w="2461" w:type="dxa"/>
             <w:vAlign w:val="top"/>
           </w:tcPr>
           <w:p>
@@ -5825,7 +5825,7 @@
         </w:tc>
         <w:tc>
           <w:tcPr>
-            <w:tcW w:w="3277" w:type="dxa"/>
+            <w:tcW w:w="3281" w:type="dxa"/>
             <w:vAlign w:val="top"/>
           </w:tcPr>
           <w:p>
@@ -5840,7 +5840,7 @@
         </w:tc>
         <w:tc>
           <w:tcPr>
-            <w:tcW w:w="4351" w:type="dxa"/>
+            <w:tcW w:w="4338" w:type="dxa"/>
             <w:vAlign w:val="top"/>
           </w:tcPr>
           <w:p>
@@ -6598,10 +6598,10 @@
         </w:tblCellMar>
       </w:tblPr>
       <w:tblGrid>
-        <w:gridCol w:w="1477"/>
-        <w:gridCol w:w="2882"/>
-        <w:gridCol w:w="2756"/>
-        <w:gridCol w:w="2965"/>
+        <w:gridCol w:w="1502"/>
+        <w:gridCol w:w="2821"/>
+        <w:gridCol w:w="2842"/>
+        <w:gridCol w:w="2915"/>
       </w:tblGrid>
       <w:tr>
         <w:trPr>
@@ -6609,7 +6609,7 @@
         </w:trPr>
         <w:tc>
           <w:tcPr>
-            <w:tcW w:w="1477" w:type="dxa"/>
+            <w:tcW w:w="1502" w:type="dxa"/>
             <w:shd w:val="clear" w:color="auto" w:fill="1B4A78"/>
             <w:vAlign w:val="top"/>
           </w:tcPr>
@@ -6628,7 +6628,7 @@
         </w:tc>
         <w:tc>
           <w:tcPr>
-            <w:tcW w:w="2882" w:type="dxa"/>
+            <w:tcW w:w="2821" w:type="dxa"/>
             <w:shd w:val="clear" w:color="auto" w:fill="1B4A78"/>
             <w:vAlign w:val="top"/>
           </w:tcPr>
@@ -6654,7 +6654,7 @@
         </w:tc>
         <w:tc>
           <w:tcPr>
-            <w:tcW w:w="2756" w:type="dxa"/>
+            <w:tcW w:w="2842" w:type="dxa"/>
             <w:shd w:val="clear" w:color="auto" w:fill="1B4A78"/>
             <w:vAlign w:val="top"/>
           </w:tcPr>
@@ -6673,7 +6673,7 @@
         </w:tc>
         <w:tc>
           <w:tcPr>
-            <w:tcW w:w="2965" w:type="dxa"/>
+            <w:tcW w:w="2915" w:type="dxa"/>
             <w:shd w:val="clear" w:color="auto" w:fill="1B4A78"/>
             <w:vAlign w:val="top"/>
           </w:tcPr>
@@ -6697,7 +6697,7 @@
         </w:trPr>
         <w:tc>
           <w:tcPr>
-            <w:tcW w:w="1477" w:type="dxa"/>
+            <w:tcW w:w="1502" w:type="dxa"/>
             <w:vAlign w:val="top"/>
           </w:tcPr>
           <w:p>
@@ -6718,7 +6718,7 @@
         </w:tc>
         <w:tc>
           <w:tcPr>
-            <w:tcW w:w="2882" w:type="dxa"/>
+            <w:tcW w:w="2821" w:type="dxa"/>
             <w:vAlign w:val="top"/>
           </w:tcPr>
           <w:p>
@@ -6749,7 +6749,7 @@
         </w:tc>
         <w:tc>
           <w:tcPr>
-            <w:tcW w:w="2756" w:type="dxa"/>
+            <w:tcW w:w="2842" w:type="dxa"/>
             <w:vAlign w:val="top"/>
           </w:tcPr>
           <w:p>
@@ -6764,7 +6764,7 @@
         </w:tc>
         <w:tc>
           <w:tcPr>
-            <w:tcW w:w="2965" w:type="dxa"/>
+            <w:tcW w:w="2915" w:type="dxa"/>
             <w:vAlign w:val="top"/>
           </w:tcPr>
           <w:p>
@@ -6790,7 +6790,7 @@
         </w:trPr>
         <w:tc>
           <w:tcPr>
-            <w:tcW w:w="1477" w:type="dxa"/>
+            <w:tcW w:w="1502" w:type="dxa"/>
             <w:vAlign w:val="top"/>
           </w:tcPr>
           <w:p>
@@ -6811,7 +6811,7 @@
         </w:tc>
         <w:tc>
           <w:tcPr>
-            <w:tcW w:w="2882" w:type="dxa"/>
+            <w:tcW w:w="2821" w:type="dxa"/>
             <w:vAlign w:val="top"/>
           </w:tcPr>
           <w:p>
@@ -6832,7 +6832,7 @@
         </w:tc>
         <w:tc>
           <w:tcPr>
-            <w:tcW w:w="2756" w:type="dxa"/>
+            <w:tcW w:w="2842" w:type="dxa"/>
             <w:vAlign w:val="top"/>
           </w:tcPr>
           <w:p>
@@ -6847,7 +6847,7 @@
         </w:tc>
         <w:tc>
           <w:tcPr>
-            <w:tcW w:w="2965" w:type="dxa"/>
+            <w:tcW w:w="2915" w:type="dxa"/>
             <w:vAlign w:val="top"/>
           </w:tcPr>
           <w:p>
@@ -6877,7 +6877,7 @@
         </w:trPr>
         <w:tc>
           <w:tcPr>
-            <w:tcW w:w="1477" w:type="dxa"/>
+            <w:tcW w:w="1502" w:type="dxa"/>
             <w:vAlign w:val="top"/>
           </w:tcPr>
           <w:p>
@@ -6894,7 +6894,7 @@
         </w:tc>
         <w:tc>
           <w:tcPr>
-            <w:tcW w:w="2882" w:type="dxa"/>
+            <w:tcW w:w="2821" w:type="dxa"/>
             <w:vAlign w:val="top"/>
           </w:tcPr>
           <w:p>
@@ -6911,7 +6911,7 @@
         </w:tc>
         <w:tc>
           <w:tcPr>
-            <w:tcW w:w="2756" w:type="dxa"/>
+            <w:tcW w:w="2842" w:type="dxa"/>
             <w:vAlign w:val="top"/>
           </w:tcPr>
           <w:p>
@@ -6932,7 +6932,7 @@
         </w:tc>
         <w:tc>
           <w:tcPr>
-            <w:tcW w:w="2965" w:type="dxa"/>
+            <w:tcW w:w="2915" w:type="dxa"/>
             <w:vAlign w:val="top"/>
           </w:tcPr>
           <w:p>
@@ -6952,7 +6952,7 @@
         </w:trPr>
         <w:tc>
           <w:tcPr>
-            <w:tcW w:w="1477" w:type="dxa"/>
+            <w:tcW w:w="1502" w:type="dxa"/>
             <w:vAlign w:val="top"/>
           </w:tcPr>
           <w:p>
@@ -6969,7 +6969,7 @@
         </w:tc>
         <w:tc>
           <w:tcPr>
-            <w:tcW w:w="2882" w:type="dxa"/>
+            <w:tcW w:w="2821" w:type="dxa"/>
             <w:vAlign w:val="top"/>
           </w:tcPr>
           <w:p>
@@ -6994,7 +6994,7 @@
         </w:tc>
         <w:tc>
           <w:tcPr>
-            <w:tcW w:w="2756" w:type="dxa"/>
+            <w:tcW w:w="2842" w:type="dxa"/>
             <w:vAlign w:val="top"/>
           </w:tcPr>
           <w:p>
@@ -7009,7 +7009,7 @@
         </w:tc>
         <w:tc>
           <w:tcPr>
-            <w:tcW w:w="2965" w:type="dxa"/>
+            <w:tcW w:w="2915" w:type="dxa"/>
             <w:vAlign w:val="top"/>
           </w:tcPr>
           <w:p>
@@ -7029,7 +7029,7 @@
         </w:trPr>
         <w:tc>
           <w:tcPr>
-            <w:tcW w:w="1477" w:type="dxa"/>
+            <w:tcW w:w="1502" w:type="dxa"/>
             <w:vAlign w:val="top"/>
           </w:tcPr>
           <w:p>
@@ -7046,7 +7046,7 @@
         </w:tc>
         <w:tc>
           <w:tcPr>
-            <w:tcW w:w="2882" w:type="dxa"/>
+            <w:tcW w:w="2821" w:type="dxa"/>
             <w:vAlign w:val="top"/>
           </w:tcPr>
           <w:p>
@@ -7071,7 +7071,7 @@
         </w:tc>
         <w:tc>
           <w:tcPr>
-            <w:tcW w:w="2756" w:type="dxa"/>
+            <w:tcW w:w="2842" w:type="dxa"/>
             <w:vAlign w:val="top"/>
           </w:tcPr>
           <w:p>
@@ -7086,7 +7086,7 @@
         </w:tc>
         <w:tc>
           <w:tcPr>
-            <w:tcW w:w="2965" w:type="dxa"/>
+            <w:tcW w:w="2915" w:type="dxa"/>
             <w:vAlign w:val="top"/>
           </w:tcPr>
           <w:p>
@@ -7106,7 +7106,7 @@
         </w:trPr>
         <w:tc>
           <w:tcPr>
-            <w:tcW w:w="1477" w:type="dxa"/>
+            <w:tcW w:w="1502" w:type="dxa"/>
             <w:vAlign w:val="top"/>
           </w:tcPr>
           <w:p>
@@ -7123,7 +7123,7 @@
         </w:tc>
         <w:tc>
           <w:tcPr>
-            <w:tcW w:w="2882" w:type="dxa"/>
+            <w:tcW w:w="2821" w:type="dxa"/>
             <w:vAlign w:val="top"/>
           </w:tcPr>
           <w:p>
@@ -7138,7 +7138,7 @@
         </w:tc>
         <w:tc>
           <w:tcPr>
-            <w:tcW w:w="2756" w:type="dxa"/>
+            <w:tcW w:w="2842" w:type="dxa"/>
             <w:vAlign w:val="top"/>
           </w:tcPr>
           <w:p>
@@ -7153,7 +7153,7 @@
         </w:tc>
         <w:tc>
           <w:tcPr>
-            <w:tcW w:w="2965" w:type="dxa"/>
+            <w:tcW w:w="2915" w:type="dxa"/>
             <w:vAlign w:val="top"/>
           </w:tcPr>
           <w:p>
@@ -7361,8 +7361,8 @@
         </w:tblCellMar>
       </w:tblPr>
       <w:tblGrid>
-        <w:gridCol w:w="4811"/>
-        <w:gridCol w:w="5269"/>
+        <w:gridCol w:w="4760"/>
+        <w:gridCol w:w="5320"/>
       </w:tblGrid>
       <w:tr>
         <w:trPr>
@@ -7370,7 +7370,7 @@
         </w:trPr>
         <w:tc>
           <w:tcPr>
-            <w:tcW w:w="4811" w:type="dxa"/>
+            <w:tcW w:w="4760" w:type="dxa"/>
             <w:shd w:val="clear" w:color="auto" w:fill="1B4A78"/>
             <w:vAlign w:val="top"/>
           </w:tcPr>
@@ -7389,7 +7389,7 @@
         </w:tc>
         <w:tc>
           <w:tcPr>
-            <w:tcW w:w="5269" w:type="dxa"/>
+            <w:tcW w:w="5320" w:type="dxa"/>
             <w:shd w:val="clear" w:color="auto" w:fill="1B4A78"/>
             <w:vAlign w:val="top"/>
           </w:tcPr>
@@ -7413,7 +7413,7 @@
         </w:trPr>
         <w:tc>
           <w:tcPr>
-            <w:tcW w:w="4811" w:type="dxa"/>
+            <w:tcW w:w="4760" w:type="dxa"/>
             <w:vAlign w:val="top"/>
           </w:tcPr>
           <w:p>
@@ -7434,7 +7434,7 @@
         </w:tc>
         <w:tc>
           <w:tcPr>
-            <w:tcW w:w="5269" w:type="dxa"/>
+            <w:tcW w:w="5320" w:type="dxa"/>
             <w:vAlign w:val="top"/>
           </w:tcPr>
           <w:p>
@@ -7460,7 +7460,7 @@
         </w:trPr>
         <w:tc>
           <w:tcPr>
-            <w:tcW w:w="4811" w:type="dxa"/>
+            <w:tcW w:w="4760" w:type="dxa"/>
             <w:vAlign w:val="top"/>
           </w:tcPr>
           <w:p>
@@ -7475,7 +7475,7 @@
         </w:tc>
         <w:tc>
           <w:tcPr>
-            <w:tcW w:w="5269" w:type="dxa"/>
+            <w:tcW w:w="5320" w:type="dxa"/>
             <w:vAlign w:val="top"/>
           </w:tcPr>
           <w:p>
@@ -7501,7 +7501,7 @@
         </w:trPr>
         <w:tc>
           <w:tcPr>
-            <w:tcW w:w="4811" w:type="dxa"/>
+            <w:tcW w:w="4760" w:type="dxa"/>
             <w:vAlign w:val="top"/>
           </w:tcPr>
           <w:p>
@@ -7522,7 +7522,7 @@
         </w:tc>
         <w:tc>
           <w:tcPr>
-            <w:tcW w:w="5269" w:type="dxa"/>
+            <w:tcW w:w="5320" w:type="dxa"/>
             <w:vAlign w:val="top"/>
           </w:tcPr>
           <w:p>
@@ -7548,7 +7548,7 @@
         </w:trPr>
         <w:tc>
           <w:tcPr>
-            <w:tcW w:w="4811" w:type="dxa"/>
+            <w:tcW w:w="4760" w:type="dxa"/>
             <w:vAlign w:val="top"/>
           </w:tcPr>
           <w:p>
@@ -7563,7 +7563,7 @@
         </w:tc>
         <w:tc>
           <w:tcPr>
-            <w:tcW w:w="5269" w:type="dxa"/>
+            <w:tcW w:w="5320" w:type="dxa"/>
             <w:vAlign w:val="top"/>
           </w:tcPr>
           <w:p>
@@ -7589,7 +7589,7 @@
         </w:trPr>
         <w:tc>
           <w:tcPr>
-            <w:tcW w:w="4811" w:type="dxa"/>
+            <w:tcW w:w="4760" w:type="dxa"/>
             <w:vAlign w:val="top"/>
           </w:tcPr>
           <w:p>
@@ -7604,7 +7604,7 @@
         </w:tc>
         <w:tc>
           <w:tcPr>
-            <w:tcW w:w="5269" w:type="dxa"/>
+            <w:tcW w:w="5320" w:type="dxa"/>
             <w:vAlign w:val="top"/>
           </w:tcPr>
           <w:p>
@@ -7674,7 +7674,7 @@
         </w:trPr>
         <w:tc>
           <w:tcPr>
-            <w:tcW w:w="4811" w:type="dxa"/>
+            <w:tcW w:w="4760" w:type="dxa"/>
             <w:vAlign w:val="top"/>
           </w:tcPr>
           <w:p>
@@ -7689,7 +7689,7 @@
         </w:tc>
         <w:tc>
           <w:tcPr>
-            <w:tcW w:w="5269" w:type="dxa"/>
+            <w:tcW w:w="5320" w:type="dxa"/>
             <w:vAlign w:val="top"/>
           </w:tcPr>
           <w:p>
@@ -7709,7 +7709,7 @@
         </w:trPr>
         <w:tc>
           <w:tcPr>
-            <w:tcW w:w="4811" w:type="dxa"/>
+            <w:tcW w:w="4760" w:type="dxa"/>
             <w:vAlign w:val="top"/>
           </w:tcPr>
           <w:p>
@@ -7724,7 +7724,7 @@
         </w:tc>
         <w:tc>
           <w:tcPr>
-            <w:tcW w:w="5269" w:type="dxa"/>
+            <w:tcW w:w="5320" w:type="dxa"/>
             <w:vAlign w:val="top"/>
           </w:tcPr>
           <w:p>
@@ -7831,8 +7831,8 @@
         </w:tblCellMar>
       </w:tblPr>
       <w:tblGrid>
-        <w:gridCol w:w="4007"/>
-        <w:gridCol w:w="6073"/>
+        <w:gridCol w:w="4047"/>
+        <w:gridCol w:w="6033"/>
       </w:tblGrid>
       <w:tr>
         <w:trPr>
@@ -7840,7 +7840,7 @@
         </w:trPr>
         <w:tc>
           <w:tcPr>
-            <w:tcW w:w="4007" w:type="dxa"/>
+            <w:tcW w:w="4047" w:type="dxa"/>
             <w:shd w:val="clear" w:color="auto" w:fill="1B4A78"/>
             <w:vAlign w:val="top"/>
           </w:tcPr>
@@ -7859,7 +7859,7 @@
         </w:tc>
         <w:tc>
           <w:tcPr>
-            <w:tcW w:w="6073" w:type="dxa"/>
+            <w:tcW w:w="6033" w:type="dxa"/>
             <w:shd w:val="clear" w:color="auto" w:fill="1B4A78"/>
             <w:vAlign w:val="top"/>
           </w:tcPr>
@@ -7883,7 +7883,7 @@
         </w:trPr>
         <w:tc>
           <w:tcPr>
-            <w:tcW w:w="4007" w:type="dxa"/>
+            <w:tcW w:w="4047" w:type="dxa"/>
             <w:vAlign w:val="top"/>
           </w:tcPr>
           <w:p>
@@ -7898,7 +7898,7 @@
         </w:tc>
         <w:tc>
           <w:tcPr>
-            <w:tcW w:w="6073" w:type="dxa"/>
+            <w:tcW w:w="6033" w:type="dxa"/>
             <w:vAlign w:val="top"/>
           </w:tcPr>
           <w:p>
@@ -7936,7 +7936,7 @@
         </w:trPr>
         <w:tc>
           <w:tcPr>
-            <w:tcW w:w="4007" w:type="dxa"/>
+            <w:tcW w:w="4047" w:type="dxa"/>
             <w:vAlign w:val="top"/>
           </w:tcPr>
           <w:p>
@@ -7951,7 +7951,7 @@
         </w:tc>
         <w:tc>
           <w:tcPr>
-            <w:tcW w:w="6073" w:type="dxa"/>
+            <w:tcW w:w="6033" w:type="dxa"/>
             <w:vAlign w:val="top"/>
           </w:tcPr>
           <w:p>
@@ -7971,7 +7971,7 @@
         </w:trPr>
         <w:tc>
           <w:tcPr>
-            <w:tcW w:w="4007" w:type="dxa"/>
+            <w:tcW w:w="4047" w:type="dxa"/>
             <w:vAlign w:val="top"/>
           </w:tcPr>
           <w:p>
@@ -7994,7 +7994,7 @@
         </w:tc>
         <w:tc>
           <w:tcPr>
-            <w:tcW w:w="6073" w:type="dxa"/>
+            <w:tcW w:w="6033" w:type="dxa"/>
             <w:vAlign w:val="top"/>
           </w:tcPr>
           <w:p>
@@ -8036,7 +8036,7 @@
         </w:trPr>
         <w:tc>
           <w:tcPr>
-            <w:tcW w:w="4007" w:type="dxa"/>
+            <w:tcW w:w="4047" w:type="dxa"/>
             <w:vAlign w:val="top"/>
           </w:tcPr>
           <w:p>
@@ -8051,7 +8051,7 @@
         </w:tc>
         <w:tc>
           <w:tcPr>
-            <w:tcW w:w="6073" w:type="dxa"/>
+            <w:tcW w:w="6033" w:type="dxa"/>
             <w:vAlign w:val="top"/>
           </w:tcPr>
           <w:p>
@@ -8071,7 +8071,7 @@
         </w:trPr>
         <w:tc>
           <w:tcPr>
-            <w:tcW w:w="4007" w:type="dxa"/>
+            <w:tcW w:w="4047" w:type="dxa"/>
             <w:vAlign w:val="top"/>
           </w:tcPr>
           <w:p>
@@ -8086,7 +8086,7 @@
         </w:tc>
         <w:tc>
           <w:tcPr>
-            <w:tcW w:w="6073" w:type="dxa"/>
+            <w:tcW w:w="6033" w:type="dxa"/>
             <w:vAlign w:val="top"/>
           </w:tcPr>
           <w:p>
@@ -8106,7 +8106,7 @@
         </w:trPr>
         <w:tc>
           <w:tcPr>
-            <w:tcW w:w="4007" w:type="dxa"/>
+            <w:tcW w:w="4047" w:type="dxa"/>
             <w:vAlign w:val="top"/>
           </w:tcPr>
           <w:p>
@@ -8123,7 +8123,7 @@
         </w:tc>
         <w:tc>
           <w:tcPr>
-            <w:tcW w:w="6073" w:type="dxa"/>
+            <w:tcW w:w="6033" w:type="dxa"/>
             <w:vAlign w:val="top"/>
           </w:tcPr>
           <w:p>
@@ -9305,9 +9305,9 @@
         </w:tblCellMar>
       </w:tblPr>
       <w:tblGrid>
-        <w:gridCol w:w="2106"/>
-        <w:gridCol w:w="3986"/>
-        <w:gridCol w:w="3988"/>
+        <w:gridCol w:w="2145"/>
+        <w:gridCol w:w="3967"/>
+        <w:gridCol w:w="3968"/>
       </w:tblGrid>
       <w:tr>
         <w:trPr>
@@ -9315,7 +9315,7 @@
         </w:trPr>
         <w:tc>
           <w:tcPr>
-            <w:tcW w:w="2106" w:type="dxa"/>
+            <w:tcW w:w="2145" w:type="dxa"/>
             <w:shd w:val="clear" w:color="auto" w:fill="1B4A78"/>
             <w:vAlign w:val="top"/>
           </w:tcPr>
@@ -9334,7 +9334,7 @@
         </w:tc>
         <w:tc>
           <w:tcPr>
-            <w:tcW w:w="3986" w:type="dxa"/>
+            <w:tcW w:w="3967" w:type="dxa"/>
             <w:shd w:val="clear" w:color="auto" w:fill="1B4A78"/>
             <w:vAlign w:val="top"/>
           </w:tcPr>
@@ -9353,7 +9353,7 @@
         </w:tc>
         <w:tc>
           <w:tcPr>
-            <w:tcW w:w="3988" w:type="dxa"/>
+            <w:tcW w:w="3968" w:type="dxa"/>
             <w:shd w:val="clear" w:color="auto" w:fill="1B4A78"/>
             <w:vAlign w:val="top"/>
           </w:tcPr>
@@ -9377,7 +9377,7 @@
         </w:trPr>
         <w:tc>
           <w:tcPr>
-            <w:tcW w:w="2106" w:type="dxa"/>
+            <w:tcW w:w="2145" w:type="dxa"/>
             <w:vAlign w:val="top"/>
           </w:tcPr>
           <w:p>
@@ -9394,7 +9394,7 @@
         </w:tc>
         <w:tc>
           <w:tcPr>
-            <w:tcW w:w="3986" w:type="dxa"/>
+            <w:tcW w:w="3967" w:type="dxa"/>
             <w:vAlign w:val="top"/>
           </w:tcPr>
           <w:p>
@@ -9426,7 +9426,7 @@
         </w:tc>
         <w:tc>
           <w:tcPr>
-            <w:tcW w:w="3988" w:type="dxa"/>
+            <w:tcW w:w="3968" w:type="dxa"/>
             <w:vAlign w:val="top"/>
           </w:tcPr>
           <w:p>
@@ -9452,7 +9452,7 @@
         </w:trPr>
         <w:tc>
           <w:tcPr>
-            <w:tcW w:w="2106" w:type="dxa"/>
+            <w:tcW w:w="2145" w:type="dxa"/>
             <w:vAlign w:val="top"/>
           </w:tcPr>
           <w:p>
@@ -9469,7 +9469,7 @@
         </w:tc>
         <w:tc>
           <w:tcPr>
-            <w:tcW w:w="3986" w:type="dxa"/>
+            <w:tcW w:w="3967" w:type="dxa"/>
             <w:vAlign w:val="top"/>
           </w:tcPr>
           <w:p>
@@ -9524,7 +9524,7 @@
         </w:tc>
         <w:tc>
           <w:tcPr>
-            <w:tcW w:w="3988" w:type="dxa"/>
+            <w:tcW w:w="3968" w:type="dxa"/>
             <w:vAlign w:val="top"/>
           </w:tcPr>
           <w:p>
@@ -9544,7 +9544,7 @@
         </w:trPr>
         <w:tc>
           <w:tcPr>
-            <w:tcW w:w="2106" w:type="dxa"/>
+            <w:tcW w:w="2145" w:type="dxa"/>
             <w:vAlign w:val="top"/>
           </w:tcPr>
           <w:p>
@@ -9561,7 +9561,7 @@
         </w:tc>
         <w:tc>
           <w:tcPr>
-            <w:tcW w:w="3986" w:type="dxa"/>
+            <w:tcW w:w="3967" w:type="dxa"/>
             <w:vAlign w:val="top"/>
           </w:tcPr>
           <w:p>
@@ -9586,7 +9586,7 @@
         </w:tc>
         <w:tc>
           <w:tcPr>
-            <w:tcW w:w="3988" w:type="dxa"/>
+            <w:tcW w:w="3968" w:type="dxa"/>
             <w:vAlign w:val="top"/>
           </w:tcPr>
           <w:p>
@@ -9656,10 +9656,10 @@
         </w:tblCellMar>
       </w:tblPr>
       <w:tblGrid>
-        <w:gridCol w:w="1080"/>
-        <w:gridCol w:w="2805"/>
-        <w:gridCol w:w="3138"/>
-        <w:gridCol w:w="3057"/>
+        <w:gridCol w:w="1160"/>
+        <w:gridCol w:w="2750"/>
+        <w:gridCol w:w="3132"/>
+        <w:gridCol w:w="3038"/>
       </w:tblGrid>
       <w:tr>
         <w:trPr>
@@ -9667,7 +9667,7 @@
         </w:trPr>
         <w:tc>
           <w:tcPr>
-            <w:tcW w:w="1080" w:type="dxa"/>
+            <w:tcW w:w="1160" w:type="dxa"/>
             <w:shd w:val="clear" w:color="auto" w:fill="1B4A78"/>
             <w:vAlign w:val="top"/>
           </w:tcPr>
@@ -9686,7 +9686,7 @@
         </w:tc>
         <w:tc>
           <w:tcPr>
-            <w:tcW w:w="2805" w:type="dxa"/>
+            <w:tcW w:w="2750" w:type="dxa"/>
             <w:shd w:val="clear" w:color="auto" w:fill="1B4A78"/>
             <w:vAlign w:val="top"/>
           </w:tcPr>
@@ -9705,7 +9705,7 @@
         </w:tc>
         <w:tc>
           <w:tcPr>
-            <w:tcW w:w="3138" w:type="dxa"/>
+            <w:tcW w:w="3132" w:type="dxa"/>
             <w:shd w:val="clear" w:color="auto" w:fill="1B4A78"/>
             <w:vAlign w:val="top"/>
           </w:tcPr>
@@ -9724,7 +9724,7 @@
         </w:tc>
         <w:tc>
           <w:tcPr>
-            <w:tcW w:w="3057" w:type="dxa"/>
+            <w:tcW w:w="3038" w:type="dxa"/>
             <w:shd w:val="clear" w:color="auto" w:fill="1B4A78"/>
             <w:vAlign w:val="top"/>
           </w:tcPr>
@@ -9748,7 +9748,7 @@
         </w:trPr>
         <w:tc>
           <w:tcPr>
-            <w:tcW w:w="1080" w:type="dxa"/>
+            <w:tcW w:w="1160" w:type="dxa"/>
             <w:vAlign w:val="top"/>
           </w:tcPr>
           <w:p>
@@ -9765,7 +9765,7 @@
         </w:tc>
         <w:tc>
           <w:tcPr>
-            <w:tcW w:w="2805" w:type="dxa"/>
+            <w:tcW w:w="2750" w:type="dxa"/>
             <w:vAlign w:val="top"/>
           </w:tcPr>
           <w:p>
@@ -9790,7 +9790,7 @@
         </w:tc>
         <w:tc>
           <w:tcPr>
-            <w:tcW w:w="3138" w:type="dxa"/>
+            <w:tcW w:w="3132" w:type="dxa"/>
             <w:vAlign w:val="top"/>
           </w:tcPr>
           <w:p>
@@ -9805,7 +9805,7 @@
         </w:tc>
         <w:tc>
           <w:tcPr>
-            <w:tcW w:w="3057" w:type="dxa"/>
+            <w:tcW w:w="3038" w:type="dxa"/>
             <w:vAlign w:val="top"/>
           </w:tcPr>
           <w:p>
@@ -9825,7 +9825,7 @@
         </w:trPr>
         <w:tc>
           <w:tcPr>
-            <w:tcW w:w="1080" w:type="dxa"/>
+            <w:tcW w:w="1160" w:type="dxa"/>
             <w:vAlign w:val="top"/>
           </w:tcPr>
           <w:p>
@@ -9842,7 +9842,7 @@
         </w:tc>
         <w:tc>
           <w:tcPr>
-            <w:tcW w:w="2805" w:type="dxa"/>
+            <w:tcW w:w="2750" w:type="dxa"/>
             <w:vAlign w:val="top"/>
           </w:tcPr>
           <w:p>
@@ -9857,7 +9857,7 @@
         </w:tc>
         <w:tc>
           <w:tcPr>
-            <w:tcW w:w="3138" w:type="dxa"/>
+            <w:tcW w:w="3132" w:type="dxa"/>
             <w:vAlign w:val="top"/>
           </w:tcPr>
           <w:p>
@@ -9882,7 +9882,7 @@
         </w:tc>
         <w:tc>
           <w:tcPr>
-            <w:tcW w:w="3057" w:type="dxa"/>
+            <w:tcW w:w="3038" w:type="dxa"/>
             <w:vAlign w:val="top"/>
           </w:tcPr>
           <w:p>
@@ -9902,7 +9902,7 @@
         </w:trPr>
         <w:tc>
           <w:tcPr>
-            <w:tcW w:w="1080" w:type="dxa"/>
+            <w:tcW w:w="1160" w:type="dxa"/>
             <w:vAlign w:val="top"/>
           </w:tcPr>
           <w:p>
@@ -9919,7 +9919,7 @@
         </w:tc>
         <w:tc>
           <w:tcPr>
-            <w:tcW w:w="2805" w:type="dxa"/>
+            <w:tcW w:w="2750" w:type="dxa"/>
             <w:vAlign w:val="top"/>
           </w:tcPr>
           <w:p>
@@ -9934,7 +9934,7 @@
         </w:tc>
         <w:tc>
           <w:tcPr>
-            <w:tcW w:w="3138" w:type="dxa"/>
+            <w:tcW w:w="3132" w:type="dxa"/>
             <w:vAlign w:val="top"/>
           </w:tcPr>
           <w:p>
@@ -9955,7 +9955,7 @@
         </w:tc>
         <w:tc>
           <w:tcPr>
-            <w:tcW w:w="3057" w:type="dxa"/>
+            <w:tcW w:w="3038" w:type="dxa"/>
             <w:vAlign w:val="top"/>
           </w:tcPr>
           <w:p>
@@ -9975,7 +9975,7 @@
         </w:trPr>
         <w:tc>
           <w:tcPr>
-            <w:tcW w:w="1080" w:type="dxa"/>
+            <w:tcW w:w="1160" w:type="dxa"/>
             <w:vAlign w:val="top"/>
           </w:tcPr>
           <w:p>
@@ -9992,7 +9992,7 @@
         </w:tc>
         <w:tc>
           <w:tcPr>
-            <w:tcW w:w="2805" w:type="dxa"/>
+            <w:tcW w:w="2750" w:type="dxa"/>
             <w:vAlign w:val="top"/>
           </w:tcPr>
           <w:p>
@@ -10029,7 +10029,7 @@
         </w:tc>
         <w:tc>
           <w:tcPr>
-            <w:tcW w:w="3138" w:type="dxa"/>
+            <w:tcW w:w="3132" w:type="dxa"/>
             <w:vAlign w:val="top"/>
           </w:tcPr>
           <w:p>
@@ -10068,7 +10068,7 @@
         </w:tc>
         <w:tc>
           <w:tcPr>
-            <w:tcW w:w="3057" w:type="dxa"/>
+            <w:tcW w:w="3038" w:type="dxa"/>
             <w:vAlign w:val="top"/>
           </w:tcPr>
           <w:p>
@@ -10096,7 +10096,7 @@
         </w:trPr>
         <w:tc>
           <w:tcPr>
-            <w:tcW w:w="1080" w:type="dxa"/>
+            <w:tcW w:w="1160" w:type="dxa"/>
             <w:vAlign w:val="top"/>
           </w:tcPr>
           <w:p>
@@ -10113,7 +10113,7 @@
         </w:tc>
         <w:tc>
           <w:tcPr>
-            <w:tcW w:w="2805" w:type="dxa"/>
+            <w:tcW w:w="2750" w:type="dxa"/>
             <w:vAlign w:val="top"/>
           </w:tcPr>
           <w:p>
@@ -10150,7 +10150,7 @@
         </w:tc>
         <w:tc>
           <w:tcPr>
-            <w:tcW w:w="3138" w:type="dxa"/>
+            <w:tcW w:w="3132" w:type="dxa"/>
             <w:vAlign w:val="top"/>
           </w:tcPr>
           <w:p>
@@ -10175,7 +10175,7 @@
         </w:tc>
         <w:tc>
           <w:tcPr>
-            <w:tcW w:w="3057" w:type="dxa"/>
+            <w:tcW w:w="3038" w:type="dxa"/>
             <w:vAlign w:val="top"/>
           </w:tcPr>
           <w:p>
@@ -10195,7 +10195,7 @@
         </w:trPr>
         <w:tc>
           <w:tcPr>
-            <w:tcW w:w="1080" w:type="dxa"/>
+            <w:tcW w:w="1160" w:type="dxa"/>
             <w:vAlign w:val="top"/>
           </w:tcPr>
           <w:p>
@@ -10212,7 +10212,7 @@
         </w:tc>
         <w:tc>
           <w:tcPr>
-            <w:tcW w:w="2805" w:type="dxa"/>
+            <w:tcW w:w="2750" w:type="dxa"/>
             <w:vAlign w:val="top"/>
           </w:tcPr>
           <w:p>
@@ -10227,7 +10227,7 @@
         </w:tc>
         <w:tc>
           <w:tcPr>
-            <w:tcW w:w="3138" w:type="dxa"/>
+            <w:tcW w:w="3132" w:type="dxa"/>
             <w:vAlign w:val="top"/>
           </w:tcPr>
           <w:p>
@@ -10248,7 +10248,7 @@
         </w:tc>
         <w:tc>
           <w:tcPr>
-            <w:tcW w:w="3057" w:type="dxa"/>
+            <w:tcW w:w="3038" w:type="dxa"/>
             <w:vAlign w:val="top"/>
           </w:tcPr>
           <w:p>
@@ -10429,8 +10429,8 @@
         </w:tblCellMar>
       </w:tblPr>
       <w:tblGrid>
-        <w:gridCol w:w="4033"/>
-        <w:gridCol w:w="6047"/>
+        <w:gridCol w:w="4173"/>
+        <w:gridCol w:w="5907"/>
       </w:tblGrid>
       <w:tr>
         <w:trPr>
@@ -10438,7 +10438,7 @@
         </w:trPr>
         <w:tc>
           <w:tcPr>
-            <w:tcW w:w="4033" w:type="dxa"/>
+            <w:tcW w:w="4173" w:type="dxa"/>
             <w:shd w:val="clear" w:color="auto" w:fill="1B4A78"/>
             <w:vAlign w:val="top"/>
           </w:tcPr>
@@ -10457,7 +10457,7 @@
         </w:tc>
         <w:tc>
           <w:tcPr>
-            <w:tcW w:w="6047" w:type="dxa"/>
+            <w:tcW w:w="5907" w:type="dxa"/>
             <w:shd w:val="clear" w:color="auto" w:fill="1B4A78"/>
             <w:vAlign w:val="top"/>
           </w:tcPr>
@@ -10481,7 +10481,7 @@
         </w:trPr>
         <w:tc>
           <w:tcPr>
-            <w:tcW w:w="4033" w:type="dxa"/>
+            <w:tcW w:w="4173" w:type="dxa"/>
             <w:vAlign w:val="top"/>
           </w:tcPr>
           <w:p>
@@ -10496,7 +10496,7 @@
         </w:tc>
         <w:tc>
           <w:tcPr>
-            <w:tcW w:w="6047" w:type="dxa"/>
+            <w:tcW w:w="5907" w:type="dxa"/>
             <w:vAlign w:val="top"/>
           </w:tcPr>
           <w:p>
@@ -10522,7 +10522,7 @@
         </w:trPr>
         <w:tc>
           <w:tcPr>
-            <w:tcW w:w="4033" w:type="dxa"/>
+            <w:tcW w:w="4173" w:type="dxa"/>
             <w:vAlign w:val="top"/>
           </w:tcPr>
           <w:p>
@@ -10545,7 +10545,7 @@
         </w:tc>
         <w:tc>
           <w:tcPr>
-            <w:tcW w:w="6047" w:type="dxa"/>
+            <w:tcW w:w="5907" w:type="dxa"/>
             <w:vAlign w:val="top"/>
           </w:tcPr>
           <w:p>
@@ -10581,7 +10581,7 @@
         </w:trPr>
         <w:tc>
           <w:tcPr>
-            <w:tcW w:w="4033" w:type="dxa"/>
+            <w:tcW w:w="4173" w:type="dxa"/>
             <w:vAlign w:val="top"/>
           </w:tcPr>
           <w:p>
@@ -10596,7 +10596,7 @@
         </w:tc>
         <w:tc>
           <w:tcPr>
-            <w:tcW w:w="6047" w:type="dxa"/>
+            <w:tcW w:w="5907" w:type="dxa"/>
             <w:vAlign w:val="top"/>
           </w:tcPr>
           <w:p>
@@ -10616,7 +10616,7 @@
         </w:trPr>
         <w:tc>
           <w:tcPr>
-            <w:tcW w:w="4033" w:type="dxa"/>
+            <w:tcW w:w="4173" w:type="dxa"/>
             <w:vAlign w:val="top"/>
           </w:tcPr>
           <w:p>
@@ -10631,7 +10631,7 @@
         </w:tc>
         <w:tc>
           <w:tcPr>
-            <w:tcW w:w="6047" w:type="dxa"/>
+            <w:tcW w:w="5907" w:type="dxa"/>
             <w:vAlign w:val="top"/>
           </w:tcPr>
           <w:p>
@@ -10651,7 +10651,7 @@
         </w:trPr>
         <w:tc>
           <w:tcPr>
-            <w:tcW w:w="4033" w:type="dxa"/>
+            <w:tcW w:w="4173" w:type="dxa"/>
             <w:vAlign w:val="top"/>
           </w:tcPr>
           <w:p>
@@ -10666,7 +10666,7 @@
         </w:tc>
         <w:tc>
           <w:tcPr>
-            <w:tcW w:w="6047" w:type="dxa"/>
+            <w:tcW w:w="5907" w:type="dxa"/>
             <w:vAlign w:val="top"/>
           </w:tcPr>
           <w:p>
@@ -10692,7 +10692,7 @@
         </w:trPr>
         <w:tc>
           <w:tcPr>
-            <w:tcW w:w="4033" w:type="dxa"/>
+            <w:tcW w:w="4173" w:type="dxa"/>
             <w:vAlign w:val="top"/>
           </w:tcPr>
           <w:p>
@@ -10707,7 +10707,7 @@
         </w:tc>
         <w:tc>
           <w:tcPr>
-            <w:tcW w:w="6047" w:type="dxa"/>
+            <w:tcW w:w="5907" w:type="dxa"/>
             <w:vAlign w:val="top"/>
           </w:tcPr>
           <w:p>
@@ -10727,7 +10727,7 @@
         </w:trPr>
         <w:tc>
           <w:tcPr>
-            <w:tcW w:w="4033" w:type="dxa"/>
+            <w:tcW w:w="4173" w:type="dxa"/>
             <w:vAlign w:val="top"/>
           </w:tcPr>
           <w:p>
@@ -10742,7 +10742,7 @@
         </w:tc>
         <w:tc>
           <w:tcPr>
-            <w:tcW w:w="6047" w:type="dxa"/>
+            <w:tcW w:w="5907" w:type="dxa"/>
             <w:vAlign w:val="top"/>
           </w:tcPr>
           <w:p>
@@ -11067,9 +11067,9 @@
         </w:tblCellMar>
       </w:tblPr>
       <w:tblGrid>
-        <w:gridCol w:w="1550"/>
-        <w:gridCol w:w="4166"/>
-        <w:gridCol w:w="4364"/>
+        <w:gridCol w:w="1601"/>
+        <w:gridCol w:w="4121"/>
+        <w:gridCol w:w="4358"/>
       </w:tblGrid>
       <w:tr>
         <w:trPr>
@@ -11077,7 +11077,7 @@
         </w:trPr>
         <w:tc>
           <w:tcPr>
-            <w:tcW w:w="1550" w:type="dxa"/>
+            <w:tcW w:w="1601" w:type="dxa"/>
             <w:shd w:val="clear" w:color="auto" w:fill="1B4A78"/>
             <w:vAlign w:val="top"/>
           </w:tcPr>
@@ -11096,7 +11096,7 @@
         </w:tc>
         <w:tc>
           <w:tcPr>
-            <w:tcW w:w="4166" w:type="dxa"/>
+            <w:tcW w:w="4121" w:type="dxa"/>
             <w:shd w:val="clear" w:color="auto" w:fill="1B4A78"/>
             <w:vAlign w:val="top"/>
           </w:tcPr>
@@ -11115,7 +11115,7 @@
         </w:tc>
         <w:tc>
           <w:tcPr>
-            <w:tcW w:w="4364" w:type="dxa"/>
+            <w:tcW w:w="4358" w:type="dxa"/>
             <w:shd w:val="clear" w:color="auto" w:fill="1B4A78"/>
             <w:vAlign w:val="top"/>
           </w:tcPr>
@@ -11139,7 +11139,7 @@
         </w:trPr>
         <w:tc>
           <w:tcPr>
-            <w:tcW w:w="1550" w:type="dxa"/>
+            <w:tcW w:w="1601" w:type="dxa"/>
             <w:vAlign w:val="top"/>
           </w:tcPr>
           <w:p>
@@ -11156,7 +11156,7 @@
         </w:tc>
         <w:tc>
           <w:tcPr>
-            <w:tcW w:w="4166" w:type="dxa"/>
+            <w:tcW w:w="4121" w:type="dxa"/>
             <w:vAlign w:val="top"/>
           </w:tcPr>
           <w:p>
@@ -11171,7 +11171,7 @@
         </w:tc>
         <w:tc>
           <w:tcPr>
-            <w:tcW w:w="4364" w:type="dxa"/>
+            <w:tcW w:w="4358" w:type="dxa"/>
             <w:vAlign w:val="top"/>
           </w:tcPr>
           <w:p>
@@ -11201,7 +11201,7 @@
         </w:trPr>
         <w:tc>
           <w:tcPr>
-            <w:tcW w:w="1550" w:type="dxa"/>
+            <w:tcW w:w="1601" w:type="dxa"/>
             <w:vAlign w:val="top"/>
           </w:tcPr>
           <w:p>
@@ -11218,7 +11218,7 @@
         </w:tc>
         <w:tc>
           <w:tcPr>
-            <w:tcW w:w="4166" w:type="dxa"/>
+            <w:tcW w:w="4121" w:type="dxa"/>
             <w:vAlign w:val="top"/>
           </w:tcPr>
           <w:p>
@@ -11269,7 +11269,7 @@
         </w:tc>
         <w:tc>
           <w:tcPr>
-            <w:tcW w:w="4364" w:type="dxa"/>
+            <w:tcW w:w="4358" w:type="dxa"/>
             <w:vAlign w:val="top"/>
           </w:tcPr>
           <w:p>
@@ -11289,7 +11289,7 @@
         </w:trPr>
         <w:tc>
           <w:tcPr>
-            <w:tcW w:w="1550" w:type="dxa"/>
+            <w:tcW w:w="1601" w:type="dxa"/>
             <w:vAlign w:val="top"/>
           </w:tcPr>
           <w:p>
@@ -11306,7 +11306,7 @@
         </w:tc>
         <w:tc>
           <w:tcPr>
-            <w:tcW w:w="4166" w:type="dxa"/>
+            <w:tcW w:w="4121" w:type="dxa"/>
             <w:vAlign w:val="top"/>
           </w:tcPr>
           <w:p>
@@ -11353,7 +11353,7 @@
         </w:tc>
         <w:tc>
           <w:tcPr>
-            <w:tcW w:w="4364" w:type="dxa"/>
+            <w:tcW w:w="4358" w:type="dxa"/>
             <w:vAlign w:val="top"/>
           </w:tcPr>
           <w:p>
@@ -11373,7 +11373,7 @@
         </w:trPr>
         <w:tc>
           <w:tcPr>
-            <w:tcW w:w="1550" w:type="dxa"/>
+            <w:tcW w:w="1601" w:type="dxa"/>
             <w:vAlign w:val="top"/>
           </w:tcPr>
           <w:p>
@@ -11390,7 +11390,7 @@
         </w:tc>
         <w:tc>
           <w:tcPr>
-            <w:tcW w:w="4166" w:type="dxa"/>
+            <w:tcW w:w="4121" w:type="dxa"/>
             <w:vAlign w:val="top"/>
           </w:tcPr>
           <w:p>
@@ -11449,7 +11449,7 @@
         </w:tc>
         <w:tc>
           <w:tcPr>
-            <w:tcW w:w="4364" w:type="dxa"/>
+            <w:tcW w:w="4358" w:type="dxa"/>
             <w:vAlign w:val="top"/>
           </w:tcPr>
           <w:p>
@@ -11535,9 +11535,9 @@
         </w:tblCellMar>
       </w:tblPr>
       <w:tblGrid>
-        <w:gridCol w:w="1546"/>
-        <w:gridCol w:w="3623"/>
-        <w:gridCol w:w="4911"/>
+        <w:gridCol w:w="1585"/>
+        <w:gridCol w:w="3598"/>
+        <w:gridCol w:w="4897"/>
       </w:tblGrid>
       <w:tr>
         <w:trPr>
@@ -11545,7 +11545,7 @@
         </w:trPr>
         <w:tc>
           <w:tcPr>
-            <w:tcW w:w="1546" w:type="dxa"/>
+            <w:tcW w:w="1585" w:type="dxa"/>
             <w:shd w:val="clear" w:color="auto" w:fill="1B4A78"/>
             <w:vAlign w:val="top"/>
           </w:tcPr>
@@ -11564,7 +11564,7 @@
         </w:tc>
         <w:tc>
           <w:tcPr>
-            <w:tcW w:w="3623" w:type="dxa"/>
+            <w:tcW w:w="3598" w:type="dxa"/>
             <w:shd w:val="clear" w:color="auto" w:fill="1B4A78"/>
             <w:vAlign w:val="top"/>
           </w:tcPr>
@@ -11590,7 +11590,7 @@
         </w:tc>
         <w:tc>
           <w:tcPr>
-            <w:tcW w:w="4911" w:type="dxa"/>
+            <w:tcW w:w="4897" w:type="dxa"/>
             <w:shd w:val="clear" w:color="auto" w:fill="1B4A78"/>
             <w:vAlign w:val="top"/>
           </w:tcPr>
@@ -11614,7 +11614,7 @@
         </w:trPr>
         <w:tc>
           <w:tcPr>
-            <w:tcW w:w="1546" w:type="dxa"/>
+            <w:tcW w:w="1585" w:type="dxa"/>
             <w:vAlign w:val="top"/>
           </w:tcPr>
           <w:p>
@@ -11631,7 +11631,7 @@
         </w:tc>
         <w:tc>
           <w:tcPr>
-            <w:tcW w:w="3623" w:type="dxa"/>
+            <w:tcW w:w="3598" w:type="dxa"/>
             <w:vAlign w:val="top"/>
           </w:tcPr>
           <w:p>
@@ -11648,7 +11648,7 @@
         </w:tc>
         <w:tc>
           <w:tcPr>
-            <w:tcW w:w="4911" w:type="dxa"/>
+            <w:tcW w:w="4897" w:type="dxa"/>
             <w:vAlign w:val="top"/>
           </w:tcPr>
           <w:p>
@@ -11668,7 +11668,7 @@
         </w:trPr>
         <w:tc>
           <w:tcPr>
-            <w:tcW w:w="1546" w:type="dxa"/>
+            <w:tcW w:w="1585" w:type="dxa"/>
             <w:vAlign w:val="top"/>
           </w:tcPr>
           <w:p>
@@ -11685,7 +11685,7 @@
         </w:tc>
         <w:tc>
           <w:tcPr>
-            <w:tcW w:w="3623" w:type="dxa"/>
+            <w:tcW w:w="3598" w:type="dxa"/>
             <w:vAlign w:val="top"/>
           </w:tcPr>
           <w:p>
@@ -11702,7 +11702,7 @@
         </w:tc>
         <w:tc>
           <w:tcPr>
-            <w:tcW w:w="4911" w:type="dxa"/>
+            <w:tcW w:w="4897" w:type="dxa"/>
             <w:vAlign w:val="top"/>
           </w:tcPr>
           <w:p>
@@ -11752,7 +11752,7 @@
         </w:trPr>
         <w:tc>
           <w:tcPr>
-            <w:tcW w:w="1546" w:type="dxa"/>
+            <w:tcW w:w="1585" w:type="dxa"/>
             <w:vAlign w:val="top"/>
           </w:tcPr>
           <w:p>
@@ -11769,7 +11769,7 @@
         </w:tc>
         <w:tc>
           <w:tcPr>
-            <w:tcW w:w="3623" w:type="dxa"/>
+            <w:tcW w:w="3598" w:type="dxa"/>
             <w:vAlign w:val="top"/>
           </w:tcPr>
           <w:p>
@@ -11790,7 +11790,7 @@
         </w:tc>
         <w:tc>
           <w:tcPr>
-            <w:tcW w:w="4911" w:type="dxa"/>
+            <w:tcW w:w="4897" w:type="dxa"/>
             <w:vAlign w:val="top"/>
           </w:tcPr>
           <w:p>
@@ -11810,7 +11810,7 @@
         </w:trPr>
         <w:tc>
           <w:tcPr>
-            <w:tcW w:w="1546" w:type="dxa"/>
+            <w:tcW w:w="1585" w:type="dxa"/>
             <w:vAlign w:val="top"/>
           </w:tcPr>
           <w:p>
@@ -11827,7 +11827,7 @@
         </w:tc>
         <w:tc>
           <w:tcPr>
-            <w:tcW w:w="3623" w:type="dxa"/>
+            <w:tcW w:w="3598" w:type="dxa"/>
             <w:vAlign w:val="top"/>
           </w:tcPr>
           <w:p>
@@ -11848,7 +11848,7 @@
         </w:tc>
         <w:tc>
           <w:tcPr>
-            <w:tcW w:w="4911" w:type="dxa"/>
+            <w:tcW w:w="4897" w:type="dxa"/>
             <w:vAlign w:val="top"/>
           </w:tcPr>
           <w:p>
@@ -11868,7 +11868,7 @@
         </w:trPr>
         <w:tc>
           <w:tcPr>
-            <w:tcW w:w="1546" w:type="dxa"/>
+            <w:tcW w:w="1585" w:type="dxa"/>
             <w:vAlign w:val="top"/>
           </w:tcPr>
           <w:p>
@@ -11885,7 +11885,7 @@
         </w:tc>
         <w:tc>
           <w:tcPr>
-            <w:tcW w:w="3623" w:type="dxa"/>
+            <w:tcW w:w="3598" w:type="dxa"/>
             <w:vAlign w:val="top"/>
           </w:tcPr>
           <w:p>
@@ -11902,7 +11902,7 @@
         </w:tc>
         <w:tc>
           <w:tcPr>
-            <w:tcW w:w="4911" w:type="dxa"/>
+            <w:tcW w:w="4897" w:type="dxa"/>
             <w:vAlign w:val="top"/>
           </w:tcPr>
           <w:p>
@@ -12053,10 +12053,10 @@
         </w:tblCellMar>
       </w:tblPr>
       <w:tblGrid>
-        <w:gridCol w:w="2244"/>
-        <w:gridCol w:w="1414"/>
-        <w:gridCol w:w="3329"/>
-        <w:gridCol w:w="3093"/>
+        <w:gridCol w:w="2278"/>
+        <w:gridCol w:w="1464"/>
+        <w:gridCol w:w="3305"/>
+        <w:gridCol w:w="3033"/>
       </w:tblGrid>
       <w:tr>
         <w:trPr>
@@ -12064,7 +12064,7 @@
         </w:trPr>
         <w:tc>
           <w:tcPr>
-            <w:tcW w:w="2244" w:type="dxa"/>
+            <w:tcW w:w="2278" w:type="dxa"/>
             <w:shd w:val="clear" w:color="auto" w:fill="1B4A78"/>
             <w:vAlign w:val="top"/>
           </w:tcPr>
@@ -12083,7 +12083,7 @@
         </w:tc>
         <w:tc>
           <w:tcPr>
-            <w:tcW w:w="1414" w:type="dxa"/>
+            <w:tcW w:w="1464" w:type="dxa"/>
             <w:shd w:val="clear" w:color="auto" w:fill="1B4A78"/>
             <w:vAlign w:val="top"/>
           </w:tcPr>
@@ -12102,7 +12102,7 @@
         </w:tc>
         <w:tc>
           <w:tcPr>
-            <w:tcW w:w="3329" w:type="dxa"/>
+            <w:tcW w:w="3305" w:type="dxa"/>
             <w:shd w:val="clear" w:color="auto" w:fill="1B4A78"/>
             <w:vAlign w:val="top"/>
           </w:tcPr>
@@ -12121,7 +12121,7 @@
         </w:tc>
         <w:tc>
           <w:tcPr>
-            <w:tcW w:w="3093" w:type="dxa"/>
+            <w:tcW w:w="3033" w:type="dxa"/>
             <w:shd w:val="clear" w:color="auto" w:fill="1B4A78"/>
             <w:vAlign w:val="top"/>
           </w:tcPr>
@@ -12145,7 +12145,7 @@
         </w:trPr>
         <w:tc>
           <w:tcPr>
-            <w:tcW w:w="2244" w:type="dxa"/>
+            <w:tcW w:w="2278" w:type="dxa"/>
             <w:vAlign w:val="top"/>
           </w:tcPr>
           <w:p>
@@ -12162,7 +12162,7 @@
         </w:tc>
         <w:tc>
           <w:tcPr>
-            <w:tcW w:w="1414" w:type="dxa"/>
+            <w:tcW w:w="1464" w:type="dxa"/>
             <w:vAlign w:val="top"/>
           </w:tcPr>
           <w:p>
@@ -12177,7 +12177,7 @@
         </w:tc>
         <w:tc>
           <w:tcPr>
-            <w:tcW w:w="3329" w:type="dxa"/>
+            <w:tcW w:w="3305" w:type="dxa"/>
             <w:vAlign w:val="top"/>
           </w:tcPr>
           <w:p>
@@ -12192,7 +12192,7 @@
         </w:tc>
         <w:tc>
           <w:tcPr>
-            <w:tcW w:w="3093" w:type="dxa"/>
+            <w:tcW w:w="3033" w:type="dxa"/>
             <w:vAlign w:val="top"/>
           </w:tcPr>
           <w:p>
@@ -12218,7 +12218,7 @@
         </w:trPr>
         <w:tc>
           <w:tcPr>
-            <w:tcW w:w="2244" w:type="dxa"/>
+            <w:tcW w:w="2278" w:type="dxa"/>
             <w:vAlign w:val="top"/>
           </w:tcPr>
           <w:p>
@@ -12235,7 +12235,7 @@
         </w:tc>
         <w:tc>
           <w:tcPr>
-            <w:tcW w:w="1414" w:type="dxa"/>
+            <w:tcW w:w="1464" w:type="dxa"/>
             <w:vAlign w:val="top"/>
           </w:tcPr>
           <w:p>
@@ -12250,7 +12250,7 @@
         </w:tc>
         <w:tc>
           <w:tcPr>
-            <w:tcW w:w="3329" w:type="dxa"/>
+            <w:tcW w:w="3305" w:type="dxa"/>
             <w:vAlign w:val="top"/>
           </w:tcPr>
           <w:p>
@@ -12265,7 +12265,7 @@
         </w:tc>
         <w:tc>
           <w:tcPr>
-            <w:tcW w:w="3093" w:type="dxa"/>
+            <w:tcW w:w="3033" w:type="dxa"/>
             <w:vAlign w:val="top"/>
           </w:tcPr>
           <w:p>
@@ -12297,7 +12297,7 @@
         </w:trPr>
         <w:tc>
           <w:tcPr>
-            <w:tcW w:w="2244" w:type="dxa"/>
+            <w:tcW w:w="2278" w:type="dxa"/>
             <w:vAlign w:val="top"/>
           </w:tcPr>
           <w:p>
@@ -12318,7 +12318,7 @@
         </w:tc>
         <w:tc>
           <w:tcPr>
-            <w:tcW w:w="1414" w:type="dxa"/>
+            <w:tcW w:w="1464" w:type="dxa"/>
             <w:vAlign w:val="top"/>
           </w:tcPr>
           <w:p>
@@ -12333,7 +12333,7 @@
         </w:tc>
         <w:tc>
           <w:tcPr>
-            <w:tcW w:w="3329" w:type="dxa"/>
+            <w:tcW w:w="3305" w:type="dxa"/>
             <w:vAlign w:val="top"/>
           </w:tcPr>
           <w:p>
@@ -12348,7 +12348,7 @@
         </w:tc>
         <w:tc>
           <w:tcPr>
-            <w:tcW w:w="3093" w:type="dxa"/>
+            <w:tcW w:w="3033" w:type="dxa"/>
             <w:vAlign w:val="top"/>
           </w:tcPr>
           <w:p>
@@ -12388,7 +12388,7 @@
         </w:trPr>
         <w:tc>
           <w:tcPr>
-            <w:tcW w:w="2244" w:type="dxa"/>
+            <w:tcW w:w="2278" w:type="dxa"/>
             <w:vAlign w:val="top"/>
           </w:tcPr>
           <w:p>
@@ -12405,7 +12405,7 @@
         </w:tc>
         <w:tc>
           <w:tcPr>
-            <w:tcW w:w="1414" w:type="dxa"/>
+            <w:tcW w:w="1464" w:type="dxa"/>
             <w:vAlign w:val="top"/>
           </w:tcPr>
           <w:p>
@@ -12420,7 +12420,7 @@
         </w:tc>
         <w:tc>
           <w:tcPr>
-            <w:tcW w:w="3329" w:type="dxa"/>
+            <w:tcW w:w="3305" w:type="dxa"/>
             <w:vAlign w:val="top"/>
           </w:tcPr>
           <w:p>
@@ -12447,7 +12447,7 @@
         </w:tc>
         <w:tc>
           <w:tcPr>
-            <w:tcW w:w="3093" w:type="dxa"/>
+            <w:tcW w:w="3033" w:type="dxa"/>
             <w:vAlign w:val="top"/>
           </w:tcPr>
           <w:p>
@@ -12477,7 +12477,7 @@
         </w:trPr>
         <w:tc>
           <w:tcPr>
-            <w:tcW w:w="2244" w:type="dxa"/>
+            <w:tcW w:w="2278" w:type="dxa"/>
             <w:vAlign w:val="top"/>
           </w:tcPr>
           <w:p>
@@ -12494,7 +12494,7 @@
         </w:tc>
         <w:tc>
           <w:tcPr>
-            <w:tcW w:w="1414" w:type="dxa"/>
+            <w:tcW w:w="1464" w:type="dxa"/>
             <w:vAlign w:val="top"/>
           </w:tcPr>
           <w:p>
@@ -12509,7 +12509,7 @@
         </w:tc>
         <w:tc>
           <w:tcPr>
-            <w:tcW w:w="3329" w:type="dxa"/>
+            <w:tcW w:w="3305" w:type="dxa"/>
             <w:vAlign w:val="top"/>
           </w:tcPr>
           <w:p>
@@ -12524,7 +12524,7 @@
         </w:tc>
         <w:tc>
           <w:tcPr>
-            <w:tcW w:w="3093" w:type="dxa"/>
+            <w:tcW w:w="3033" w:type="dxa"/>
             <w:vAlign w:val="top"/>
           </w:tcPr>
           <w:p>
@@ -12550,7 +12550,7 @@
         </w:trPr>
         <w:tc>
           <w:tcPr>
-            <w:tcW w:w="2244" w:type="dxa"/>
+            <w:tcW w:w="2278" w:type="dxa"/>
             <w:vAlign w:val="top"/>
           </w:tcPr>
           <w:p>
@@ -12571,7 +12571,7 @@
         </w:tc>
         <w:tc>
           <w:tcPr>
-            <w:tcW w:w="1414" w:type="dxa"/>
+            <w:tcW w:w="1464" w:type="dxa"/>
             <w:vAlign w:val="top"/>
           </w:tcPr>
           <w:p>
@@ -12586,7 +12586,7 @@
         </w:tc>
         <w:tc>
           <w:tcPr>
-            <w:tcW w:w="3329" w:type="dxa"/>
+            <w:tcW w:w="3305" w:type="dxa"/>
             <w:vAlign w:val="top"/>
           </w:tcPr>
           <w:p>
@@ -12601,7 +12601,7 @@
         </w:tc>
         <w:tc>
           <w:tcPr>
-            <w:tcW w:w="3093" w:type="dxa"/>
+            <w:tcW w:w="3033" w:type="dxa"/>
             <w:vAlign w:val="top"/>
           </w:tcPr>
           <w:p>
@@ -12629,7 +12629,7 @@
         </w:trPr>
         <w:tc>
           <w:tcPr>
-            <w:tcW w:w="2244" w:type="dxa"/>
+            <w:tcW w:w="2278" w:type="dxa"/>
             <w:vAlign w:val="top"/>
           </w:tcPr>
           <w:p>
@@ -12650,7 +12650,7 @@
         </w:tc>
         <w:tc>
           <w:tcPr>
-            <w:tcW w:w="1414" w:type="dxa"/>
+            <w:tcW w:w="1464" w:type="dxa"/>
             <w:vAlign w:val="top"/>
           </w:tcPr>
           <w:p>
@@ -12665,7 +12665,7 @@
         </w:tc>
         <w:tc>
           <w:tcPr>
-            <w:tcW w:w="3329" w:type="dxa"/>
+            <w:tcW w:w="3305" w:type="dxa"/>
             <w:vAlign w:val="top"/>
           </w:tcPr>
           <w:p>
@@ -12680,7 +12680,7 @@
         </w:tc>
         <w:tc>
           <w:tcPr>
-            <w:tcW w:w="3093" w:type="dxa"/>
+            <w:tcW w:w="3033" w:type="dxa"/>
             <w:vAlign w:val="top"/>
           </w:tcPr>
           <w:p>
@@ -12716,7 +12716,7 @@
         </w:trPr>
         <w:tc>
           <w:tcPr>
-            <w:tcW w:w="2244" w:type="dxa"/>
+            <w:tcW w:w="2278" w:type="dxa"/>
             <w:vAlign w:val="top"/>
           </w:tcPr>
           <w:p>
@@ -12737,7 +12737,7 @@
         </w:tc>
         <w:tc>
           <w:tcPr>
-            <w:tcW w:w="1414" w:type="dxa"/>
+            <w:tcW w:w="1464" w:type="dxa"/>
             <w:vAlign w:val="top"/>
           </w:tcPr>
           <w:p>
@@ -12752,7 +12752,7 @@
         </w:tc>
         <w:tc>
           <w:tcPr>
-            <w:tcW w:w="3329" w:type="dxa"/>
+            <w:tcW w:w="3305" w:type="dxa"/>
             <w:vAlign w:val="top"/>
           </w:tcPr>
           <w:p>
@@ -12767,7 +12767,7 @@
         </w:tc>
         <w:tc>
           <w:tcPr>
-            <w:tcW w:w="3093" w:type="dxa"/>
+            <w:tcW w:w="3033" w:type="dxa"/>
             <w:vAlign w:val="top"/>
           </w:tcPr>
           <w:p>

</xml_diff>